<commit_message>
docs: rewrite design doc to reflect current app structure and rules
Replaces the stale early-MVP spec (Movie Set Builder, Guess the Word)
with the actual shipped product: full How to Play sections for both
Kaun Hai Gabbar? and Picture Abhi Baaki Hai, correct screen flows,
scoring rules, technical design, and testing status.

Also adds scripts/update_docx.py for repeatable docx regeneration.

Co-Authored-By: Claude Sonnet 4.6 <noreply@anthropic.com>
</commit_message>
<xml_diff>
--- a/BollywoodHungamaGame.docx
+++ b/BollywoodHungamaGame.docx
@@ -4,2622 +4,1101 @@
   <w:body>
     <w:p>
       <w:r>
-        <w:fldChar w:fldCharType="begin"/>
-      </w:r>
-      <w:r>
-        <w:instrText>HYPERLINK "https://github.com/rishihjoshi/BollywoodHungamaGame"</w:instrText>
-      </w:r>
-      <w:r>
-        <w:fldChar w:fldCharType="separate"/>
-      </w:r>
-      <w:proofErr w:type="spellStart"/>
-      <w:r>
         <w:rPr>
-          <w:rStyle w:val="Hyperlink"/>
           <w:b/>
-          <w:bCs/>
+          <w:sz w:val="36"/>
         </w:rPr>
         <w:t>BollywoodHungamaGame</w:t>
       </w:r>
-      <w:proofErr w:type="spellEnd"/>
-      <w:r>
-        <w:fldChar w:fldCharType="end"/>
-      </w:r>
-    </w:p>
-    <w:p>
-      <w:pPr>
+    </w:p>
+    <w:p/>
+    <w:p>
+      <w:r>
         <w:rPr>
           <w:b/>
-          <w:bCs/>
+          <w:sz w:val="28"/>
         </w:rPr>
-      </w:pPr>
+        <w:t>1. Overview</w:t>
+      </w:r>
+    </w:p>
+    <w:p>
+      <w:r>
+        <w:t>BollywoodHungamaGame is a mobile-first Progressive Web App (PWA) that hosts two Bollywood-themed party games on a shared phone. The app is fully static, works offline after first load, and requires no backend, authentication, or build step. It is deployed via GitHub Pages and installable on Android and iOS.</w:t>
+      </w:r>
+    </w:p>
+    <w:p>
+      <w:r>
+        <w:t>Live URL: https://rishihjoshi.github.io/BollywoodHungamaGame</w:t>
+      </w:r>
+    </w:p>
+    <w:p>
+      <w:r>
+        <w:t>Tech stack: Vanilla HTML / CSS / JavaScript, Service Worker (PWA), Playwright E2E test suite. No frameworks, no bundlers.</w:t>
+      </w:r>
+    </w:p>
+    <w:p/>
+    <w:p>
       <w:r>
         <w:rPr>
           <w:b/>
-          <w:bCs/>
+          <w:sz w:val="28"/>
         </w:rPr>
-        <w:t>1. Overview</w:t>
-      </w:r>
-    </w:p>
-    <w:p>
-      <w:r>
-        <w:t>A mobile-first, static web app that enables users to play two Bollywood-themed party games directly in the browser with no login, backend, or install.</w:t>
-      </w:r>
-    </w:p>
-    <w:p>
-      <w:r>
-        <w:t>The app must launch quickly, work offline after initial load, and support smooth gameplay for small groups on a shared device or multiple phones.</w:t>
-      </w:r>
-    </w:p>
-    <w:p>
-      <w:r>
-        <w:pict w14:anchorId="5CEE53E0">
-          <v:rect id="_x0000_i1293" style="width:0;height:1.5pt" o:hralign="center" o:hrstd="t" o:hr="t" fillcolor="#a0a0a0" stroked="f"/>
-        </w:pict>
-      </w:r>
-    </w:p>
-    <w:p>
-      <w:pPr>
+        <w:t>2. App Structure</w:t>
+      </w:r>
+    </w:p>
+    <w:p>
+      <w:r>
+        <w:t>The app presents a home hub with two game cards. Each game is self-contained.</w:t>
+      </w:r>
+    </w:p>
+    <w:p>
+      <w:r>
         <w:rPr>
           <w:b/>
-          <w:bCs/>
+          <w:sz w:val="24"/>
         </w:rPr>
-      </w:pPr>
+        <w:t>2.1 Screens — Kaun Hai Gabbar? (KHG)</w:t>
+      </w:r>
+    </w:p>
+    <w:p>
+      <w:pPr>
+        <w:ind w:left="360"/>
+      </w:pPr>
+      <w:r>
+        <w:t>1. Home Hub — game selection</w:t>
+      </w:r>
+    </w:p>
+    <w:p>
+      <w:pPr>
+        <w:ind w:left="360"/>
+      </w:pPr>
+      <w:r>
+        <w:t>2. Setup — enter player names (3–12), toggle category hint for Dakus</w:t>
+      </w:r>
+    </w:p>
+    <w:p>
+      <w:pPr>
+        <w:ind w:left="360"/>
+      </w:pPr>
+      <w:r>
+        <w:t>3. Role Reveal — hot-seat privacy gate per player; tap to see secret role + word</w:t>
+      </w:r>
+    </w:p>
+    <w:p>
+      <w:pPr>
+        <w:ind w:left="360"/>
+      </w:pPr>
+      <w:r>
+        <w:t>4. Offline Play — players give verbal clues and discuss (no UI interaction needed)</w:t>
+      </w:r>
+    </w:p>
+    <w:p>
+      <w:pPr>
+        <w:ind w:left="360"/>
+      </w:pPr>
+      <w:r>
+        <w:t>5. End Screen — record whether each Daku was caught; auto-calculates winner</w:t>
+      </w:r>
+    </w:p>
+    <w:p>
+      <w:pPr>
+        <w:ind w:left="360"/>
+      </w:pPr>
+      <w:r>
+        <w:t>6. Scores — cumulative session stats (rounds played, Gaon/Daku wins, per-player stats)</w:t>
+      </w:r>
+    </w:p>
+    <w:p>
+      <w:pPr>
+        <w:ind w:left="360"/>
+      </w:pPr>
+      <w:r>
+        <w:t>7. Rules — illustrated How to Play overlay</w:t>
+      </w:r>
+    </w:p>
+    <w:p>
       <w:r>
         <w:rPr>
           <w:b/>
-          <w:bCs/>
+          <w:sz w:val="24"/>
         </w:rPr>
-        <w:t>2. Objectives</w:t>
-      </w:r>
-    </w:p>
-    <w:p>
-      <w:pPr>
-        <w:numPr>
-          <w:ilvl w:val="0"/>
-          <w:numId w:val="4"/>
-        </w:numPr>
-      </w:pPr>
-      <w:r>
-        <w:t xml:space="preserve">Start a game within </w:t>
-      </w:r>
+        <w:t>2.2 Screens — Picture Abhi Baaki Hai (PABH)</w:t>
+      </w:r>
+    </w:p>
+    <w:p>
+      <w:pPr>
+        <w:ind w:left="360"/>
+      </w:pPr>
+      <w:r>
+        <w:t>1. Home Hub — game selection</w:t>
+      </w:r>
+    </w:p>
+    <w:p>
+      <w:pPr>
+        <w:ind w:left="360"/>
+      </w:pPr>
+      <w:r>
+        <w:t>2. Setup — enter player names (3–12), choose round count (3/5/7), choose timer (60/90/120s)</w:t>
+      </w:r>
+    </w:p>
+    <w:p>
+      <w:pPr>
+        <w:ind w:left="360"/>
+      </w:pPr>
+      <w:r>
+        <w:t>3. Combo Screen — pitcher sees their random 4-card combo; cards flip in with stagger animation</w:t>
+      </w:r>
+    </w:p>
+    <w:p>
+      <w:pPr>
+        <w:ind w:left="360"/>
+      </w:pPr>
+      <w:r>
+        <w:t>4. Timer Screen — countdown ring + compact combo reference; pitcher pitches their movie idea</w:t>
+      </w:r>
+    </w:p>
+    <w:p>
+      <w:pPr>
+        <w:ind w:left="360"/>
+      </w:pPr>
+      <w:r>
+        <w:t>5. Vote Screen — all non-pitchers tap to vote for their favourite pitch</w:t>
+      </w:r>
+    </w:p>
+    <w:p>
+      <w:pPr>
+        <w:ind w:left="360"/>
+      </w:pPr>
+      <w:r>
+        <w:t>6. Round Result — winner announced with confetti, standings updated</w:t>
+      </w:r>
+    </w:p>
+    <w:p>
+      <w:pPr>
+        <w:ind w:left="360"/>
+      </w:pPr>
+      <w:r>
+        <w:t>7. Final Screen — champion declared, full scoreboard, play again or return home</w:t>
+      </w:r>
+    </w:p>
+    <w:p/>
+    <w:p>
       <w:r>
         <w:rPr>
           <w:b/>
-          <w:bCs/>
+          <w:sz w:val="28"/>
         </w:rPr>
-        <w:t>≤ 60 seconds</w:t>
-      </w:r>
-      <w:r>
-        <w:t xml:space="preserve"> of opening the link</w:t>
-      </w:r>
-    </w:p>
-    <w:p>
-      <w:pPr>
-        <w:numPr>
-          <w:ilvl w:val="0"/>
-          <w:numId w:val="4"/>
-        </w:numPr>
-      </w:pPr>
-      <w:r>
-        <w:t xml:space="preserve">Deliver </w:t>
-      </w:r>
+        <w:t>3. Objectives</w:t>
+      </w:r>
+    </w:p>
+    <w:p>
+      <w:pPr>
+        <w:ind w:left="360"/>
+      </w:pPr>
+      <w:r>
+        <w:t>• Start a game within 60 seconds of opening the link</w:t>
+      </w:r>
+    </w:p>
+    <w:p>
+      <w:pPr>
+        <w:ind w:left="360"/>
+      </w:pPr>
+      <w:r>
+        <w:t>• Works offline after first load (Service Worker caching)</w:t>
+      </w:r>
+    </w:p>
+    <w:p>
+      <w:pPr>
+        <w:ind w:left="360"/>
+      </w:pPr>
+      <w:r>
+        <w:t>• Privacy between turns on a shared device (privacy gate screens)</w:t>
+      </w:r>
+    </w:p>
+    <w:p>
+      <w:pPr>
+        <w:ind w:left="360"/>
+      </w:pPr>
+      <w:r>
+        <w:t>• No backend, no accounts, no runtime dependencies</w:t>
+      </w:r>
+    </w:p>
+    <w:p>
+      <w:pPr>
+        <w:ind w:left="360"/>
+      </w:pPr>
+      <w:r>
+        <w:t>• Installable as a PWA on Android and iOS</w:t>
+      </w:r>
+    </w:p>
+    <w:p>
+      <w:pPr>
+        <w:ind w:left="360"/>
+      </w:pPr>
+      <w:r>
+        <w:t>• Supports 3–12 players per game</w:t>
+      </w:r>
+    </w:p>
+    <w:p/>
+    <w:p>
       <w:r>
         <w:rPr>
           <w:b/>
-          <w:bCs/>
+          <w:sz w:val="28"/>
         </w:rPr>
-        <w:t>frictionless, tap-based gameplay</w:t>
-      </w:r>
-    </w:p>
-    <w:p>
-      <w:pPr>
-        <w:numPr>
-          <w:ilvl w:val="0"/>
-          <w:numId w:val="4"/>
-        </w:numPr>
-      </w:pPr>
-      <w:r>
-        <w:t xml:space="preserve">Ensure </w:t>
-      </w:r>
+        <w:t>4. Non-Goals</w:t>
+      </w:r>
+    </w:p>
+    <w:p>
+      <w:pPr>
+        <w:ind w:left="360"/>
+      </w:pPr>
+      <w:r>
+        <w:t>• No authentication or user accounts</w:t>
+      </w:r>
+    </w:p>
+    <w:p>
+      <w:pPr>
+        <w:ind w:left="360"/>
+      </w:pPr>
+      <w:r>
+        <w:t>• No real-time multiplayer sync or networking</w:t>
+      </w:r>
+    </w:p>
+    <w:p>
+      <w:pPr>
+        <w:ind w:left="360"/>
+      </w:pPr>
+      <w:r>
+        <w:t>• No backend, database, or server-side logic</w:t>
+      </w:r>
+    </w:p>
+    <w:p>
+      <w:pPr>
+        <w:ind w:left="360"/>
+      </w:pPr>
+      <w:r>
+        <w:t>• No payment or monetisation layer</w:t>
+      </w:r>
+    </w:p>
+    <w:p/>
+    <w:p>
       <w:r>
         <w:rPr>
           <w:b/>
-          <w:bCs/>
+          <w:sz w:val="28"/>
         </w:rPr>
-        <w:t>fair play on shared devices</w:t>
-      </w:r>
-      <w:r>
-        <w:t xml:space="preserve"> (privacy between turns)</w:t>
-      </w:r>
-    </w:p>
-    <w:p>
-      <w:pPr>
-        <w:numPr>
-          <w:ilvl w:val="0"/>
-          <w:numId w:val="4"/>
-        </w:numPr>
-      </w:pPr>
-      <w:r>
-        <w:t xml:space="preserve">Keep architecture </w:t>
-      </w:r>
+        <w:t>5. How to Play — Kaun Hai Gabbar?</w:t>
+      </w:r>
+    </w:p>
+    <w:p>
       <w:r>
         <w:rPr>
           <w:b/>
-          <w:bCs/>
+          <w:sz w:val="24"/>
         </w:rPr>
-        <w:t>fully static and maintainable</w:t>
-      </w:r>
-    </w:p>
-    <w:p>
-      <w:r>
-        <w:pict w14:anchorId="3E14ADB7">
-          <v:rect id="_x0000_i1294" style="width:0;height:1.5pt" o:hralign="center" o:hrstd="t" o:hr="t" fillcolor="#a0a0a0" stroked="f"/>
-        </w:pict>
-      </w:r>
-    </w:p>
-    <w:p>
-      <w:pPr>
+        <w:t>5.1 Overview</w:t>
+      </w:r>
+    </w:p>
+    <w:p>
+      <w:r>
+        <w:t>Kaun Hai Gabbar? is a Sholay-themed social deduction and word-guessing party game. One or more players are secretly assigned as Daku (Gabbar's gang). The rest are Gaon (villagers) who know the secret Bollywood word. Dakus must bluff their way through without knowing the word. Gaon players must identify and catch all the Dakus.</w:t>
+      </w:r>
+    </w:p>
+    <w:p>
+      <w:r>
         <w:rPr>
           <w:b/>
-          <w:bCs/>
+          <w:sz w:val="24"/>
         </w:rPr>
-      </w:pPr>
+        <w:t>5.2 Player Count &amp; Daku Distribution</w:t>
+      </w:r>
+    </w:p>
+    <w:p>
+      <w:pPr>
+        <w:ind w:left="360"/>
+      </w:pPr>
+      <w:r>
+        <w:t>• 3–5 players → 1 Daku (Gabbar)</w:t>
+      </w:r>
+    </w:p>
+    <w:p>
+      <w:pPr>
+        <w:ind w:left="360"/>
+      </w:pPr>
+      <w:r>
+        <w:t>• 6–8 players → 2 Dakus (Gabbar + Sambha)</w:t>
+      </w:r>
+    </w:p>
+    <w:p>
+      <w:pPr>
+        <w:ind w:left="360"/>
+      </w:pPr>
+      <w:r>
+        <w:t>• 9–12 players → 3 Dakus (Gabbar + Sambha + Kaalia)</w:t>
+      </w:r>
+    </w:p>
+    <w:p>
       <w:r>
         <w:rPr>
           <w:b/>
-          <w:bCs/>
+          <w:sz w:val="24"/>
         </w:rPr>
-        <w:t>3. Non-Goals (MVP)</w:t>
-      </w:r>
-    </w:p>
-    <w:p>
-      <w:pPr>
-        <w:numPr>
-          <w:ilvl w:val="0"/>
-          <w:numId w:val="5"/>
-        </w:numPr>
-      </w:pPr>
-      <w:r>
-        <w:t>No authentication or user accounts</w:t>
-      </w:r>
-    </w:p>
-    <w:p>
-      <w:pPr>
-        <w:numPr>
-          <w:ilvl w:val="0"/>
-          <w:numId w:val="5"/>
-        </w:numPr>
-      </w:pPr>
-      <w:r>
-        <w:t>No real-time multiplayer sync</w:t>
-      </w:r>
-    </w:p>
-    <w:p>
-      <w:pPr>
-        <w:numPr>
-          <w:ilvl w:val="0"/>
-          <w:numId w:val="5"/>
-        </w:numPr>
-      </w:pPr>
-      <w:r>
-        <w:t>No backend or database</w:t>
-      </w:r>
-    </w:p>
-    <w:p>
-      <w:pPr>
-        <w:numPr>
-          <w:ilvl w:val="0"/>
-          <w:numId w:val="5"/>
-        </w:numPr>
-      </w:pPr>
-      <w:r>
-        <w:t>No advanced AI/game logic</w:t>
-      </w:r>
-    </w:p>
-    <w:p>
-      <w:r>
-        <w:pict w14:anchorId="3A590A31">
-          <v:rect id="_x0000_i1295" style="width:0;height:1.5pt" o:hralign="center" o:hrstd="t" o:hr="t" fillcolor="#a0a0a0" stroked="f"/>
-        </w:pict>
-      </w:r>
-    </w:p>
-    <w:p>
-      <w:pPr>
+        <w:t>5.3 Characters</w:t>
+      </w:r>
+    </w:p>
+    <w:p>
+      <w:r>
+        <w:t>Daku team (randomly assigned to Daku players):</w:t>
+      </w:r>
+    </w:p>
+    <w:p>
+      <w:pPr>
+        <w:ind w:left="720"/>
+      </w:pPr>
+      <w:r>
+        <w:t>• Gabbar 💀 — "Kitne aadmi the?"</w:t>
+      </w:r>
+    </w:p>
+    <w:p>
+      <w:pPr>
+        <w:ind w:left="720"/>
+      </w:pPr>
+      <w:r>
+        <w:t>• Sambha 🔫 — "Poore pachaas hazaar!"</w:t>
+      </w:r>
+    </w:p>
+    <w:p>
+      <w:pPr>
+        <w:ind w:left="720"/>
+      </w:pPr>
+      <w:r>
+        <w:t>• Kaalia ⚔️ — Gabbar's loyal foot soldier</w:t>
+      </w:r>
+    </w:p>
+    <w:p>
+      <w:r>
+        <w:t>Gaon team (randomly assigned from 14 characters including Veeru, Jay, Thakur, Basanti, and more).</w:t>
+      </w:r>
+    </w:p>
+    <w:p>
+      <w:r>
         <w:rPr>
           <w:b/>
-          <w:bCs/>
+          <w:sz w:val="24"/>
         </w:rPr>
-      </w:pPr>
+        <w:t>5.4 Word Categories</w:t>
+      </w:r>
+    </w:p>
+    <w:p>
+      <w:pPr>
+        <w:ind w:left="360"/>
+      </w:pPr>
+      <w:r>
+        <w:t>• Film Title</w:t>
+      </w:r>
+    </w:p>
+    <w:p>
+      <w:pPr>
+        <w:ind w:left="360"/>
+      </w:pPr>
+      <w:r>
+        <w:t>• Famous Dialogue</w:t>
+      </w:r>
+    </w:p>
+    <w:p>
+      <w:pPr>
+        <w:ind w:left="360"/>
+      </w:pPr>
+      <w:r>
+        <w:t>• Celebrity</w:t>
+      </w:r>
+    </w:p>
+    <w:p>
+      <w:pPr>
+        <w:ind w:left="360"/>
+      </w:pPr>
+      <w:r>
+        <w:t>• Song</w:t>
+      </w:r>
+    </w:p>
+    <w:p>
+      <w:pPr>
+        <w:ind w:left="360"/>
+      </w:pPr>
+      <w:r>
+        <w:t>• Character</w:t>
+      </w:r>
+    </w:p>
+    <w:p>
       <w:r>
         <w:rPr>
           <w:b/>
-          <w:bCs/>
+          <w:sz w:val="24"/>
         </w:rPr>
-        <w:t>4. Game Modes</w:t>
-      </w:r>
-    </w:p>
-    <w:p>
-      <w:pPr>
+        <w:t>5.5 Game Flow — Step by Step</w:t>
+      </w:r>
+    </w:p>
+    <w:p>
+      <w:pPr>
+        <w:ind w:left="360"/>
+      </w:pPr>
+      <w:r>
+        <w:t>1. SETUP — Enter player names (min 3, max 12). Optional: toggle whether Dakus see the category hint (on by default). Tap "Start Game".</w:t>
+      </w:r>
+    </w:p>
+    <w:p>
+      <w:pPr>
+        <w:ind w:left="360"/>
+      </w:pPr>
+      <w:r>
+        <w:t>2. ROLE REVEAL — The phone is passed to each player in turn. Each player sees a privacy gate showing only their name. They tap "Reveal My Role" alone (no one else watching). Their secret role card flips in showing: team (DAKU/GAON), character name + flavour quote, and — for Gaon players — the full secret word, hint, and image. Daku players see only the category (e.g. "Film Title") and a reminder to bluff. Tap "Done" to lock the card and pass to the next player.</w:t>
+      </w:r>
+    </w:p>
+    <w:p>
+      <w:pPr>
+        <w:ind w:left="360"/>
+      </w:pPr>
+      <w:r>
+        <w:t>3. OFFLINE PLAY — All players have seen their roles. Players take turns giving exactly one verbal clue about the secret word. Dakus must give a plausible clue without knowing the word. Players discuss and debate who the Dakus are. No app interaction needed during this phase.</w:t>
+      </w:r>
+    </w:p>
+    <w:p>
+      <w:pPr>
+        <w:ind w:left="360"/>
+      </w:pPr>
+      <w:r>
+        <w:t>4. END SCREEN — Tap "Done Playing". The secret word and all Daku identities are revealed. For each Daku, the group decides: was this player caught? Tap YES or NO. Results auto-calculate when all Dakus are recorded.</w:t>
+      </w:r>
+    </w:p>
+    <w:p>
+      <w:pPr>
+        <w:ind w:left="360"/>
+      </w:pPr>
+      <w:r>
+        <w:t>5. WIN CONDITION — Gaon wins if ALL Dakus were identified. Daku wins if even one Daku escaped detection. Confetti fires on Gaon victory.</w:t>
+      </w:r>
+    </w:p>
+    <w:p>
+      <w:pPr>
+        <w:ind w:left="360"/>
+      </w:pPr>
+      <w:r>
+        <w:t>6. PLAY AGAIN — Tap "Play Again" to keep the same players, re-shuffle roles, and pick a new word. Scores accumulate across rounds.</w:t>
+      </w:r>
+    </w:p>
+    <w:p>
+      <w:r>
         <w:rPr>
           <w:b/>
-          <w:bCs/>
+          <w:sz w:val="24"/>
         </w:rPr>
-      </w:pPr>
+        <w:t>5.6 Scoring</w:t>
+      </w:r>
+    </w:p>
+    <w:p>
+      <w:r>
+        <w:t>Lifetime stats stored in localStorage (persist across sessions):</w:t>
+      </w:r>
+    </w:p>
+    <w:p>
+      <w:pPr>
+        <w:ind w:left="360"/>
+      </w:pPr>
+      <w:r>
+        <w:t>• Total rounds played</w:t>
+      </w:r>
+    </w:p>
+    <w:p>
+      <w:pPr>
+        <w:ind w:left="360"/>
+      </w:pPr>
+      <w:r>
+        <w:t>• Gaon wins / Daku wins</w:t>
+      </w:r>
+    </w:p>
+    <w:p>
+      <w:pPr>
+        <w:ind w:left="360"/>
+      </w:pPr>
+      <w:r>
+        <w:t>• Per player: times assigned as Gabbar, times caught as Daku</w:t>
+      </w:r>
+    </w:p>
+    <w:p/>
+    <w:p>
       <w:r>
         <w:rPr>
           <w:b/>
-          <w:bCs/>
+          <w:sz w:val="28"/>
         </w:rPr>
-        <w:t>4.1 Movie Set Builder</w:t>
-      </w:r>
-    </w:p>
-    <w:p>
-      <w:r>
-        <w:t>Players form sets using:</w:t>
-      </w:r>
-    </w:p>
-    <w:p>
-      <w:pPr>
-        <w:numPr>
-          <w:ilvl w:val="0"/>
-          <w:numId w:val="6"/>
-        </w:numPr>
-      </w:pPr>
-      <w:r>
-        <w:t>1 Location</w:t>
-      </w:r>
-    </w:p>
-    <w:p>
-      <w:pPr>
-        <w:numPr>
-          <w:ilvl w:val="0"/>
-          <w:numId w:val="6"/>
-        </w:numPr>
-      </w:pPr>
-      <w:r>
-        <w:t>1 Plot</w:t>
-      </w:r>
-    </w:p>
-    <w:p>
-      <w:pPr>
-        <w:numPr>
-          <w:ilvl w:val="0"/>
-          <w:numId w:val="6"/>
-        </w:numPr>
-      </w:pPr>
-      <w:r>
-        <w:t>1 Celeb</w:t>
+        <w:t>6. How to Play — Picture Abhi Baaki Hai</w:t>
       </w:r>
     </w:p>
     <w:p>
       <w:r>
         <w:rPr>
           <w:b/>
-          <w:bCs/>
+          <w:sz w:val="24"/>
         </w:rPr>
-        <w:t>Rules:</w:t>
-      </w:r>
-    </w:p>
-    <w:p>
-      <w:pPr>
-        <w:numPr>
-          <w:ilvl w:val="0"/>
-          <w:numId w:val="7"/>
-        </w:numPr>
-      </w:pPr>
-      <w:r>
-        <w:t>Each card has a star value</w:t>
-      </w:r>
-    </w:p>
-    <w:p>
-      <w:pPr>
-        <w:numPr>
-          <w:ilvl w:val="0"/>
-          <w:numId w:val="7"/>
-        </w:numPr>
-      </w:pPr>
-      <w:r>
-        <w:lastRenderedPageBreak/>
-        <w:t>Wild cards = 0 stars</w:t>
-      </w:r>
-    </w:p>
-    <w:p>
-      <w:pPr>
-        <w:numPr>
-          <w:ilvl w:val="0"/>
-          <w:numId w:val="7"/>
-        </w:numPr>
-      </w:pPr>
-      <w:r>
-        <w:t>Scene Change refreshes center row</w:t>
+        <w:t>6.1 Overview</w:t>
+      </w:r>
+    </w:p>
+    <w:p>
+      <w:r>
+        <w:t>Picture Abhi Baaki Hai is a Bollywood party pitching game. Each round one player is the Pitcher — they get a random combo of Actor + Location + Genre + Wildcard and must improvise a Bollywood movie pitch using all four elements. Everyone else votes for the best pitch. Points go to the most-voted pitcher.</w:t>
       </w:r>
     </w:p>
     <w:p>
       <w:r>
         <w:rPr>
           <w:b/>
-          <w:bCs/>
+          <w:sz w:val="24"/>
         </w:rPr>
-        <w:t>Win Condition:</w:t>
-      </w:r>
-    </w:p>
-    <w:p>
-      <w:pPr>
-        <w:numPr>
-          <w:ilvl w:val="0"/>
-          <w:numId w:val="8"/>
-        </w:numPr>
-      </w:pPr>
-      <w:r>
-        <w:t>First to 4 valid sets triggers end</w:t>
-      </w:r>
-    </w:p>
-    <w:p>
-      <w:pPr>
-        <w:numPr>
-          <w:ilvl w:val="0"/>
-          <w:numId w:val="8"/>
-        </w:numPr>
-      </w:pPr>
-      <w:r>
-        <w:t xml:space="preserve">Highest total stars </w:t>
-      </w:r>
-      <w:proofErr w:type="gramStart"/>
-      <w:r>
-        <w:t>wins</w:t>
-      </w:r>
-      <w:proofErr w:type="gramEnd"/>
-    </w:p>
-    <w:p>
-      <w:r>
-        <w:pict w14:anchorId="04E8C2EF">
-          <v:rect id="_x0000_i1296" style="width:0;height:1.5pt" o:hralign="center" o:hrstd="t" o:hr="t" fillcolor="#a0a0a0" stroked="f"/>
-        </w:pict>
-      </w:r>
-    </w:p>
-    <w:p>
-      <w:pPr>
+        <w:t>6.2 Player Count &amp; Setup Options</w:t>
+      </w:r>
+    </w:p>
+    <w:p>
+      <w:pPr>
+        <w:ind w:left="360"/>
+      </w:pPr>
+      <w:r>
+        <w:t>• 3–12 players</w:t>
+      </w:r>
+    </w:p>
+    <w:p>
+      <w:pPr>
+        <w:ind w:left="360"/>
+      </w:pPr>
+      <w:r>
+        <w:t>• Round count: 3, 5 (default), or 7 rounds</w:t>
+      </w:r>
+    </w:p>
+    <w:p>
+      <w:pPr>
+        <w:ind w:left="360"/>
+      </w:pPr>
+      <w:r>
+        <w:t>• Pitch timer: 60s (Fast &amp; chaotic), 90s (Sweet spot — Recommended), 120s (Full filmi drama)</w:t>
+      </w:r>
+    </w:p>
+    <w:p>
+      <w:r>
         <w:rPr>
           <w:b/>
-          <w:bCs/>
+          <w:sz w:val="24"/>
         </w:rPr>
-      </w:pPr>
+        <w:t>6.3 The Combo</w:t>
+      </w:r>
+    </w:p>
+    <w:p>
+      <w:r>
+        <w:t>Each round the pitcher draws a 4-card combo:</w:t>
+      </w:r>
+    </w:p>
+    <w:p>
+      <w:pPr>
+        <w:ind w:left="360"/>
+      </w:pPr>
+      <w:r>
+        <w:t>• ACTOR 🎬 — a Bollywood actor name (40-entry pool, no repeats until exhausted)</w:t>
+      </w:r>
+    </w:p>
+    <w:p>
+      <w:pPr>
+        <w:ind w:left="360"/>
+      </w:pPr>
+      <w:r>
+        <w:t>• LOCATION 📍 — a setting or place (40-entry pool)</w:t>
+      </w:r>
+    </w:p>
+    <w:p>
+      <w:pPr>
+        <w:ind w:left="360"/>
+      </w:pPr>
+      <w:r>
+        <w:t>• GENRE 🎭 — a film genre (20-entry pool)</w:t>
+      </w:r>
+    </w:p>
+    <w:p>
+      <w:pPr>
+        <w:ind w:left="360"/>
+      </w:pPr>
+      <w:r>
+        <w:t>• WILDCARD ⚡ — a twist, dialogue, decade, or co-star constraint (40-entry pool)</w:t>
+      </w:r>
+    </w:p>
+    <w:p>
+      <w:r>
+        <w:t>Cards are drawn without replacement; when a pool is exhausted it resets and reshuffles.</w:t>
+      </w:r>
+    </w:p>
+    <w:p>
       <w:r>
         <w:rPr>
           <w:b/>
-          <w:bCs/>
+          <w:sz w:val="24"/>
         </w:rPr>
-        <w:t>4.2 Guess the Word (MVP Lite)</w:t>
-      </w:r>
-    </w:p>
-    <w:p>
-      <w:pPr>
-        <w:numPr>
-          <w:ilvl w:val="0"/>
-          <w:numId w:val="9"/>
-        </w:numPr>
-      </w:pPr>
-      <w:r>
-        <w:t>One-word clue gameplay</w:t>
-      </w:r>
-    </w:p>
-    <w:p>
-      <w:pPr>
-        <w:numPr>
-          <w:ilvl w:val="0"/>
-          <w:numId w:val="9"/>
-        </w:numPr>
-      </w:pPr>
-      <w:r>
-        <w:t>Turn-based</w:t>
-      </w:r>
-    </w:p>
-    <w:p>
-      <w:pPr>
-        <w:numPr>
-          <w:ilvl w:val="0"/>
-          <w:numId w:val="9"/>
-        </w:numPr>
-      </w:pPr>
-      <w:r>
-        <w:t>Optional team scoring (basic)</w:t>
+        <w:t>6.4 Game Flow — Step by Step</w:t>
+      </w:r>
+    </w:p>
+    <w:p>
+      <w:pPr>
+        <w:ind w:left="360"/>
+      </w:pPr>
+      <w:r>
+        <w:t>1. SETUP — Enter player names, choose rounds and timer. Tap "Start Game".</w:t>
+      </w:r>
+    </w:p>
+    <w:p>
+      <w:pPr>
+        <w:ind w:left="360"/>
+      </w:pPr>
+      <w:r>
+        <w:t>2. COMBO SCREEN — The current pitcher's name is shown. Four cards flip in one by one with a stagger animation, revealing the combo. The Wildcard card has a special glowing border to mark it. The pitcher studies the combo. Tap "Start Pitching →" when ready.</w:t>
+      </w:r>
+    </w:p>
+    <w:p>
+      <w:pPr>
+        <w:ind w:left="360"/>
+      </w:pPr>
+      <w:r>
+        <w:t>3. TIMER SCREEN — A circular countdown ring starts. The compact combo is shown at the top for reference. The ring turns orange below 50% time and red + pulsing below 20%. The pitcher improvises their Bollywood movie pitch out loud — character, story, drama, songs, all of it. When time runs out the app auto-advances to the vote screen. Pitcher can also tap "Time's Up" to end early.</w:t>
+      </w:r>
+    </w:p>
+    <w:p>
+      <w:pPr>
+        <w:ind w:left="360"/>
+      </w:pPr>
+      <w:r>
+        <w:t>4. VOTE SCREEN — Each non-pitcher player taps their vote for the best pitch. Vote category rotates each round (Best Overall Pitch, Most Absurd Premise, Would Actually Watch, Funniest Pitch, Biggest Blockbuster, Crowd Favourite). When all eligible voters have voted, the app auto-advances.</w:t>
+      </w:r>
+    </w:p>
+    <w:p>
+      <w:pPr>
+        <w:ind w:left="360"/>
+      </w:pPr>
+      <w:r>
+        <w:t>5. ROUND RESULT — The round winner is announced with confetti. Standings update immediately. Tap "Next Round →" to continue.</w:t>
+      </w:r>
+    </w:p>
+    <w:p>
+      <w:pPr>
+        <w:ind w:left="360"/>
+      </w:pPr>
+      <w:r>
+        <w:t>6. FINAL SCREEN — After all rounds, the champion is declared with a random Bollywood subtitle. Full scoreboard is shown. Tap "Play Again" to restart with the same players, or "Back to Hungama" to return to the home hub.</w:t>
       </w:r>
     </w:p>
     <w:p>
       <w:r>
         <w:rPr>
           <w:b/>
-          <w:bCs/>
+          <w:sz w:val="24"/>
         </w:rPr>
-        <w:t>Deferred:</w:t>
-      </w:r>
-    </w:p>
-    <w:p>
-      <w:pPr>
-        <w:numPr>
-          <w:ilvl w:val="0"/>
-          <w:numId w:val="10"/>
-        </w:numPr>
-      </w:pPr>
-      <w:r>
-        <w:t>Secret roles</w:t>
-      </w:r>
-    </w:p>
-    <w:p>
-      <w:pPr>
-        <w:numPr>
-          <w:ilvl w:val="0"/>
-          <w:numId w:val="10"/>
-        </w:numPr>
-      </w:pPr>
-      <w:r>
-        <w:t>Bluffing mechanics</w:t>
-      </w:r>
-    </w:p>
-    <w:p>
-      <w:r>
-        <w:pict w14:anchorId="708B0916">
-          <v:rect id="_x0000_i1297" style="width:0;height:1.5pt" o:hralign="center" o:hrstd="t" o:hr="t" fillcolor="#a0a0a0" stroked="f"/>
-        </w:pict>
-      </w:r>
-    </w:p>
-    <w:p>
-      <w:pPr>
+        <w:t>6.5 Scoring</w:t>
+      </w:r>
+    </w:p>
+    <w:p>
+      <w:pPr>
+        <w:ind w:left="360"/>
+      </w:pPr>
+      <w:r>
+        <w:t>• Round winner gets points equal to votes received (e.g. 3 votes = +3 points)</w:t>
+      </w:r>
+    </w:p>
+    <w:p>
+      <w:pPr>
+        <w:ind w:left="360"/>
+      </w:pPr>
+      <w:r>
+        <w:t>• In a tie: all tied players get +1 point each</w:t>
+      </w:r>
+    </w:p>
+    <w:p>
+      <w:pPr>
+        <w:ind w:left="360"/>
+      </w:pPr>
+      <w:r>
+        <w:t>• If nobody voted: no points awarded that round</w:t>
+      </w:r>
+    </w:p>
+    <w:p>
+      <w:pPr>
+        <w:ind w:left="360"/>
+      </w:pPr>
+      <w:r>
+        <w:t>• Scores are stored in sessionStorage — they reset when the browser session ends</w:t>
+      </w:r>
+    </w:p>
+    <w:p>
+      <w:r>
         <w:rPr>
           <w:b/>
-          <w:bCs/>
+          <w:sz w:val="24"/>
         </w:rPr>
-      </w:pPr>
+        <w:t>6.6 Pitcher Order</w:t>
+      </w:r>
+    </w:p>
+    <w:p>
+      <w:r>
+        <w:t>Players are assigned as pitcher in a shuffled random order at game start. The order cycles through all players; once everyone has pitched, the order reshuffles for a new cycle.</w:t>
+      </w:r>
+    </w:p>
+    <w:p/>
+    <w:p>
       <w:r>
         <w:rPr>
           <w:b/>
-          <w:bCs/>
+          <w:sz w:val="28"/>
         </w:rPr>
-        <w:t>5. Core Features</w:t>
-      </w:r>
-    </w:p>
-    <w:p>
-      <w:pPr>
+        <w:t>7. Technical Design</w:t>
+      </w:r>
+    </w:p>
+    <w:p>
+      <w:r>
         <w:rPr>
           <w:b/>
-          <w:bCs/>
+          <w:sz w:val="24"/>
         </w:rPr>
-      </w:pPr>
+        <w:t>7.1 Architecture</w:t>
+      </w:r>
+    </w:p>
+    <w:p>
+      <w:pPr>
+        <w:ind w:left="360"/>
+      </w:pPr>
+      <w:r>
+        <w:t>• Static PWA: single index.html, styles.css, app.js, pabh.js, pabh.css</w:t>
+      </w:r>
+    </w:p>
+    <w:p>
+      <w:pPr>
+        <w:ind w:left="360"/>
+      </w:pPr>
+      <w:r>
+        <w:t>• No framework, no bundler, no build step</w:t>
+      </w:r>
+    </w:p>
+    <w:p>
+      <w:pPr>
+        <w:ind w:left="360"/>
+      </w:pPr>
+      <w:r>
+        <w:t>• Service Worker (sw.js) caches all assets for offline use</w:t>
+      </w:r>
+    </w:p>
+    <w:p>
+      <w:pPr>
+        <w:ind w:left="360"/>
+      </w:pPr>
+      <w:r>
+        <w:t>• Hosted on GitHub Pages — zero infrastructure</w:t>
+      </w:r>
+    </w:p>
+    <w:p>
       <w:r>
         <w:rPr>
           <w:b/>
-          <w:bCs/>
+          <w:sz w:val="24"/>
         </w:rPr>
-        <w:t>5.1 Navigation / Screens</w:t>
-      </w:r>
-    </w:p>
-    <w:p>
-      <w:pPr>
-        <w:numPr>
-          <w:ilvl w:val="0"/>
-          <w:numId w:val="11"/>
-        </w:numPr>
-      </w:pPr>
-      <w:r>
-        <w:t>Start Screen</w:t>
-      </w:r>
-    </w:p>
-    <w:p>
-      <w:pPr>
-        <w:numPr>
-          <w:ilvl w:val="0"/>
-          <w:numId w:val="11"/>
-        </w:numPr>
-      </w:pPr>
-      <w:r>
-        <w:t>Game Selection</w:t>
-      </w:r>
-    </w:p>
-    <w:p>
-      <w:pPr>
-        <w:numPr>
-          <w:ilvl w:val="0"/>
-          <w:numId w:val="11"/>
-        </w:numPr>
-      </w:pPr>
-      <w:r>
-        <w:t>Rules Overlay</w:t>
-      </w:r>
-    </w:p>
-    <w:p>
-      <w:pPr>
-        <w:numPr>
-          <w:ilvl w:val="0"/>
-          <w:numId w:val="11"/>
-        </w:numPr>
-      </w:pPr>
-      <w:r>
-        <w:t>Gameplay Screen</w:t>
-      </w:r>
-    </w:p>
-    <w:p>
-      <w:pPr>
-        <w:numPr>
-          <w:ilvl w:val="0"/>
-          <w:numId w:val="11"/>
-        </w:numPr>
-      </w:pPr>
-      <w:r>
-        <w:t>Turn Handoff Screen (critical)</w:t>
-      </w:r>
-    </w:p>
-    <w:p>
-      <w:pPr>
-        <w:numPr>
-          <w:ilvl w:val="0"/>
-          <w:numId w:val="11"/>
-        </w:numPr>
-      </w:pPr>
-      <w:r>
-        <w:t>End Game Screen</w:t>
-      </w:r>
-    </w:p>
-    <w:p>
-      <w:r>
-        <w:pict w14:anchorId="20E88F06">
-          <v:rect id="_x0000_i1298" style="width:0;height:1.5pt" o:hralign="center" o:hrstd="t" o:hr="t" fillcolor="#a0a0a0" stroked="f"/>
-        </w:pict>
-      </w:r>
-    </w:p>
-    <w:p>
-      <w:pPr>
+        <w:t>7.2 Data Files</w:t>
+      </w:r>
+    </w:p>
+    <w:p>
+      <w:pPr>
+        <w:ind w:left="360"/>
+      </w:pPr>
+      <w:r>
+        <w:t>• data/words.json — KHG word bank (Film Titles, Dialogues, Celebrities, Songs, Characters)</w:t>
+      </w:r>
+    </w:p>
+    <w:p>
+      <w:pPr>
+        <w:ind w:left="360"/>
+      </w:pPr>
+      <w:r>
+        <w:t>• data/pabh-data.json — PABH pools: 40 actors, 40 locations, 20 genres, 40 wildcards</w:t>
+      </w:r>
+    </w:p>
+    <w:p>
+      <w:r>
         <w:rPr>
           <w:b/>
-          <w:bCs/>
+          <w:sz w:val="24"/>
         </w:rPr>
-      </w:pPr>
+        <w:t>7.3 State Management</w:t>
+      </w:r>
+    </w:p>
+    <w:p>
+      <w:pPr>
+        <w:ind w:left="360"/>
+      </w:pPr>
+      <w:r>
+        <w:t>• KHG: localStorage (persists across sessions) for scores; in-memory for game state</w:t>
+      </w:r>
+    </w:p>
+    <w:p>
+      <w:pPr>
+        <w:ind w:left="360"/>
+      </w:pPr>
+      <w:r>
+        <w:t>• PABH: sessionStorage (resets on browser close) for game state and scores</w:t>
+      </w:r>
+    </w:p>
+    <w:p>
       <w:r>
         <w:rPr>
           <w:b/>
-          <w:bCs/>
+          <w:sz w:val="24"/>
         </w:rPr>
-        <w:t>5.2 Gameplay System</w:t>
-      </w:r>
-    </w:p>
-    <w:p>
-      <w:pPr>
-        <w:numPr>
-          <w:ilvl w:val="0"/>
-          <w:numId w:val="12"/>
-        </w:numPr>
-      </w:pPr>
-      <w:r>
-        <w:t>Tap to select/draw cards</w:t>
-      </w:r>
-    </w:p>
-    <w:p>
-      <w:pPr>
-        <w:numPr>
-          <w:ilvl w:val="0"/>
-          <w:numId w:val="12"/>
-        </w:numPr>
-      </w:pPr>
-      <w:r>
-        <w:t>Automatic validation of sets</w:t>
-      </w:r>
-    </w:p>
-    <w:p>
-      <w:pPr>
-        <w:numPr>
-          <w:ilvl w:val="0"/>
-          <w:numId w:val="12"/>
-        </w:numPr>
-      </w:pPr>
-      <w:r>
-        <w:lastRenderedPageBreak/>
-        <w:t>Turn-based progression</w:t>
-      </w:r>
-    </w:p>
-    <w:p>
-      <w:pPr>
-        <w:numPr>
-          <w:ilvl w:val="0"/>
-          <w:numId w:val="12"/>
-        </w:numPr>
-      </w:pPr>
-      <w:r>
-        <w:t>Score auto-update</w:t>
-      </w:r>
-    </w:p>
-    <w:p>
-      <w:r>
-        <w:pict w14:anchorId="14C3A0BD">
-          <v:rect id="_x0000_i1299" style="width:0;height:1.5pt" o:hralign="center" o:hrstd="t" o:hr="t" fillcolor="#a0a0a0" stroked="f"/>
-        </w:pict>
-      </w:r>
-    </w:p>
-    <w:p>
-      <w:pPr>
+        <w:t>7.4 Privacy System</w:t>
+      </w:r>
+    </w:p>
+    <w:p>
+      <w:r>
+        <w:t>KHG uses a mandatory hot-seat privacy gate: each player sees a screen showing only their name with a "Reveal My Role" button. The role card is only shown after the player explicitly taps, ensuring no other player sees their secret assignment.</w:t>
+      </w:r>
+    </w:p>
+    <w:p>
+      <w:r>
         <w:rPr>
           <w:b/>
-          <w:bCs/>
+          <w:sz w:val="24"/>
         </w:rPr>
-      </w:pPr>
+        <w:t>7.5 Testing</w:t>
+      </w:r>
+    </w:p>
+    <w:p>
+      <w:pPr>
+        <w:ind w:left="360"/>
+      </w:pPr>
+      <w:r>
+        <w:t>• E2E test suite: 28 Playwright tests covering both games end-to-end</w:t>
+      </w:r>
+    </w:p>
+    <w:p>
+      <w:pPr>
+        <w:ind w:left="360"/>
+      </w:pPr>
+      <w:r>
+        <w:t>• Test runner: npx playwright test</w:t>
+      </w:r>
+    </w:p>
+    <w:p>
+      <w:pPr>
+        <w:ind w:left="360"/>
+      </w:pPr>
+      <w:r>
+        <w:t>• Static analysis: ESLint (eslint.config.mjs) — 0 errors, 0 warnings</w:t>
+      </w:r>
+    </w:p>
+    <w:p>
+      <w:pPr>
+        <w:ind w:left="360"/>
+      </w:pPr>
+      <w:r>
+        <w:t>• Dependency audit: npm audit — 0 known CVEs</w:t>
+      </w:r>
+    </w:p>
+    <w:p/>
+    <w:p>
       <w:r>
         <w:rPr>
           <w:b/>
-          <w:bCs/>
+          <w:sz w:val="28"/>
         </w:rPr>
-        <w:t>5.3 State Management</w:t>
-      </w:r>
-    </w:p>
-    <w:p>
-      <w:r>
-        <w:t xml:space="preserve">Stored in memory + persisted via </w:t>
-      </w:r>
-      <w:proofErr w:type="spellStart"/>
-      <w:r>
-        <w:t>localStorage</w:t>
-      </w:r>
-      <w:proofErr w:type="spellEnd"/>
-      <w:r>
-        <w:t>:</w:t>
-      </w:r>
-    </w:p>
-    <w:p>
-      <w:pPr>
-        <w:numPr>
-          <w:ilvl w:val="0"/>
-          <w:numId w:val="13"/>
-        </w:numPr>
-      </w:pPr>
-      <w:r>
-        <w:t>Players list</w:t>
-      </w:r>
-    </w:p>
-    <w:p>
-      <w:pPr>
-        <w:numPr>
-          <w:ilvl w:val="0"/>
-          <w:numId w:val="13"/>
-        </w:numPr>
-      </w:pPr>
-      <w:r>
-        <w:t>Turn order</w:t>
-      </w:r>
-    </w:p>
-    <w:p>
-      <w:pPr>
-        <w:numPr>
-          <w:ilvl w:val="0"/>
-          <w:numId w:val="13"/>
-        </w:numPr>
-      </w:pPr>
-      <w:r>
-        <w:t>Scores</w:t>
-      </w:r>
-    </w:p>
-    <w:p>
-      <w:pPr>
-        <w:numPr>
-          <w:ilvl w:val="0"/>
-          <w:numId w:val="13"/>
-        </w:numPr>
-      </w:pPr>
-      <w:r>
-        <w:t>Completed sets</w:t>
-      </w:r>
-    </w:p>
-    <w:p>
-      <w:pPr>
-        <w:numPr>
-          <w:ilvl w:val="0"/>
-          <w:numId w:val="13"/>
-        </w:numPr>
-      </w:pPr>
-      <w:r>
-        <w:t>Current round</w:t>
-      </w:r>
-    </w:p>
-    <w:p>
-      <w:r>
-        <w:pict w14:anchorId="2FFA380C">
-          <v:rect id="_x0000_i1300" style="width:0;height:1.5pt" o:hralign="center" o:hrstd="t" o:hr="t" fillcolor="#a0a0a0" stroked="f"/>
-        </w:pict>
-      </w:r>
-    </w:p>
-    <w:p>
-      <w:pPr>
+        <w:t>8. Non-Functional Requirements</w:t>
+      </w:r>
+    </w:p>
+    <w:p>
+      <w:pPr>
+        <w:ind w:left="360"/>
+      </w:pPr>
+      <w:r>
+        <w:t>• Works on Chrome, Safari (mobile), Edge</w:t>
+      </w:r>
+    </w:p>
+    <w:p>
+      <w:pPr>
+        <w:ind w:left="360"/>
+      </w:pPr>
+      <w:r>
+        <w:t>• No console errors in production</w:t>
+      </w:r>
+    </w:p>
+    <w:p>
+      <w:pPr>
+        <w:ind w:left="360"/>
+      </w:pPr>
+      <w:r>
+        <w:t>• Responsive across common phone sizes (portrait mode)</w:t>
+      </w:r>
+    </w:p>
+    <w:p>
+      <w:pPr>
+        <w:ind w:left="360"/>
+      </w:pPr>
+      <w:r>
+        <w:t>• Buttons ≥ 44px tap target height</w:t>
+      </w:r>
+    </w:p>
+    <w:p>
+      <w:pPr>
+        <w:ind w:left="360"/>
+      </w:pPr>
+      <w:r>
+        <w:t>• Accessible font sizes and contrast ratios</w:t>
+      </w:r>
+    </w:p>
+    <w:p>
+      <w:pPr>
+        <w:ind w:left="360"/>
+      </w:pPr>
+      <w:r>
+        <w:t>• App loads in &lt; 2 seconds on standard mobile network</w:t>
+      </w:r>
+    </w:p>
+    <w:p>
+      <w:pPr>
+        <w:ind w:left="360"/>
+      </w:pPr>
+      <w:r>
+        <w:t>• Works offline after first load (Service Worker)</w:t>
+      </w:r>
+    </w:p>
+    <w:p/>
+    <w:p>
+      <w:r>
         <w:rPr>
           <w:b/>
-          <w:bCs/>
+          <w:sz w:val="28"/>
         </w:rPr>
-      </w:pPr>
+        <w:t>9. Future Enhancements</w:t>
+      </w:r>
+    </w:p>
+    <w:p>
+      <w:pPr>
+        <w:ind w:left="360"/>
+      </w:pPr>
+      <w:r>
+        <w:t>• KHG: How to Play screen inside PABH (currently only KHG has rules screen)</w:t>
+      </w:r>
+    </w:p>
+    <w:p>
+      <w:pPr>
+        <w:ind w:left="360"/>
+      </w:pPr>
+      <w:r>
+        <w:t>• PABH: Vote privacy gate — each voter votes secretly without seeing prior votes</w:t>
+      </w:r>
+    </w:p>
+    <w:p>
+      <w:pPr>
+        <w:ind w:left="360"/>
+      </w:pPr>
+      <w:r>
+        <w:t>• PABH: Abandon game confirmation modal</w:t>
+      </w:r>
+    </w:p>
+    <w:p>
+      <w:pPr>
+        <w:ind w:left="360"/>
+      </w:pPr>
+      <w:r>
+        <w:t>• Sound effects and haptic feedback</w:t>
+      </w:r>
+    </w:p>
+    <w:p>
+      <w:pPr>
+        <w:ind w:left="360"/>
+      </w:pPr>
+      <w:r>
+        <w:t>• Shareable round results</w:t>
+      </w:r>
+    </w:p>
+    <w:p>
+      <w:pPr>
+        <w:ind w:left="360"/>
+      </w:pPr>
+      <w:r>
+        <w:t>• Daily challenge mode (seed-based combos/words)</w:t>
+      </w:r>
+    </w:p>
+    <w:p>
+      <w:pPr>
+        <w:ind w:left="360"/>
+      </w:pPr>
+      <w:r>
+        <w:t>• TMDB integration for movie posters in KHG word cards</w:t>
+      </w:r>
+    </w:p>
+    <w:p>
+      <w:pPr>
+        <w:ind w:left="360"/>
+      </w:pPr>
+      <w:r>
+        <w:t>• Third game: Antakshari / SongLink mode</w:t>
+      </w:r>
+    </w:p>
+    <w:p/>
+    <w:p>
       <w:r>
         <w:rPr>
           <w:b/>
-          <w:bCs/>
+          <w:sz w:val="28"/>
         </w:rPr>
-        <w:t>5.4 Privacy System (Shared Device)</w:t>
-      </w:r>
-    </w:p>
-    <w:p>
-      <w:r>
-        <w:t>Mandatory turn handoff mechanism:</w:t>
-      </w:r>
-    </w:p>
-    <w:p>
-      <w:pPr>
-        <w:numPr>
-          <w:ilvl w:val="0"/>
-          <w:numId w:val="14"/>
-        </w:numPr>
-      </w:pPr>
-      <w:r>
-        <w:t>Hide sensitive state between turns</w:t>
-      </w:r>
-    </w:p>
-    <w:p>
-      <w:pPr>
-        <w:numPr>
-          <w:ilvl w:val="0"/>
-          <w:numId w:val="14"/>
-        </w:numPr>
-      </w:pPr>
-      <w:r>
-        <w:t>Require explicit “Next Player Ready” action</w:t>
-      </w:r>
-    </w:p>
-    <w:p>
-      <w:r>
-        <w:pict w14:anchorId="2D44DF7B">
-          <v:rect id="_x0000_i1301" style="width:0;height:1.5pt" o:hralign="center" o:hrstd="t" o:hr="t" fillcolor="#a0a0a0" stroked="f"/>
-        </w:pict>
-      </w:r>
-    </w:p>
-    <w:p>
-      <w:pPr>
-        <w:rPr>
-          <w:b/>
-          <w:bCs/>
-        </w:rPr>
-      </w:pPr>
-      <w:r>
-        <w:rPr>
-          <w:b/>
-          <w:bCs/>
-        </w:rPr>
-        <w:t>6. Functional Requirements &amp; Acceptance Criteria</w:t>
-      </w:r>
-    </w:p>
-    <w:p>
-      <w:r>
-        <w:pict w14:anchorId="463E3139">
-          <v:rect id="_x0000_i1302" style="width:0;height:1.5pt" o:hralign="center" o:hrstd="t" o:hr="t" fillcolor="#a0a0a0" stroked="f"/>
-        </w:pict>
-      </w:r>
-    </w:p>
-    <w:p>
-      <w:pPr>
-        <w:rPr>
-          <w:b/>
-          <w:bCs/>
-        </w:rPr>
-      </w:pPr>
-      <w:r>
-        <w:rPr>
-          <w:b/>
-          <w:bCs/>
-        </w:rPr>
-        <w:t>6.1 App Load &amp; Performance</w:t>
-      </w:r>
-    </w:p>
-    <w:p>
-      <w:r>
-        <w:rPr>
-          <w:b/>
-          <w:bCs/>
-        </w:rPr>
-        <w:t>Requirement:</w:t>
-      </w:r>
-      <w:r>
-        <w:br/>
-        <w:t>App must load instantly and be usable offline after first load.</w:t>
-      </w:r>
-    </w:p>
-    <w:p>
-      <w:r>
-        <w:rPr>
-          <w:b/>
-          <w:bCs/>
-        </w:rPr>
-        <w:t>Acceptance Criteria:</w:t>
-      </w:r>
-    </w:p>
-    <w:p>
-      <w:pPr>
-        <w:numPr>
-          <w:ilvl w:val="0"/>
-          <w:numId w:val="15"/>
-        </w:numPr>
-      </w:pPr>
-      <w:r>
-        <w:t xml:space="preserve">Loads in </w:t>
-      </w:r>
-      <w:r>
-        <w:rPr>
-          <w:b/>
-          <w:bCs/>
-        </w:rPr>
-        <w:t>&lt; 2 seconds</w:t>
-      </w:r>
-      <w:r>
-        <w:t xml:space="preserve"> on standard mobile network</w:t>
-      </w:r>
-    </w:p>
-    <w:p>
-      <w:pPr>
-        <w:numPr>
-          <w:ilvl w:val="0"/>
-          <w:numId w:val="15"/>
-        </w:numPr>
-      </w:pPr>
-      <w:r>
-        <w:t>No blocking API calls at startup</w:t>
-      </w:r>
-    </w:p>
-    <w:p>
-      <w:pPr>
-        <w:numPr>
-          <w:ilvl w:val="0"/>
-          <w:numId w:val="15"/>
-        </w:numPr>
-      </w:pPr>
-      <w:r>
-        <w:t xml:space="preserve">App works with </w:t>
-      </w:r>
-      <w:r>
-        <w:rPr>
-          <w:b/>
-          <w:bCs/>
-        </w:rPr>
-        <w:t>no internet after first load</w:t>
-      </w:r>
-    </w:p>
-    <w:p>
-      <w:pPr>
-        <w:numPr>
-          <w:ilvl w:val="0"/>
-          <w:numId w:val="15"/>
-        </w:numPr>
-      </w:pPr>
-      <w:r>
-        <w:t>Lighthouse Performance Score ≥ 90</w:t>
-      </w:r>
-    </w:p>
-    <w:p>
-      <w:r>
-        <w:lastRenderedPageBreak/>
-        <w:pict w14:anchorId="5AF332BE">
-          <v:rect id="_x0000_i1303" style="width:0;height:1.5pt" o:hralign="center" o:hrstd="t" o:hr="t" fillcolor="#a0a0a0" stroked="f"/>
-        </w:pict>
-      </w:r>
-    </w:p>
-    <w:p>
-      <w:pPr>
-        <w:rPr>
-          <w:b/>
-          <w:bCs/>
-        </w:rPr>
-      </w:pPr>
-      <w:r>
-        <w:rPr>
-          <w:b/>
-          <w:bCs/>
-        </w:rPr>
-        <w:t>6.2 Start Flow</w:t>
-      </w:r>
-    </w:p>
-    <w:p>
-      <w:r>
-        <w:rPr>
-          <w:b/>
-          <w:bCs/>
-        </w:rPr>
-        <w:t>Requirement:</w:t>
-      </w:r>
-      <w:r>
-        <w:br/>
-        <w:t>User can begin gameplay within 1 minute.</w:t>
-      </w:r>
-    </w:p>
-    <w:p>
-      <w:r>
-        <w:rPr>
-          <w:b/>
-          <w:bCs/>
-        </w:rPr>
-        <w:t>Acceptance Criteria:</w:t>
-      </w:r>
-    </w:p>
-    <w:p>
-      <w:pPr>
-        <w:numPr>
-          <w:ilvl w:val="0"/>
-          <w:numId w:val="16"/>
-        </w:numPr>
-      </w:pPr>
-      <w:r>
-        <w:t>Start screen visible on load</w:t>
-      </w:r>
-    </w:p>
-    <w:p>
-      <w:pPr>
-        <w:numPr>
-          <w:ilvl w:val="0"/>
-          <w:numId w:val="16"/>
-        </w:numPr>
-      </w:pPr>
-      <w:r>
-        <w:t>“Start Game” CTA clearly visible</w:t>
-      </w:r>
-    </w:p>
-    <w:p>
-      <w:pPr>
-        <w:numPr>
-          <w:ilvl w:val="0"/>
-          <w:numId w:val="16"/>
-        </w:numPr>
-      </w:pPr>
-      <w:r>
-        <w:t>Game selection completed in ≤ 3 taps</w:t>
-      </w:r>
-    </w:p>
-    <w:p>
-      <w:pPr>
-        <w:numPr>
-          <w:ilvl w:val="0"/>
-          <w:numId w:val="16"/>
-        </w:numPr>
-      </w:pPr>
-      <w:r>
-        <w:t>Rules overlay dismissible in 1 tap</w:t>
-      </w:r>
-    </w:p>
-    <w:p>
-      <w:r>
-        <w:pict w14:anchorId="3EEE9776">
-          <v:rect id="_x0000_i1304" style="width:0;height:1.5pt" o:hralign="center" o:hrstd="t" o:hr="t" fillcolor="#a0a0a0" stroked="f"/>
-        </w:pict>
-      </w:r>
-    </w:p>
-    <w:p>
-      <w:pPr>
-        <w:rPr>
-          <w:b/>
-          <w:bCs/>
-        </w:rPr>
-      </w:pPr>
-      <w:r>
-        <w:rPr>
-          <w:b/>
-          <w:bCs/>
-        </w:rPr>
-        <w:t>6.3 Player Setup</w:t>
-      </w:r>
-    </w:p>
-    <w:p>
-      <w:r>
-        <w:rPr>
-          <w:b/>
-          <w:bCs/>
-        </w:rPr>
-        <w:t>Requirement:</w:t>
-      </w:r>
-      <w:r>
-        <w:br/>
-        <w:t>Support 2–8 players.</w:t>
-      </w:r>
-    </w:p>
-    <w:p>
-      <w:r>
-        <w:rPr>
-          <w:b/>
-          <w:bCs/>
-        </w:rPr>
-        <w:t>Acceptance Criteria:</w:t>
-      </w:r>
-    </w:p>
-    <w:p>
-      <w:pPr>
-        <w:numPr>
-          <w:ilvl w:val="0"/>
-          <w:numId w:val="17"/>
-        </w:numPr>
-      </w:pPr>
-      <w:r>
-        <w:t>User can add/remove players</w:t>
-      </w:r>
-    </w:p>
-    <w:p>
-      <w:pPr>
-        <w:numPr>
-          <w:ilvl w:val="0"/>
-          <w:numId w:val="17"/>
-        </w:numPr>
-      </w:pPr>
-      <w:r>
-        <w:t>Player names optional (default: Player 1, Player 2…)</w:t>
-      </w:r>
-    </w:p>
-    <w:p>
-      <w:pPr>
-        <w:numPr>
-          <w:ilvl w:val="0"/>
-          <w:numId w:val="17"/>
-        </w:numPr>
-      </w:pPr>
-      <w:r>
-        <w:t>Turn order automatically generated</w:t>
-      </w:r>
-    </w:p>
-    <w:p>
-      <w:pPr>
-        <w:numPr>
-          <w:ilvl w:val="0"/>
-          <w:numId w:val="17"/>
-        </w:numPr>
-      </w:pPr>
-      <w:r>
-        <w:t>Max players capped at 8</w:t>
-      </w:r>
-    </w:p>
-    <w:p>
-      <w:r>
-        <w:pict w14:anchorId="62356E0B">
-          <v:rect id="_x0000_i1305" style="width:0;height:1.5pt" o:hralign="center" o:hrstd="t" o:hr="t" fillcolor="#a0a0a0" stroked="f"/>
-        </w:pict>
-      </w:r>
-    </w:p>
-    <w:p>
-      <w:pPr>
-        <w:rPr>
-          <w:b/>
-          <w:bCs/>
-        </w:rPr>
-      </w:pPr>
-      <w:r>
-        <w:rPr>
-          <w:b/>
-          <w:bCs/>
-        </w:rPr>
-        <w:t>6.4 Movie Set Builder Gameplay</w:t>
-      </w:r>
-    </w:p>
-    <w:p>
-      <w:r>
-        <w:rPr>
-          <w:b/>
-          <w:bCs/>
-        </w:rPr>
-        <w:t>Requirement:</w:t>
-      </w:r>
-      <w:r>
-        <w:br/>
-        <w:t>Enable full gameplay loop.</w:t>
-      </w:r>
-    </w:p>
-    <w:p>
-      <w:r>
-        <w:rPr>
-          <w:b/>
-          <w:bCs/>
-        </w:rPr>
-        <w:t>Acceptance Criteria:</w:t>
-      </w:r>
-    </w:p>
-    <w:p>
-      <w:pPr>
-        <w:numPr>
-          <w:ilvl w:val="0"/>
-          <w:numId w:val="18"/>
-        </w:numPr>
-      </w:pPr>
-      <w:r>
-        <w:t>Deck initializes and shuffles on game start</w:t>
-      </w:r>
-    </w:p>
-    <w:p>
-      <w:pPr>
-        <w:numPr>
-          <w:ilvl w:val="0"/>
-          <w:numId w:val="18"/>
-        </w:numPr>
-      </w:pPr>
-      <w:r>
-        <w:t>Player can draw/select cards via tap</w:t>
-      </w:r>
-    </w:p>
-    <w:p>
-      <w:pPr>
-        <w:numPr>
-          <w:ilvl w:val="0"/>
-          <w:numId w:val="18"/>
-        </w:numPr>
-      </w:pPr>
-      <w:r>
-        <w:t>System validates:</w:t>
-      </w:r>
-    </w:p>
-    <w:p>
-      <w:pPr>
-        <w:numPr>
-          <w:ilvl w:val="1"/>
-          <w:numId w:val="18"/>
-        </w:numPr>
-      </w:pPr>
-      <w:r>
-        <w:t>1 Location + 1 Plot + 1 Celeb</w:t>
-      </w:r>
-    </w:p>
-    <w:p>
-      <w:pPr>
-        <w:numPr>
-          <w:ilvl w:val="0"/>
-          <w:numId w:val="18"/>
-        </w:numPr>
-      </w:pPr>
-      <w:r>
-        <w:lastRenderedPageBreak/>
-        <w:t>Invalid sets are rejected with visual feedback</w:t>
-      </w:r>
-    </w:p>
-    <w:p>
-      <w:pPr>
-        <w:numPr>
-          <w:ilvl w:val="0"/>
-          <w:numId w:val="18"/>
-        </w:numPr>
-      </w:pPr>
-      <w:r>
-        <w:t>Valid sets:</w:t>
-      </w:r>
-    </w:p>
-    <w:p>
-      <w:pPr>
-        <w:numPr>
-          <w:ilvl w:val="1"/>
-          <w:numId w:val="18"/>
-        </w:numPr>
-      </w:pPr>
-      <w:r>
-        <w:t>Added to player score</w:t>
-      </w:r>
-    </w:p>
-    <w:p>
-      <w:pPr>
-        <w:numPr>
-          <w:ilvl w:val="1"/>
-          <w:numId w:val="18"/>
-        </w:numPr>
-      </w:pPr>
-      <w:r>
-        <w:t>Removed from active selection</w:t>
-      </w:r>
-    </w:p>
-    <w:p>
-      <w:pPr>
-        <w:numPr>
-          <w:ilvl w:val="0"/>
-          <w:numId w:val="18"/>
-        </w:numPr>
-      </w:pPr>
-      <w:r>
-        <w:t>Scene Change:</w:t>
-      </w:r>
-    </w:p>
-    <w:p>
-      <w:pPr>
-        <w:numPr>
-          <w:ilvl w:val="1"/>
-          <w:numId w:val="18"/>
-        </w:numPr>
-      </w:pPr>
-      <w:r>
-        <w:t>Refreshes center cards immediately</w:t>
-      </w:r>
-    </w:p>
-    <w:p>
-      <w:pPr>
-        <w:numPr>
-          <w:ilvl w:val="0"/>
-          <w:numId w:val="18"/>
-        </w:numPr>
-      </w:pPr>
-      <w:r>
-        <w:t>Round ends when a player reaches 4 sets</w:t>
-      </w:r>
-    </w:p>
-    <w:p>
-      <w:pPr>
-        <w:numPr>
-          <w:ilvl w:val="0"/>
-          <w:numId w:val="18"/>
-        </w:numPr>
-      </w:pPr>
-      <w:r>
-        <w:t>Winner correctly calculated based on total stars</w:t>
-      </w:r>
-    </w:p>
-    <w:p>
-      <w:r>
-        <w:pict w14:anchorId="36CB9694">
-          <v:rect id="_x0000_i1306" style="width:0;height:1.5pt" o:hralign="center" o:hrstd="t" o:hr="t" fillcolor="#a0a0a0" stroked="f"/>
-        </w:pict>
-      </w:r>
-    </w:p>
-    <w:p>
-      <w:pPr>
-        <w:rPr>
-          <w:b/>
-          <w:bCs/>
-        </w:rPr>
-      </w:pPr>
-      <w:r>
-        <w:rPr>
-          <w:b/>
-          <w:bCs/>
-        </w:rPr>
-        <w:t>6.5 Guess the Word Gameplay (MVP)</w:t>
-      </w:r>
-    </w:p>
-    <w:p>
-      <w:r>
-        <w:rPr>
-          <w:b/>
-          <w:bCs/>
-        </w:rPr>
-        <w:t>Requirement:</w:t>
-      </w:r>
-      <w:r>
-        <w:br/>
-        <w:t>Basic playable version.</w:t>
-      </w:r>
-    </w:p>
-    <w:p>
-      <w:r>
-        <w:rPr>
-          <w:b/>
-          <w:bCs/>
-        </w:rPr>
-        <w:t>Acceptance Criteria:</w:t>
-      </w:r>
-    </w:p>
-    <w:p>
-      <w:pPr>
-        <w:numPr>
-          <w:ilvl w:val="0"/>
-          <w:numId w:val="19"/>
-        </w:numPr>
-      </w:pPr>
-      <w:r>
-        <w:t>Word displayed only to active player</w:t>
-      </w:r>
-    </w:p>
-    <w:p>
-      <w:pPr>
-        <w:numPr>
-          <w:ilvl w:val="0"/>
-          <w:numId w:val="19"/>
-        </w:numPr>
-      </w:pPr>
-      <w:r>
-        <w:t>Player can give clue manually (offline play)</w:t>
-      </w:r>
-    </w:p>
-    <w:p>
-      <w:pPr>
-        <w:numPr>
-          <w:ilvl w:val="0"/>
-          <w:numId w:val="19"/>
-        </w:numPr>
-      </w:pPr>
-      <w:r>
-        <w:t>Turn progresses via “Next” button</w:t>
-      </w:r>
-    </w:p>
-    <w:p>
-      <w:pPr>
-        <w:numPr>
-          <w:ilvl w:val="0"/>
-          <w:numId w:val="19"/>
-        </w:numPr>
-      </w:pPr>
-      <w:r>
-        <w:t>Score increments manually or via simple toggle</w:t>
-      </w:r>
-    </w:p>
-    <w:p>
-      <w:pPr>
-        <w:numPr>
-          <w:ilvl w:val="0"/>
-          <w:numId w:val="19"/>
-        </w:numPr>
-      </w:pPr>
-      <w:r>
-        <w:t>Round tracking visible</w:t>
-      </w:r>
-    </w:p>
-    <w:p>
-      <w:r>
-        <w:pict w14:anchorId="3B5C8BE6">
-          <v:rect id="_x0000_i1307" style="width:0;height:1.5pt" o:hralign="center" o:hrstd="t" o:hr="t" fillcolor="#a0a0a0" stroked="f"/>
-        </w:pict>
-      </w:r>
-    </w:p>
-    <w:p>
-      <w:pPr>
-        <w:rPr>
-          <w:b/>
-          <w:bCs/>
-        </w:rPr>
-      </w:pPr>
-      <w:r>
-        <w:rPr>
-          <w:b/>
-          <w:bCs/>
-        </w:rPr>
-        <w:t>6.6 Turn Handoff (Critical Feature)</w:t>
-      </w:r>
-    </w:p>
-    <w:p>
-      <w:r>
-        <w:rPr>
-          <w:b/>
-          <w:bCs/>
-        </w:rPr>
-        <w:t>Requirement:</w:t>
-      </w:r>
-      <w:r>
-        <w:br/>
-        <w:t>Prevent information leakage on shared devices.</w:t>
-      </w:r>
-    </w:p>
-    <w:p>
-      <w:r>
-        <w:rPr>
-          <w:b/>
-          <w:bCs/>
-        </w:rPr>
-        <w:t>Acceptance Criteria:</w:t>
-      </w:r>
-    </w:p>
-    <w:p>
-      <w:pPr>
-        <w:numPr>
-          <w:ilvl w:val="0"/>
-          <w:numId w:val="20"/>
-        </w:numPr>
-      </w:pPr>
-      <w:r>
-        <w:t>At end of each turn:</w:t>
-      </w:r>
-    </w:p>
-    <w:p>
-      <w:pPr>
-        <w:numPr>
-          <w:ilvl w:val="1"/>
-          <w:numId w:val="20"/>
-        </w:numPr>
-      </w:pPr>
-      <w:r>
-        <w:t>Screen fully hides game state</w:t>
-      </w:r>
-    </w:p>
-    <w:p>
-      <w:pPr>
-        <w:numPr>
-          <w:ilvl w:val="1"/>
-          <w:numId w:val="20"/>
-        </w:numPr>
-      </w:pPr>
-      <w:r>
-        <w:t>Displays “Pass to next player”</w:t>
-      </w:r>
-    </w:p>
-    <w:p>
-      <w:pPr>
-        <w:numPr>
-          <w:ilvl w:val="0"/>
-          <w:numId w:val="20"/>
-        </w:numPr>
-      </w:pPr>
-      <w:r>
-        <w:t>Next player must tap “Ready” to continue</w:t>
-      </w:r>
-    </w:p>
-    <w:p>
-      <w:pPr>
-        <w:numPr>
-          <w:ilvl w:val="0"/>
-          <w:numId w:val="20"/>
-        </w:numPr>
-      </w:pPr>
-      <w:r>
-        <w:lastRenderedPageBreak/>
-        <w:t>Previous player’s cards/selections are not visible</w:t>
-      </w:r>
-    </w:p>
-    <w:p>
-      <w:pPr>
-        <w:numPr>
-          <w:ilvl w:val="0"/>
-          <w:numId w:val="20"/>
-        </w:numPr>
-      </w:pPr>
-      <w:r>
-        <w:t>No sensitive data visible during transition</w:t>
-      </w:r>
-    </w:p>
-    <w:p>
-      <w:r>
-        <w:pict w14:anchorId="686FD21D">
-          <v:rect id="_x0000_i1308" style="width:0;height:1.5pt" o:hralign="center" o:hrstd="t" o:hr="t" fillcolor="#a0a0a0" stroked="f"/>
-        </w:pict>
-      </w:r>
-    </w:p>
-    <w:p>
-      <w:pPr>
-        <w:rPr>
-          <w:b/>
-          <w:bCs/>
-        </w:rPr>
-      </w:pPr>
-      <w:r>
-        <w:rPr>
-          <w:b/>
-          <w:bCs/>
-        </w:rPr>
-        <w:t xml:space="preserve">6.7 </w:t>
-      </w:r>
-      <w:proofErr w:type="gramStart"/>
-      <w:r>
-        <w:rPr>
-          <w:b/>
-          <w:bCs/>
-        </w:rPr>
-        <w:t>Score</w:t>
-      </w:r>
-      <w:proofErr w:type="gramEnd"/>
-      <w:r>
-        <w:rPr>
-          <w:b/>
-          <w:bCs/>
-        </w:rPr>
-        <w:t xml:space="preserve"> Tracking</w:t>
-      </w:r>
-    </w:p>
-    <w:p>
-      <w:r>
-        <w:rPr>
-          <w:b/>
-          <w:bCs/>
-        </w:rPr>
-        <w:t>Requirement:</w:t>
-      </w:r>
-      <w:r>
-        <w:br/>
-        <w:t>Track and persist scores locally.</w:t>
-      </w:r>
-    </w:p>
-    <w:p>
-      <w:r>
-        <w:rPr>
-          <w:b/>
-          <w:bCs/>
-        </w:rPr>
-        <w:t>Acceptance Criteria:</w:t>
-      </w:r>
-    </w:p>
-    <w:p>
-      <w:pPr>
-        <w:numPr>
-          <w:ilvl w:val="0"/>
-          <w:numId w:val="21"/>
-        </w:numPr>
-      </w:pPr>
-      <w:r>
-        <w:t>Scores update immediately after each valid action</w:t>
-      </w:r>
-    </w:p>
-    <w:p>
-      <w:pPr>
-        <w:numPr>
-          <w:ilvl w:val="0"/>
-          <w:numId w:val="21"/>
-        </w:numPr>
-      </w:pPr>
-      <w:r>
-        <w:t>Scores visible in sticky header</w:t>
-      </w:r>
-    </w:p>
-    <w:p>
-      <w:pPr>
-        <w:numPr>
-          <w:ilvl w:val="0"/>
-          <w:numId w:val="21"/>
-        </w:numPr>
-      </w:pPr>
-      <w:r>
-        <w:t xml:space="preserve">Data persists on refresh via </w:t>
-      </w:r>
-      <w:proofErr w:type="spellStart"/>
-      <w:r>
-        <w:t>localStorage</w:t>
-      </w:r>
-      <w:proofErr w:type="spellEnd"/>
-    </w:p>
-    <w:p>
-      <w:pPr>
-        <w:numPr>
-          <w:ilvl w:val="0"/>
-          <w:numId w:val="21"/>
-        </w:numPr>
-      </w:pPr>
-      <w:r>
-        <w:t>Reset option clears all scores</w:t>
-      </w:r>
-    </w:p>
-    <w:p>
-      <w:r>
-        <w:pict w14:anchorId="24DCA164">
-          <v:rect id="_x0000_i1309" style="width:0;height:1.5pt" o:hralign="center" o:hrstd="t" o:hr="t" fillcolor="#a0a0a0" stroked="f"/>
-        </w:pict>
-      </w:r>
-    </w:p>
-    <w:p>
-      <w:pPr>
-        <w:rPr>
-          <w:b/>
-          <w:bCs/>
-        </w:rPr>
-      </w:pPr>
-      <w:r>
-        <w:rPr>
-          <w:b/>
-          <w:bCs/>
-        </w:rPr>
-        <w:t>6.8 UI/UX (Mobile First)</w:t>
-      </w:r>
-    </w:p>
-    <w:p>
-      <w:r>
-        <w:rPr>
-          <w:b/>
-          <w:bCs/>
-        </w:rPr>
-        <w:t>Requirement:</w:t>
-      </w:r>
-      <w:r>
-        <w:br/>
-        <w:t>Optimize for handheld usage.</w:t>
-      </w:r>
-    </w:p>
-    <w:p>
-      <w:r>
-        <w:rPr>
-          <w:b/>
-          <w:bCs/>
-        </w:rPr>
-        <w:t>Acceptance Criteria:</w:t>
-      </w:r>
-    </w:p>
-    <w:p>
-      <w:pPr>
-        <w:numPr>
-          <w:ilvl w:val="0"/>
-          <w:numId w:val="22"/>
-        </w:numPr>
-      </w:pPr>
-      <w:r>
-        <w:t>Single-column layout</w:t>
-      </w:r>
-    </w:p>
-    <w:p>
-      <w:pPr>
-        <w:numPr>
-          <w:ilvl w:val="0"/>
-          <w:numId w:val="22"/>
-        </w:numPr>
-      </w:pPr>
-      <w:r>
-        <w:t>Buttons ≥ 44px height</w:t>
-      </w:r>
-    </w:p>
-    <w:p>
-      <w:pPr>
-        <w:numPr>
-          <w:ilvl w:val="0"/>
-          <w:numId w:val="22"/>
-        </w:numPr>
-      </w:pPr>
-      <w:r>
-        <w:t>Primary actions reachable via thumb (bottom area)</w:t>
-      </w:r>
-    </w:p>
-    <w:p>
-      <w:pPr>
-        <w:numPr>
-          <w:ilvl w:val="0"/>
-          <w:numId w:val="22"/>
-        </w:numPr>
-      </w:pPr>
-      <w:r>
-        <w:t>Only one main action per screen</w:t>
-      </w:r>
-    </w:p>
-    <w:p>
-      <w:pPr>
-        <w:numPr>
-          <w:ilvl w:val="0"/>
-          <w:numId w:val="22"/>
-        </w:numPr>
-      </w:pPr>
-      <w:r>
-        <w:t>No horizontal scrolling</w:t>
-      </w:r>
-    </w:p>
-    <w:p>
-      <w:pPr>
-        <w:numPr>
-          <w:ilvl w:val="0"/>
-          <w:numId w:val="22"/>
-        </w:numPr>
-      </w:pPr>
-      <w:r>
-        <w:t>Works in portrait mode only</w:t>
-      </w:r>
-    </w:p>
-    <w:p>
-      <w:r>
-        <w:pict w14:anchorId="3F2840A9">
-          <v:rect id="_x0000_i1310" style="width:0;height:1.5pt" o:hralign="center" o:hrstd="t" o:hr="t" fillcolor="#a0a0a0" stroked="f"/>
-        </w:pict>
-      </w:r>
-    </w:p>
-    <w:p>
-      <w:pPr>
-        <w:rPr>
-          <w:b/>
-          <w:bCs/>
-        </w:rPr>
-      </w:pPr>
-      <w:r>
-        <w:rPr>
-          <w:b/>
-          <w:bCs/>
-        </w:rPr>
-        <w:t>6.9 Data Handling</w:t>
-      </w:r>
-    </w:p>
-    <w:p>
-      <w:r>
-        <w:rPr>
-          <w:b/>
-          <w:bCs/>
-        </w:rPr>
-        <w:t>Requirement:</w:t>
-      </w:r>
-      <w:r>
-        <w:br/>
-        <w:t>Use static JSON decks.</w:t>
-      </w:r>
-    </w:p>
-    <w:p>
-      <w:r>
-        <w:rPr>
-          <w:b/>
-          <w:bCs/>
-        </w:rPr>
-        <w:t>Acceptance Criteria:</w:t>
-      </w:r>
-    </w:p>
-    <w:p>
-      <w:pPr>
-        <w:numPr>
-          <w:ilvl w:val="0"/>
-          <w:numId w:val="23"/>
-        </w:numPr>
-      </w:pPr>
-      <w:r>
-        <w:lastRenderedPageBreak/>
-        <w:t>Decks loaded from local JSON files</w:t>
-      </w:r>
-    </w:p>
-    <w:p>
-      <w:pPr>
-        <w:numPr>
-          <w:ilvl w:val="0"/>
-          <w:numId w:val="23"/>
-        </w:numPr>
-      </w:pPr>
-      <w:r>
-        <w:t>No runtime dependency on external APIs</w:t>
-      </w:r>
-    </w:p>
-    <w:p>
-      <w:pPr>
-        <w:numPr>
-          <w:ilvl w:val="0"/>
-          <w:numId w:val="23"/>
-        </w:numPr>
-      </w:pPr>
-      <w:r>
-        <w:t>Shuffle randomness verified (basic uniformity)</w:t>
-      </w:r>
-    </w:p>
-    <w:p>
-      <w:r>
-        <w:pict w14:anchorId="06456A3E">
-          <v:rect id="_x0000_i1311" style="width:0;height:1.5pt" o:hralign="center" o:hrstd="t" o:hr="t" fillcolor="#a0a0a0" stroked="f"/>
-        </w:pict>
-      </w:r>
-    </w:p>
-    <w:p>
-      <w:pPr>
-        <w:rPr>
-          <w:b/>
-          <w:bCs/>
-        </w:rPr>
-      </w:pPr>
-      <w:r>
-        <w:rPr>
-          <w:b/>
-          <w:bCs/>
-        </w:rPr>
-        <w:t>6.10 Deployment</w:t>
-      </w:r>
-    </w:p>
-    <w:p>
-      <w:r>
-        <w:rPr>
-          <w:b/>
-          <w:bCs/>
-        </w:rPr>
-        <w:t>Requirement:</w:t>
-      </w:r>
-      <w:r>
-        <w:br/>
-        <w:t>Host on GitHub Pages.</w:t>
-      </w:r>
-    </w:p>
-    <w:p>
-      <w:r>
-        <w:rPr>
-          <w:b/>
-          <w:bCs/>
-        </w:rPr>
-        <w:t>Acceptance Criteria:</w:t>
-      </w:r>
-    </w:p>
-    <w:p>
-      <w:pPr>
-        <w:numPr>
-          <w:ilvl w:val="0"/>
-          <w:numId w:val="24"/>
-        </w:numPr>
-      </w:pPr>
-      <w:r>
-        <w:t>App accessible via public URL</w:t>
-      </w:r>
-    </w:p>
-    <w:p>
-      <w:pPr>
-        <w:numPr>
-          <w:ilvl w:val="0"/>
-          <w:numId w:val="24"/>
-        </w:numPr>
-      </w:pPr>
-      <w:r>
-        <w:t>No build step required (or optional lightweight build)</w:t>
-      </w:r>
-    </w:p>
-    <w:p>
-      <w:pPr>
-        <w:numPr>
-          <w:ilvl w:val="0"/>
-          <w:numId w:val="24"/>
-        </w:numPr>
-      </w:pPr>
-      <w:r>
-        <w:t>All assets load correctly from static hosting</w:t>
-      </w:r>
-    </w:p>
-    <w:p>
-      <w:r>
-        <w:pict w14:anchorId="30096DA5">
-          <v:rect id="_x0000_i1312" style="width:0;height:1.5pt" o:hralign="center" o:hrstd="t" o:hr="t" fillcolor="#a0a0a0" stroked="f"/>
-        </w:pict>
-      </w:r>
-    </w:p>
-    <w:p>
-      <w:pPr>
-        <w:rPr>
-          <w:b/>
-          <w:bCs/>
-        </w:rPr>
-      </w:pPr>
-      <w:r>
-        <w:rPr>
-          <w:b/>
-          <w:bCs/>
-        </w:rPr>
-        <w:t>7. Non-Functional Requirements</w:t>
-      </w:r>
-    </w:p>
-    <w:p>
-      <w:pPr>
-        <w:numPr>
-          <w:ilvl w:val="0"/>
-          <w:numId w:val="25"/>
-        </w:numPr>
-      </w:pPr>
-      <w:r>
-        <w:t>Works on Chrome, Safari (mobile), Edge</w:t>
-      </w:r>
-    </w:p>
-    <w:p>
-      <w:pPr>
-        <w:numPr>
-          <w:ilvl w:val="0"/>
-          <w:numId w:val="25"/>
-        </w:numPr>
-      </w:pPr>
-      <w:r>
-        <w:t>No console errors in production</w:t>
-      </w:r>
-    </w:p>
-    <w:p>
-      <w:pPr>
-        <w:numPr>
-          <w:ilvl w:val="0"/>
-          <w:numId w:val="25"/>
-        </w:numPr>
-      </w:pPr>
-      <w:r>
-        <w:t>Responsive across common phone sizes</w:t>
-      </w:r>
-    </w:p>
-    <w:p>
-      <w:pPr>
-        <w:numPr>
-          <w:ilvl w:val="0"/>
-          <w:numId w:val="25"/>
-        </w:numPr>
-      </w:pPr>
-      <w:r>
-        <w:t>Accessibility basics:</w:t>
-      </w:r>
-    </w:p>
-    <w:p>
-      <w:pPr>
-        <w:numPr>
-          <w:ilvl w:val="1"/>
-          <w:numId w:val="25"/>
-        </w:numPr>
-      </w:pPr>
-      <w:r>
-        <w:t>Readable font sizes</w:t>
-      </w:r>
-    </w:p>
-    <w:p>
-      <w:pPr>
-        <w:numPr>
-          <w:ilvl w:val="1"/>
-          <w:numId w:val="25"/>
-        </w:numPr>
-      </w:pPr>
-      <w:r>
-        <w:t>Contrast ratio acceptable</w:t>
-      </w:r>
-    </w:p>
-    <w:p>
-      <w:r>
-        <w:pict w14:anchorId="74C0115B">
-          <v:rect id="_x0000_i1313" style="width:0;height:1.5pt" o:hralign="center" o:hrstd="t" o:hr="t" fillcolor="#a0a0a0" stroked="f"/>
-        </w:pict>
-      </w:r>
-    </w:p>
-    <w:p>
-      <w:pPr>
-        <w:rPr>
-          <w:b/>
-          <w:bCs/>
-        </w:rPr>
-      </w:pPr>
-      <w:r>
-        <w:rPr>
-          <w:b/>
-          <w:bCs/>
-        </w:rPr>
-        <w:t>8. Technical Design</w:t>
-      </w:r>
-    </w:p>
-    <w:p>
-      <w:pPr>
-        <w:rPr>
-          <w:b/>
-          <w:bCs/>
-        </w:rPr>
-      </w:pPr>
-      <w:r>
-        <w:rPr>
-          <w:b/>
-          <w:bCs/>
-        </w:rPr>
-        <w:t>8.1 Architecture</w:t>
-      </w:r>
-    </w:p>
-    <w:p>
-      <w:pPr>
-        <w:numPr>
-          <w:ilvl w:val="0"/>
-          <w:numId w:val="26"/>
-        </w:numPr>
-      </w:pPr>
-      <w:r>
-        <w:t>SPA (Single HTML entry)</w:t>
-      </w:r>
-    </w:p>
-    <w:p>
-      <w:pPr>
-        <w:numPr>
-          <w:ilvl w:val="0"/>
-          <w:numId w:val="26"/>
-        </w:numPr>
-      </w:pPr>
-      <w:r>
-        <w:t>Modular JS (no framework required)</w:t>
-      </w:r>
-    </w:p>
-    <w:p>
-      <w:r>
-        <w:pict w14:anchorId="0766B5AA">
-          <v:rect id="_x0000_i1314" style="width:0;height:1.5pt" o:hralign="center" o:hrstd="t" o:hr="t" fillcolor="#a0a0a0" stroked="f"/>
-        </w:pict>
-      </w:r>
-    </w:p>
-    <w:p>
-      <w:pPr>
-        <w:rPr>
-          <w:b/>
-          <w:bCs/>
-        </w:rPr>
-      </w:pPr>
-      <w:r>
-        <w:rPr>
-          <w:b/>
-          <w:bCs/>
-        </w:rPr>
-        <w:t>8.3 State Model (Example)</w:t>
-      </w:r>
-    </w:p>
-    <w:p>
-      <w:r>
-        <w:lastRenderedPageBreak/>
-        <w:t>{</w:t>
-      </w:r>
-    </w:p>
-    <w:p>
-      <w:r>
-        <w:t xml:space="preserve">  players: [],</w:t>
-      </w:r>
-    </w:p>
-    <w:p>
-      <w:r>
-        <w:t xml:space="preserve">  </w:t>
-      </w:r>
-      <w:proofErr w:type="spellStart"/>
-      <w:r>
-        <w:t>currentPlayerIndex</w:t>
-      </w:r>
-      <w:proofErr w:type="spellEnd"/>
-      <w:r>
-        <w:t>: 0,</w:t>
-      </w:r>
-    </w:p>
-    <w:p>
-      <w:r>
-        <w:t xml:space="preserve">  </w:t>
-      </w:r>
-      <w:proofErr w:type="spellStart"/>
-      <w:r>
-        <w:t>turnOrder</w:t>
-      </w:r>
-      <w:proofErr w:type="spellEnd"/>
-      <w:r>
-        <w:t>: [],</w:t>
-      </w:r>
-    </w:p>
-    <w:p>
-      <w:r>
-        <w:t xml:space="preserve">  scores: {},</w:t>
-      </w:r>
-    </w:p>
-    <w:p>
-      <w:r>
-        <w:t xml:space="preserve">  </w:t>
-      </w:r>
-      <w:proofErr w:type="spellStart"/>
-      <w:r>
-        <w:t>selectedCards</w:t>
-      </w:r>
-      <w:proofErr w:type="spellEnd"/>
-      <w:r>
-        <w:t>: [],</w:t>
-      </w:r>
-    </w:p>
-    <w:p>
-      <w:r>
-        <w:t xml:space="preserve">  </w:t>
-      </w:r>
-      <w:proofErr w:type="spellStart"/>
-      <w:r>
-        <w:t>completedSets</w:t>
-      </w:r>
-      <w:proofErr w:type="spellEnd"/>
-      <w:r>
-        <w:t>: {},</w:t>
-      </w:r>
-    </w:p>
-    <w:p>
-      <w:r>
-        <w:t xml:space="preserve">  round: 1,</w:t>
-      </w:r>
-    </w:p>
-    <w:p>
-      <w:r>
-        <w:t xml:space="preserve">  deck: []</w:t>
-      </w:r>
-    </w:p>
-    <w:p>
-      <w:r>
-        <w:t>}</w:t>
-      </w:r>
-    </w:p>
-    <w:p>
-      <w:r>
-        <w:pict w14:anchorId="0A53F9ED">
-          <v:rect id="_x0000_i1315" style="width:0;height:1.5pt" o:hralign="center" o:hrstd="t" o:hr="t" fillcolor="#a0a0a0" stroked="f"/>
-        </w:pict>
-      </w:r>
-    </w:p>
-    <w:p>
-      <w:pPr>
-        <w:rPr>
-          <w:b/>
-          <w:bCs/>
-        </w:rPr>
-      </w:pPr>
-      <w:r>
-        <w:rPr>
-          <w:b/>
-          <w:bCs/>
-        </w:rPr>
-        <w:t>8.4 Core Functions</w:t>
-      </w:r>
-    </w:p>
-    <w:p>
-      <w:pPr>
-        <w:numPr>
-          <w:ilvl w:val="0"/>
-          <w:numId w:val="27"/>
-        </w:numPr>
-      </w:pPr>
-      <w:proofErr w:type="spellStart"/>
-      <w:proofErr w:type="gramStart"/>
-      <w:r>
-        <w:t>initGame</w:t>
-      </w:r>
-      <w:proofErr w:type="spellEnd"/>
-      <w:r>
-        <w:t>(</w:t>
-      </w:r>
-      <w:proofErr w:type="gramEnd"/>
-      <w:r>
-        <w:t>)</w:t>
-      </w:r>
-    </w:p>
-    <w:p>
-      <w:pPr>
-        <w:numPr>
-          <w:ilvl w:val="0"/>
-          <w:numId w:val="27"/>
-        </w:numPr>
-      </w:pPr>
-      <w:proofErr w:type="spellStart"/>
-      <w:proofErr w:type="gramStart"/>
-      <w:r>
-        <w:t>shuffleDeck</w:t>
-      </w:r>
-      <w:proofErr w:type="spellEnd"/>
-      <w:r>
-        <w:t>(</w:t>
-      </w:r>
-      <w:proofErr w:type="gramEnd"/>
-      <w:r>
-        <w:t>)</w:t>
-      </w:r>
-    </w:p>
-    <w:p>
-      <w:pPr>
-        <w:numPr>
-          <w:ilvl w:val="0"/>
-          <w:numId w:val="27"/>
-        </w:numPr>
-      </w:pPr>
-      <w:proofErr w:type="spellStart"/>
-      <w:proofErr w:type="gramStart"/>
-      <w:r>
-        <w:t>drawCard</w:t>
-      </w:r>
-      <w:proofErr w:type="spellEnd"/>
-      <w:r>
-        <w:t>(</w:t>
-      </w:r>
-      <w:proofErr w:type="gramEnd"/>
-      <w:r>
-        <w:t>)</w:t>
-      </w:r>
-    </w:p>
-    <w:p>
-      <w:pPr>
-        <w:numPr>
-          <w:ilvl w:val="0"/>
-          <w:numId w:val="27"/>
-        </w:numPr>
-      </w:pPr>
-      <w:proofErr w:type="spellStart"/>
-      <w:proofErr w:type="gramStart"/>
-      <w:r>
-        <w:t>validateSet</w:t>
-      </w:r>
-      <w:proofErr w:type="spellEnd"/>
-      <w:r>
-        <w:t>(</w:t>
-      </w:r>
-      <w:proofErr w:type="gramEnd"/>
-      <w:r>
-        <w:t>)</w:t>
-      </w:r>
-    </w:p>
-    <w:p>
-      <w:pPr>
-        <w:numPr>
-          <w:ilvl w:val="0"/>
-          <w:numId w:val="27"/>
-        </w:numPr>
-      </w:pPr>
-      <w:proofErr w:type="spellStart"/>
-      <w:proofErr w:type="gramStart"/>
-      <w:r>
-        <w:t>endTurn</w:t>
-      </w:r>
-      <w:proofErr w:type="spellEnd"/>
-      <w:r>
-        <w:t>(</w:t>
-      </w:r>
-      <w:proofErr w:type="gramEnd"/>
-      <w:r>
-        <w:t>)</w:t>
-      </w:r>
-    </w:p>
-    <w:p>
-      <w:pPr>
-        <w:numPr>
-          <w:ilvl w:val="0"/>
-          <w:numId w:val="27"/>
-        </w:numPr>
-      </w:pPr>
-      <w:proofErr w:type="spellStart"/>
-      <w:proofErr w:type="gramStart"/>
-      <w:r>
-        <w:t>nextPlayer</w:t>
-      </w:r>
-      <w:proofErr w:type="spellEnd"/>
-      <w:r>
-        <w:t>(</w:t>
-      </w:r>
-      <w:proofErr w:type="gramEnd"/>
-      <w:r>
-        <w:t>)</w:t>
-      </w:r>
-    </w:p>
-    <w:p>
-      <w:pPr>
-        <w:numPr>
-          <w:ilvl w:val="0"/>
-          <w:numId w:val="27"/>
-        </w:numPr>
-      </w:pPr>
-      <w:proofErr w:type="spellStart"/>
-      <w:proofErr w:type="gramStart"/>
-      <w:r>
-        <w:t>calculateWinner</w:t>
-      </w:r>
-      <w:proofErr w:type="spellEnd"/>
-      <w:r>
-        <w:t>(</w:t>
-      </w:r>
-      <w:proofErr w:type="gramEnd"/>
-      <w:r>
-        <w:t>)</w:t>
-      </w:r>
-    </w:p>
-    <w:p>
-      <w:r>
-        <w:pict w14:anchorId="52A7B14B">
-          <v:rect id="_x0000_i1316" style="width:0;height:1.5pt" o:hralign="center" o:hrstd="t" o:hr="t" fillcolor="#a0a0a0" stroked="f"/>
-        </w:pict>
-      </w:r>
-    </w:p>
-    <w:p>
-      <w:pPr>
-        <w:rPr>
-          <w:b/>
-          <w:bCs/>
-        </w:rPr>
-      </w:pPr>
-      <w:r>
-        <w:rPr>
-          <w:b/>
-          <w:bCs/>
-        </w:rPr>
-        <w:t>9. Future Enhancements (Post-MVP)</w:t>
-      </w:r>
-    </w:p>
-    <w:p>
-      <w:pPr>
-        <w:numPr>
-          <w:ilvl w:val="0"/>
-          <w:numId w:val="28"/>
-        </w:numPr>
-      </w:pPr>
-      <w:r>
-        <w:t>TMDB integration (posters, metadata)</w:t>
-      </w:r>
-    </w:p>
-    <w:p>
-      <w:pPr>
-        <w:numPr>
-          <w:ilvl w:val="0"/>
-          <w:numId w:val="28"/>
-        </w:numPr>
-      </w:pPr>
-      <w:r>
-        <w:t>Sound + haptics</w:t>
-      </w:r>
-    </w:p>
-    <w:p>
-      <w:pPr>
-        <w:numPr>
-          <w:ilvl w:val="0"/>
-          <w:numId w:val="28"/>
-        </w:numPr>
-      </w:pPr>
-      <w:r>
-        <w:t>Shareable results</w:t>
-      </w:r>
-    </w:p>
-    <w:p>
-      <w:pPr>
-        <w:numPr>
-          <w:ilvl w:val="0"/>
-          <w:numId w:val="28"/>
-        </w:numPr>
-      </w:pPr>
-      <w:r>
-        <w:t>Daily challenge (seed-based)</w:t>
-      </w:r>
-    </w:p>
-    <w:p>
-      <w:pPr>
-        <w:numPr>
-          <w:ilvl w:val="0"/>
-          <w:numId w:val="28"/>
-        </w:numPr>
-      </w:pPr>
-      <w:r>
-        <w:t>Secret roles (Guess game)</w:t>
-      </w:r>
-    </w:p>
-    <w:p>
-      <w:pPr>
-        <w:numPr>
-          <w:ilvl w:val="0"/>
-          <w:numId w:val="28"/>
-        </w:numPr>
-      </w:pPr>
-      <w:r>
-        <w:lastRenderedPageBreak/>
-        <w:t>PWA install support</w:t>
-      </w:r>
-    </w:p>
-    <w:p>
-      <w:r>
-        <w:pict w14:anchorId="06496CEE">
-          <v:rect id="_x0000_i1317" style="width:0;height:1.5pt" o:hralign="center" o:hrstd="t" o:hr="t" fillcolor="#a0a0a0" stroked="f"/>
-        </w:pict>
-      </w:r>
-    </w:p>
-    <w:p>
-      <w:pPr>
-        <w:rPr>
-          <w:b/>
-          <w:bCs/>
-        </w:rPr>
-      </w:pPr>
-      <w:r>
-        <w:rPr>
-          <w:b/>
-          <w:bCs/>
-        </w:rPr>
-        <w:t>10. Risks &amp; Mitigations</w:t>
-      </w:r>
-    </w:p>
-    <w:tbl>
-      <w:tblPr>
-        <w:tblW w:w="0" w:type="auto"/>
-        <w:tblCellSpacing w:w="15" w:type="dxa"/>
-        <w:tblCellMar>
-          <w:top w:w="15" w:type="dxa"/>
-          <w:left w:w="15" w:type="dxa"/>
-          <w:bottom w:w="15" w:type="dxa"/>
-          <w:right w:w="15" w:type="dxa"/>
-        </w:tblCellMar>
-        <w:tblLook w:val="04A0" w:firstRow="1" w:lastRow="0" w:firstColumn="1" w:lastColumn="0" w:noHBand="0" w:noVBand="1"/>
-      </w:tblPr>
-      <w:tblGrid>
-        <w:gridCol w:w="2747"/>
-        <w:gridCol w:w="2916"/>
-      </w:tblGrid>
-      <w:tr>
-        <w:trPr>
-          <w:tblHeader/>
-          <w:tblCellSpacing w:w="15" w:type="dxa"/>
-        </w:trPr>
-        <w:tc>
-          <w:tcPr>
-            <w:tcW w:w="0" w:type="auto"/>
-            <w:vAlign w:val="center"/>
-            <w:hideMark/>
-          </w:tcPr>
-          <w:p>
-            <w:pPr>
-              <w:rPr>
-                <w:b/>
-                <w:bCs/>
-              </w:rPr>
-            </w:pPr>
-            <w:r>
-              <w:rPr>
-                <w:b/>
-                <w:bCs/>
-              </w:rPr>
-              <w:t>Risk</w:t>
-            </w:r>
-          </w:p>
-        </w:tc>
-        <w:tc>
-          <w:tcPr>
-            <w:tcW w:w="0" w:type="auto"/>
-            <w:vAlign w:val="center"/>
-            <w:hideMark/>
-          </w:tcPr>
-          <w:p>
-            <w:pPr>
-              <w:rPr>
-                <w:b/>
-                <w:bCs/>
-              </w:rPr>
-            </w:pPr>
-            <w:r>
-              <w:rPr>
-                <w:b/>
-                <w:bCs/>
-              </w:rPr>
-              <w:t>Mitigation</w:t>
-            </w:r>
-          </w:p>
-        </w:tc>
-      </w:tr>
-      <w:tr>
-        <w:trPr>
-          <w:tblCellSpacing w:w="15" w:type="dxa"/>
-        </w:trPr>
-        <w:tc>
-          <w:tcPr>
-            <w:tcW w:w="0" w:type="auto"/>
-            <w:vAlign w:val="center"/>
-            <w:hideMark/>
-          </w:tcPr>
-          <w:p>
-            <w:r>
-              <w:t>UI confusion in group play</w:t>
-            </w:r>
-          </w:p>
-        </w:tc>
-        <w:tc>
-          <w:tcPr>
-            <w:tcW w:w="0" w:type="auto"/>
-            <w:vAlign w:val="center"/>
-            <w:hideMark/>
-          </w:tcPr>
-          <w:p>
-            <w:r>
-              <w:t>Enforce one-action screens</w:t>
-            </w:r>
-          </w:p>
-        </w:tc>
-      </w:tr>
-      <w:tr>
-        <w:trPr>
-          <w:tblCellSpacing w:w="15" w:type="dxa"/>
-        </w:trPr>
-        <w:tc>
-          <w:tcPr>
-            <w:tcW w:w="0" w:type="auto"/>
-            <w:vAlign w:val="center"/>
-            <w:hideMark/>
-          </w:tcPr>
-          <w:p>
-            <w:r>
-              <w:t>Privacy leaks</w:t>
-            </w:r>
-          </w:p>
-        </w:tc>
-        <w:tc>
-          <w:tcPr>
-            <w:tcW w:w="0" w:type="auto"/>
-            <w:vAlign w:val="center"/>
-            <w:hideMark/>
-          </w:tcPr>
-          <w:p>
-            <w:r>
-              <w:t>Mandatory handoff screen</w:t>
-            </w:r>
-          </w:p>
-        </w:tc>
-      </w:tr>
-      <w:tr>
-        <w:trPr>
-          <w:tblCellSpacing w:w="15" w:type="dxa"/>
-        </w:trPr>
-        <w:tc>
-          <w:tcPr>
-            <w:tcW w:w="0" w:type="auto"/>
-            <w:vAlign w:val="center"/>
-            <w:hideMark/>
-          </w:tcPr>
-          <w:p>
-            <w:r>
-              <w:t>Over-engineering</w:t>
-            </w:r>
-          </w:p>
-        </w:tc>
-        <w:tc>
-          <w:tcPr>
-            <w:tcW w:w="0" w:type="auto"/>
-            <w:vAlign w:val="center"/>
-            <w:hideMark/>
-          </w:tcPr>
-          <w:p>
-            <w:r>
-              <w:t>Keep logic minimal</w:t>
-            </w:r>
-          </w:p>
-        </w:tc>
-      </w:tr>
-      <w:tr>
-        <w:trPr>
-          <w:tblCellSpacing w:w="15" w:type="dxa"/>
-        </w:trPr>
-        <w:tc>
-          <w:tcPr>
-            <w:tcW w:w="0" w:type="auto"/>
-            <w:vAlign w:val="center"/>
-            <w:hideMark/>
-          </w:tcPr>
-          <w:p>
-            <w:r>
-              <w:t>API failure (TMDB)</w:t>
-            </w:r>
-          </w:p>
-        </w:tc>
-        <w:tc>
-          <w:tcPr>
-            <w:tcW w:w="0" w:type="auto"/>
-            <w:vAlign w:val="center"/>
-            <w:hideMark/>
-          </w:tcPr>
-          <w:p>
-            <w:r>
-              <w:t>Make fully optional</w:t>
-            </w:r>
-          </w:p>
-        </w:tc>
-      </w:tr>
-    </w:tbl>
-    <w:p>
-      <w:r>
-        <w:pict w14:anchorId="49E4A267">
-          <v:rect id="_x0000_i1318" style="width:0;height:1.5pt" o:hralign="center" o:hrstd="t" o:hr="t" fillcolor="#a0a0a0" stroked="f"/>
-        </w:pict>
-      </w:r>
-    </w:p>
-    <w:p>
-      <w:pPr>
-        <w:rPr>
-          <w:b/>
-          <w:bCs/>
-        </w:rPr>
-      </w:pPr>
-      <w:r>
-        <w:rPr>
-          <w:b/>
-          <w:bCs/>
-        </w:rPr>
-        <w:t>11. Definition of Done</w:t>
-      </w:r>
-    </w:p>
-    <w:p>
-      <w:pPr>
-        <w:numPr>
-          <w:ilvl w:val="0"/>
-          <w:numId w:val="29"/>
-        </w:numPr>
-      </w:pPr>
-      <w:r>
-        <w:t>All acceptance criteria met</w:t>
-      </w:r>
-    </w:p>
-    <w:p>
-      <w:pPr>
-        <w:numPr>
-          <w:ilvl w:val="0"/>
-          <w:numId w:val="29"/>
-        </w:numPr>
-      </w:pPr>
-      <w:r>
-        <w:t xml:space="preserve">Tested with </w:t>
-      </w:r>
-      <w:r>
-        <w:rPr>
-          <w:b/>
-          <w:bCs/>
-        </w:rPr>
-        <w:t>real 3–5 player group scenario</w:t>
-      </w:r>
-    </w:p>
-    <w:p>
-      <w:pPr>
-        <w:numPr>
-          <w:ilvl w:val="0"/>
-          <w:numId w:val="29"/>
-        </w:numPr>
-      </w:pPr>
-      <w:r>
-        <w:t>No critical UX confusion during gameplay</w:t>
-      </w:r>
-    </w:p>
-    <w:p>
-      <w:pPr>
-        <w:numPr>
-          <w:ilvl w:val="0"/>
-          <w:numId w:val="29"/>
-        </w:numPr>
-      </w:pPr>
-      <w:r>
-        <w:t>Deployed and playable via GitHub Pages</w:t>
-      </w:r>
-    </w:p>
-    <w:p/>
+        <w:t>10. Definition of Done</w:t>
+      </w:r>
+    </w:p>
+    <w:p>
+      <w:pPr>
+        <w:ind w:left="360"/>
+      </w:pPr>
+      <w:r>
+        <w:t>• All E2E acceptance criteria covered by Playwright tests (28 passing)</w:t>
+      </w:r>
+    </w:p>
+    <w:p>
+      <w:pPr>
+        <w:ind w:left="360"/>
+      </w:pPr>
+      <w:r>
+        <w:t>• Tested with a real 3–5 player group scenario</w:t>
+      </w:r>
+    </w:p>
+    <w:p>
+      <w:pPr>
+        <w:ind w:left="360"/>
+      </w:pPr>
+      <w:r>
+        <w:t>• No critical UX confusion during gameplay</w:t>
+      </w:r>
+    </w:p>
+    <w:p>
+      <w:pPr>
+        <w:ind w:left="360"/>
+      </w:pPr>
+      <w:r>
+        <w:t>• Deployed and playable via GitHub Pages</w:t>
+      </w:r>
+    </w:p>
+    <w:p>
+      <w:pPr>
+        <w:ind w:left="360"/>
+      </w:pPr>
+      <w:r>
+        <w:t>• Service Worker confirmed caching all assets in DevTools → Application → Cache Storage</w:t>
+      </w:r>
+    </w:p>
+    <w:p>
+      <w:pPr>
+        <w:ind w:left="360"/>
+      </w:pPr>
+      <w:r>
+        <w:t>• ESLint: 0 errors; npm audit: 0 CVEs</w:t>
+      </w:r>
+    </w:p>
     <w:sectPr>
       <w:pgSz w:w="12240" w:h="15840"/>
       <w:pgMar w:top="1440" w:right="1440" w:bottom="1440" w:left="1440" w:header="720" w:footer="720" w:gutter="0"/>

</xml_diff>

<commit_message>
docs: rewrite design doc to reflect current app structure and rules (#3)
Replaces the stale early-MVP spec (Movie Set Builder, Guess the Word)
with the actual shipped product: full How to Play sections for both
Kaun Hai Gabbar? and Picture Abhi Baaki Hai, correct screen flows,
scoring rules, technical design, and testing status.

Also adds scripts/update_docx.py for repeatable docx regeneration.

Co-authored-by: Rishi Joshi <rishihjoshil@gmail.com>
Co-authored-by: Claude Sonnet 4.6 <noreply@anthropic.com>
</commit_message>
<xml_diff>
--- a/BollywoodHungamaGame.docx
+++ b/BollywoodHungamaGame.docx
@@ -4,2622 +4,1101 @@
   <w:body>
     <w:p>
       <w:r>
-        <w:fldChar w:fldCharType="begin"/>
-      </w:r>
-      <w:r>
-        <w:instrText>HYPERLINK "https://github.com/rishihjoshi/BollywoodHungamaGame"</w:instrText>
-      </w:r>
-      <w:r>
-        <w:fldChar w:fldCharType="separate"/>
-      </w:r>
-      <w:proofErr w:type="spellStart"/>
-      <w:r>
         <w:rPr>
-          <w:rStyle w:val="Hyperlink"/>
           <w:b/>
-          <w:bCs/>
+          <w:sz w:val="36"/>
         </w:rPr>
         <w:t>BollywoodHungamaGame</w:t>
       </w:r>
-      <w:proofErr w:type="spellEnd"/>
-      <w:r>
-        <w:fldChar w:fldCharType="end"/>
-      </w:r>
-    </w:p>
-    <w:p>
-      <w:pPr>
+    </w:p>
+    <w:p/>
+    <w:p>
+      <w:r>
         <w:rPr>
           <w:b/>
-          <w:bCs/>
+          <w:sz w:val="28"/>
         </w:rPr>
-      </w:pPr>
+        <w:t>1. Overview</w:t>
+      </w:r>
+    </w:p>
+    <w:p>
+      <w:r>
+        <w:t>BollywoodHungamaGame is a mobile-first Progressive Web App (PWA) that hosts two Bollywood-themed party games on a shared phone. The app is fully static, works offline after first load, and requires no backend, authentication, or build step. It is deployed via GitHub Pages and installable on Android and iOS.</w:t>
+      </w:r>
+    </w:p>
+    <w:p>
+      <w:r>
+        <w:t>Live URL: https://rishihjoshi.github.io/BollywoodHungamaGame</w:t>
+      </w:r>
+    </w:p>
+    <w:p>
+      <w:r>
+        <w:t>Tech stack: Vanilla HTML / CSS / JavaScript, Service Worker (PWA), Playwright E2E test suite. No frameworks, no bundlers.</w:t>
+      </w:r>
+    </w:p>
+    <w:p/>
+    <w:p>
       <w:r>
         <w:rPr>
           <w:b/>
-          <w:bCs/>
+          <w:sz w:val="28"/>
         </w:rPr>
-        <w:t>1. Overview</w:t>
-      </w:r>
-    </w:p>
-    <w:p>
-      <w:r>
-        <w:t>A mobile-first, static web app that enables users to play two Bollywood-themed party games directly in the browser with no login, backend, or install.</w:t>
-      </w:r>
-    </w:p>
-    <w:p>
-      <w:r>
-        <w:t>The app must launch quickly, work offline after initial load, and support smooth gameplay for small groups on a shared device or multiple phones.</w:t>
-      </w:r>
-    </w:p>
-    <w:p>
-      <w:r>
-        <w:pict w14:anchorId="5CEE53E0">
-          <v:rect id="_x0000_i1293" style="width:0;height:1.5pt" o:hralign="center" o:hrstd="t" o:hr="t" fillcolor="#a0a0a0" stroked="f"/>
-        </w:pict>
-      </w:r>
-    </w:p>
-    <w:p>
-      <w:pPr>
+        <w:t>2. App Structure</w:t>
+      </w:r>
+    </w:p>
+    <w:p>
+      <w:r>
+        <w:t>The app presents a home hub with two game cards. Each game is self-contained.</w:t>
+      </w:r>
+    </w:p>
+    <w:p>
+      <w:r>
         <w:rPr>
           <w:b/>
-          <w:bCs/>
+          <w:sz w:val="24"/>
         </w:rPr>
-      </w:pPr>
+        <w:t>2.1 Screens — Kaun Hai Gabbar? (KHG)</w:t>
+      </w:r>
+    </w:p>
+    <w:p>
+      <w:pPr>
+        <w:ind w:left="360"/>
+      </w:pPr>
+      <w:r>
+        <w:t>1. Home Hub — game selection</w:t>
+      </w:r>
+    </w:p>
+    <w:p>
+      <w:pPr>
+        <w:ind w:left="360"/>
+      </w:pPr>
+      <w:r>
+        <w:t>2. Setup — enter player names (3–12), toggle category hint for Dakus</w:t>
+      </w:r>
+    </w:p>
+    <w:p>
+      <w:pPr>
+        <w:ind w:left="360"/>
+      </w:pPr>
+      <w:r>
+        <w:t>3. Role Reveal — hot-seat privacy gate per player; tap to see secret role + word</w:t>
+      </w:r>
+    </w:p>
+    <w:p>
+      <w:pPr>
+        <w:ind w:left="360"/>
+      </w:pPr>
+      <w:r>
+        <w:t>4. Offline Play — players give verbal clues and discuss (no UI interaction needed)</w:t>
+      </w:r>
+    </w:p>
+    <w:p>
+      <w:pPr>
+        <w:ind w:left="360"/>
+      </w:pPr>
+      <w:r>
+        <w:t>5. End Screen — record whether each Daku was caught; auto-calculates winner</w:t>
+      </w:r>
+    </w:p>
+    <w:p>
+      <w:pPr>
+        <w:ind w:left="360"/>
+      </w:pPr>
+      <w:r>
+        <w:t>6. Scores — cumulative session stats (rounds played, Gaon/Daku wins, per-player stats)</w:t>
+      </w:r>
+    </w:p>
+    <w:p>
+      <w:pPr>
+        <w:ind w:left="360"/>
+      </w:pPr>
+      <w:r>
+        <w:t>7. Rules — illustrated How to Play overlay</w:t>
+      </w:r>
+    </w:p>
+    <w:p>
       <w:r>
         <w:rPr>
           <w:b/>
-          <w:bCs/>
+          <w:sz w:val="24"/>
         </w:rPr>
-        <w:t>2. Objectives</w:t>
-      </w:r>
-    </w:p>
-    <w:p>
-      <w:pPr>
-        <w:numPr>
-          <w:ilvl w:val="0"/>
-          <w:numId w:val="4"/>
-        </w:numPr>
-      </w:pPr>
-      <w:r>
-        <w:t xml:space="preserve">Start a game within </w:t>
-      </w:r>
+        <w:t>2.2 Screens — Picture Abhi Baaki Hai (PABH)</w:t>
+      </w:r>
+    </w:p>
+    <w:p>
+      <w:pPr>
+        <w:ind w:left="360"/>
+      </w:pPr>
+      <w:r>
+        <w:t>1. Home Hub — game selection</w:t>
+      </w:r>
+    </w:p>
+    <w:p>
+      <w:pPr>
+        <w:ind w:left="360"/>
+      </w:pPr>
+      <w:r>
+        <w:t>2. Setup — enter player names (3–12), choose round count (3/5/7), choose timer (60/90/120s)</w:t>
+      </w:r>
+    </w:p>
+    <w:p>
+      <w:pPr>
+        <w:ind w:left="360"/>
+      </w:pPr>
+      <w:r>
+        <w:t>3. Combo Screen — pitcher sees their random 4-card combo; cards flip in with stagger animation</w:t>
+      </w:r>
+    </w:p>
+    <w:p>
+      <w:pPr>
+        <w:ind w:left="360"/>
+      </w:pPr>
+      <w:r>
+        <w:t>4. Timer Screen — countdown ring + compact combo reference; pitcher pitches their movie idea</w:t>
+      </w:r>
+    </w:p>
+    <w:p>
+      <w:pPr>
+        <w:ind w:left="360"/>
+      </w:pPr>
+      <w:r>
+        <w:t>5. Vote Screen — all non-pitchers tap to vote for their favourite pitch</w:t>
+      </w:r>
+    </w:p>
+    <w:p>
+      <w:pPr>
+        <w:ind w:left="360"/>
+      </w:pPr>
+      <w:r>
+        <w:t>6. Round Result — winner announced with confetti, standings updated</w:t>
+      </w:r>
+    </w:p>
+    <w:p>
+      <w:pPr>
+        <w:ind w:left="360"/>
+      </w:pPr>
+      <w:r>
+        <w:t>7. Final Screen — champion declared, full scoreboard, play again or return home</w:t>
+      </w:r>
+    </w:p>
+    <w:p/>
+    <w:p>
       <w:r>
         <w:rPr>
           <w:b/>
-          <w:bCs/>
+          <w:sz w:val="28"/>
         </w:rPr>
-        <w:t>≤ 60 seconds</w:t>
-      </w:r>
-      <w:r>
-        <w:t xml:space="preserve"> of opening the link</w:t>
-      </w:r>
-    </w:p>
-    <w:p>
-      <w:pPr>
-        <w:numPr>
-          <w:ilvl w:val="0"/>
-          <w:numId w:val="4"/>
-        </w:numPr>
-      </w:pPr>
-      <w:r>
-        <w:t xml:space="preserve">Deliver </w:t>
-      </w:r>
+        <w:t>3. Objectives</w:t>
+      </w:r>
+    </w:p>
+    <w:p>
+      <w:pPr>
+        <w:ind w:left="360"/>
+      </w:pPr>
+      <w:r>
+        <w:t>• Start a game within 60 seconds of opening the link</w:t>
+      </w:r>
+    </w:p>
+    <w:p>
+      <w:pPr>
+        <w:ind w:left="360"/>
+      </w:pPr>
+      <w:r>
+        <w:t>• Works offline after first load (Service Worker caching)</w:t>
+      </w:r>
+    </w:p>
+    <w:p>
+      <w:pPr>
+        <w:ind w:left="360"/>
+      </w:pPr>
+      <w:r>
+        <w:t>• Privacy between turns on a shared device (privacy gate screens)</w:t>
+      </w:r>
+    </w:p>
+    <w:p>
+      <w:pPr>
+        <w:ind w:left="360"/>
+      </w:pPr>
+      <w:r>
+        <w:t>• No backend, no accounts, no runtime dependencies</w:t>
+      </w:r>
+    </w:p>
+    <w:p>
+      <w:pPr>
+        <w:ind w:left="360"/>
+      </w:pPr>
+      <w:r>
+        <w:t>• Installable as a PWA on Android and iOS</w:t>
+      </w:r>
+    </w:p>
+    <w:p>
+      <w:pPr>
+        <w:ind w:left="360"/>
+      </w:pPr>
+      <w:r>
+        <w:t>• Supports 3–12 players per game</w:t>
+      </w:r>
+    </w:p>
+    <w:p/>
+    <w:p>
       <w:r>
         <w:rPr>
           <w:b/>
-          <w:bCs/>
+          <w:sz w:val="28"/>
         </w:rPr>
-        <w:t>frictionless, tap-based gameplay</w:t>
-      </w:r>
-    </w:p>
-    <w:p>
-      <w:pPr>
-        <w:numPr>
-          <w:ilvl w:val="0"/>
-          <w:numId w:val="4"/>
-        </w:numPr>
-      </w:pPr>
-      <w:r>
-        <w:t xml:space="preserve">Ensure </w:t>
-      </w:r>
+        <w:t>4. Non-Goals</w:t>
+      </w:r>
+    </w:p>
+    <w:p>
+      <w:pPr>
+        <w:ind w:left="360"/>
+      </w:pPr>
+      <w:r>
+        <w:t>• No authentication or user accounts</w:t>
+      </w:r>
+    </w:p>
+    <w:p>
+      <w:pPr>
+        <w:ind w:left="360"/>
+      </w:pPr>
+      <w:r>
+        <w:t>• No real-time multiplayer sync or networking</w:t>
+      </w:r>
+    </w:p>
+    <w:p>
+      <w:pPr>
+        <w:ind w:left="360"/>
+      </w:pPr>
+      <w:r>
+        <w:t>• No backend, database, or server-side logic</w:t>
+      </w:r>
+    </w:p>
+    <w:p>
+      <w:pPr>
+        <w:ind w:left="360"/>
+      </w:pPr>
+      <w:r>
+        <w:t>• No payment or monetisation layer</w:t>
+      </w:r>
+    </w:p>
+    <w:p/>
+    <w:p>
       <w:r>
         <w:rPr>
           <w:b/>
-          <w:bCs/>
+          <w:sz w:val="28"/>
         </w:rPr>
-        <w:t>fair play on shared devices</w:t>
-      </w:r>
-      <w:r>
-        <w:t xml:space="preserve"> (privacy between turns)</w:t>
-      </w:r>
-    </w:p>
-    <w:p>
-      <w:pPr>
-        <w:numPr>
-          <w:ilvl w:val="0"/>
-          <w:numId w:val="4"/>
-        </w:numPr>
-      </w:pPr>
-      <w:r>
-        <w:t xml:space="preserve">Keep architecture </w:t>
-      </w:r>
+        <w:t>5. How to Play — Kaun Hai Gabbar?</w:t>
+      </w:r>
+    </w:p>
+    <w:p>
       <w:r>
         <w:rPr>
           <w:b/>
-          <w:bCs/>
+          <w:sz w:val="24"/>
         </w:rPr>
-        <w:t>fully static and maintainable</w:t>
-      </w:r>
-    </w:p>
-    <w:p>
-      <w:r>
-        <w:pict w14:anchorId="3E14ADB7">
-          <v:rect id="_x0000_i1294" style="width:0;height:1.5pt" o:hralign="center" o:hrstd="t" o:hr="t" fillcolor="#a0a0a0" stroked="f"/>
-        </w:pict>
-      </w:r>
-    </w:p>
-    <w:p>
-      <w:pPr>
+        <w:t>5.1 Overview</w:t>
+      </w:r>
+    </w:p>
+    <w:p>
+      <w:r>
+        <w:t>Kaun Hai Gabbar? is a Sholay-themed social deduction and word-guessing party game. One or more players are secretly assigned as Daku (Gabbar's gang). The rest are Gaon (villagers) who know the secret Bollywood word. Dakus must bluff their way through without knowing the word. Gaon players must identify and catch all the Dakus.</w:t>
+      </w:r>
+    </w:p>
+    <w:p>
+      <w:r>
         <w:rPr>
           <w:b/>
-          <w:bCs/>
+          <w:sz w:val="24"/>
         </w:rPr>
-      </w:pPr>
+        <w:t>5.2 Player Count &amp; Daku Distribution</w:t>
+      </w:r>
+    </w:p>
+    <w:p>
+      <w:pPr>
+        <w:ind w:left="360"/>
+      </w:pPr>
+      <w:r>
+        <w:t>• 3–5 players → 1 Daku (Gabbar)</w:t>
+      </w:r>
+    </w:p>
+    <w:p>
+      <w:pPr>
+        <w:ind w:left="360"/>
+      </w:pPr>
+      <w:r>
+        <w:t>• 6–8 players → 2 Dakus (Gabbar + Sambha)</w:t>
+      </w:r>
+    </w:p>
+    <w:p>
+      <w:pPr>
+        <w:ind w:left="360"/>
+      </w:pPr>
+      <w:r>
+        <w:t>• 9–12 players → 3 Dakus (Gabbar + Sambha + Kaalia)</w:t>
+      </w:r>
+    </w:p>
+    <w:p>
       <w:r>
         <w:rPr>
           <w:b/>
-          <w:bCs/>
+          <w:sz w:val="24"/>
         </w:rPr>
-        <w:t>3. Non-Goals (MVP)</w:t>
-      </w:r>
-    </w:p>
-    <w:p>
-      <w:pPr>
-        <w:numPr>
-          <w:ilvl w:val="0"/>
-          <w:numId w:val="5"/>
-        </w:numPr>
-      </w:pPr>
-      <w:r>
-        <w:t>No authentication or user accounts</w:t>
-      </w:r>
-    </w:p>
-    <w:p>
-      <w:pPr>
-        <w:numPr>
-          <w:ilvl w:val="0"/>
-          <w:numId w:val="5"/>
-        </w:numPr>
-      </w:pPr>
-      <w:r>
-        <w:t>No real-time multiplayer sync</w:t>
-      </w:r>
-    </w:p>
-    <w:p>
-      <w:pPr>
-        <w:numPr>
-          <w:ilvl w:val="0"/>
-          <w:numId w:val="5"/>
-        </w:numPr>
-      </w:pPr>
-      <w:r>
-        <w:t>No backend or database</w:t>
-      </w:r>
-    </w:p>
-    <w:p>
-      <w:pPr>
-        <w:numPr>
-          <w:ilvl w:val="0"/>
-          <w:numId w:val="5"/>
-        </w:numPr>
-      </w:pPr>
-      <w:r>
-        <w:t>No advanced AI/game logic</w:t>
-      </w:r>
-    </w:p>
-    <w:p>
-      <w:r>
-        <w:pict w14:anchorId="3A590A31">
-          <v:rect id="_x0000_i1295" style="width:0;height:1.5pt" o:hralign="center" o:hrstd="t" o:hr="t" fillcolor="#a0a0a0" stroked="f"/>
-        </w:pict>
-      </w:r>
-    </w:p>
-    <w:p>
-      <w:pPr>
+        <w:t>5.3 Characters</w:t>
+      </w:r>
+    </w:p>
+    <w:p>
+      <w:r>
+        <w:t>Daku team (randomly assigned to Daku players):</w:t>
+      </w:r>
+    </w:p>
+    <w:p>
+      <w:pPr>
+        <w:ind w:left="720"/>
+      </w:pPr>
+      <w:r>
+        <w:t>• Gabbar 💀 — "Kitne aadmi the?"</w:t>
+      </w:r>
+    </w:p>
+    <w:p>
+      <w:pPr>
+        <w:ind w:left="720"/>
+      </w:pPr>
+      <w:r>
+        <w:t>• Sambha 🔫 — "Poore pachaas hazaar!"</w:t>
+      </w:r>
+    </w:p>
+    <w:p>
+      <w:pPr>
+        <w:ind w:left="720"/>
+      </w:pPr>
+      <w:r>
+        <w:t>• Kaalia ⚔️ — Gabbar's loyal foot soldier</w:t>
+      </w:r>
+    </w:p>
+    <w:p>
+      <w:r>
+        <w:t>Gaon team (randomly assigned from 14 characters including Veeru, Jay, Thakur, Basanti, and more).</w:t>
+      </w:r>
+    </w:p>
+    <w:p>
+      <w:r>
         <w:rPr>
           <w:b/>
-          <w:bCs/>
+          <w:sz w:val="24"/>
         </w:rPr>
-      </w:pPr>
+        <w:t>5.4 Word Categories</w:t>
+      </w:r>
+    </w:p>
+    <w:p>
+      <w:pPr>
+        <w:ind w:left="360"/>
+      </w:pPr>
+      <w:r>
+        <w:t>• Film Title</w:t>
+      </w:r>
+    </w:p>
+    <w:p>
+      <w:pPr>
+        <w:ind w:left="360"/>
+      </w:pPr>
+      <w:r>
+        <w:t>• Famous Dialogue</w:t>
+      </w:r>
+    </w:p>
+    <w:p>
+      <w:pPr>
+        <w:ind w:left="360"/>
+      </w:pPr>
+      <w:r>
+        <w:t>• Celebrity</w:t>
+      </w:r>
+    </w:p>
+    <w:p>
+      <w:pPr>
+        <w:ind w:left="360"/>
+      </w:pPr>
+      <w:r>
+        <w:t>• Song</w:t>
+      </w:r>
+    </w:p>
+    <w:p>
+      <w:pPr>
+        <w:ind w:left="360"/>
+      </w:pPr>
+      <w:r>
+        <w:t>• Character</w:t>
+      </w:r>
+    </w:p>
+    <w:p>
       <w:r>
         <w:rPr>
           <w:b/>
-          <w:bCs/>
+          <w:sz w:val="24"/>
         </w:rPr>
-        <w:t>4. Game Modes</w:t>
-      </w:r>
-    </w:p>
-    <w:p>
-      <w:pPr>
+        <w:t>5.5 Game Flow — Step by Step</w:t>
+      </w:r>
+    </w:p>
+    <w:p>
+      <w:pPr>
+        <w:ind w:left="360"/>
+      </w:pPr>
+      <w:r>
+        <w:t>1. SETUP — Enter player names (min 3, max 12). Optional: toggle whether Dakus see the category hint (on by default). Tap "Start Game".</w:t>
+      </w:r>
+    </w:p>
+    <w:p>
+      <w:pPr>
+        <w:ind w:left="360"/>
+      </w:pPr>
+      <w:r>
+        <w:t>2. ROLE REVEAL — The phone is passed to each player in turn. Each player sees a privacy gate showing only their name. They tap "Reveal My Role" alone (no one else watching). Their secret role card flips in showing: team (DAKU/GAON), character name + flavour quote, and — for Gaon players — the full secret word, hint, and image. Daku players see only the category (e.g. "Film Title") and a reminder to bluff. Tap "Done" to lock the card and pass to the next player.</w:t>
+      </w:r>
+    </w:p>
+    <w:p>
+      <w:pPr>
+        <w:ind w:left="360"/>
+      </w:pPr>
+      <w:r>
+        <w:t>3. OFFLINE PLAY — All players have seen their roles. Players take turns giving exactly one verbal clue about the secret word. Dakus must give a plausible clue without knowing the word. Players discuss and debate who the Dakus are. No app interaction needed during this phase.</w:t>
+      </w:r>
+    </w:p>
+    <w:p>
+      <w:pPr>
+        <w:ind w:left="360"/>
+      </w:pPr>
+      <w:r>
+        <w:t>4. END SCREEN — Tap "Done Playing". The secret word and all Daku identities are revealed. For each Daku, the group decides: was this player caught? Tap YES or NO. Results auto-calculate when all Dakus are recorded.</w:t>
+      </w:r>
+    </w:p>
+    <w:p>
+      <w:pPr>
+        <w:ind w:left="360"/>
+      </w:pPr>
+      <w:r>
+        <w:t>5. WIN CONDITION — Gaon wins if ALL Dakus were identified. Daku wins if even one Daku escaped detection. Confetti fires on Gaon victory.</w:t>
+      </w:r>
+    </w:p>
+    <w:p>
+      <w:pPr>
+        <w:ind w:left="360"/>
+      </w:pPr>
+      <w:r>
+        <w:t>6. PLAY AGAIN — Tap "Play Again" to keep the same players, re-shuffle roles, and pick a new word. Scores accumulate across rounds.</w:t>
+      </w:r>
+    </w:p>
+    <w:p>
+      <w:r>
         <w:rPr>
           <w:b/>
-          <w:bCs/>
+          <w:sz w:val="24"/>
         </w:rPr>
-      </w:pPr>
+        <w:t>5.6 Scoring</w:t>
+      </w:r>
+    </w:p>
+    <w:p>
+      <w:r>
+        <w:t>Lifetime stats stored in localStorage (persist across sessions):</w:t>
+      </w:r>
+    </w:p>
+    <w:p>
+      <w:pPr>
+        <w:ind w:left="360"/>
+      </w:pPr>
+      <w:r>
+        <w:t>• Total rounds played</w:t>
+      </w:r>
+    </w:p>
+    <w:p>
+      <w:pPr>
+        <w:ind w:left="360"/>
+      </w:pPr>
+      <w:r>
+        <w:t>• Gaon wins / Daku wins</w:t>
+      </w:r>
+    </w:p>
+    <w:p>
+      <w:pPr>
+        <w:ind w:left="360"/>
+      </w:pPr>
+      <w:r>
+        <w:t>• Per player: times assigned as Gabbar, times caught as Daku</w:t>
+      </w:r>
+    </w:p>
+    <w:p/>
+    <w:p>
       <w:r>
         <w:rPr>
           <w:b/>
-          <w:bCs/>
+          <w:sz w:val="28"/>
         </w:rPr>
-        <w:t>4.1 Movie Set Builder</w:t>
-      </w:r>
-    </w:p>
-    <w:p>
-      <w:r>
-        <w:t>Players form sets using:</w:t>
-      </w:r>
-    </w:p>
-    <w:p>
-      <w:pPr>
-        <w:numPr>
-          <w:ilvl w:val="0"/>
-          <w:numId w:val="6"/>
-        </w:numPr>
-      </w:pPr>
-      <w:r>
-        <w:t>1 Location</w:t>
-      </w:r>
-    </w:p>
-    <w:p>
-      <w:pPr>
-        <w:numPr>
-          <w:ilvl w:val="0"/>
-          <w:numId w:val="6"/>
-        </w:numPr>
-      </w:pPr>
-      <w:r>
-        <w:t>1 Plot</w:t>
-      </w:r>
-    </w:p>
-    <w:p>
-      <w:pPr>
-        <w:numPr>
-          <w:ilvl w:val="0"/>
-          <w:numId w:val="6"/>
-        </w:numPr>
-      </w:pPr>
-      <w:r>
-        <w:t>1 Celeb</w:t>
+        <w:t>6. How to Play — Picture Abhi Baaki Hai</w:t>
       </w:r>
     </w:p>
     <w:p>
       <w:r>
         <w:rPr>
           <w:b/>
-          <w:bCs/>
+          <w:sz w:val="24"/>
         </w:rPr>
-        <w:t>Rules:</w:t>
-      </w:r>
-    </w:p>
-    <w:p>
-      <w:pPr>
-        <w:numPr>
-          <w:ilvl w:val="0"/>
-          <w:numId w:val="7"/>
-        </w:numPr>
-      </w:pPr>
-      <w:r>
-        <w:t>Each card has a star value</w:t>
-      </w:r>
-    </w:p>
-    <w:p>
-      <w:pPr>
-        <w:numPr>
-          <w:ilvl w:val="0"/>
-          <w:numId w:val="7"/>
-        </w:numPr>
-      </w:pPr>
-      <w:r>
-        <w:lastRenderedPageBreak/>
-        <w:t>Wild cards = 0 stars</w:t>
-      </w:r>
-    </w:p>
-    <w:p>
-      <w:pPr>
-        <w:numPr>
-          <w:ilvl w:val="0"/>
-          <w:numId w:val="7"/>
-        </w:numPr>
-      </w:pPr>
-      <w:r>
-        <w:t>Scene Change refreshes center row</w:t>
+        <w:t>6.1 Overview</w:t>
+      </w:r>
+    </w:p>
+    <w:p>
+      <w:r>
+        <w:t>Picture Abhi Baaki Hai is a Bollywood party pitching game. Each round one player is the Pitcher — they get a random combo of Actor + Location + Genre + Wildcard and must improvise a Bollywood movie pitch using all four elements. Everyone else votes for the best pitch. Points go to the most-voted pitcher.</w:t>
       </w:r>
     </w:p>
     <w:p>
       <w:r>
         <w:rPr>
           <w:b/>
-          <w:bCs/>
+          <w:sz w:val="24"/>
         </w:rPr>
-        <w:t>Win Condition:</w:t>
-      </w:r>
-    </w:p>
-    <w:p>
-      <w:pPr>
-        <w:numPr>
-          <w:ilvl w:val="0"/>
-          <w:numId w:val="8"/>
-        </w:numPr>
-      </w:pPr>
-      <w:r>
-        <w:t>First to 4 valid sets triggers end</w:t>
-      </w:r>
-    </w:p>
-    <w:p>
-      <w:pPr>
-        <w:numPr>
-          <w:ilvl w:val="0"/>
-          <w:numId w:val="8"/>
-        </w:numPr>
-      </w:pPr>
-      <w:r>
-        <w:t xml:space="preserve">Highest total stars </w:t>
-      </w:r>
-      <w:proofErr w:type="gramStart"/>
-      <w:r>
-        <w:t>wins</w:t>
-      </w:r>
-      <w:proofErr w:type="gramEnd"/>
-    </w:p>
-    <w:p>
-      <w:r>
-        <w:pict w14:anchorId="04E8C2EF">
-          <v:rect id="_x0000_i1296" style="width:0;height:1.5pt" o:hralign="center" o:hrstd="t" o:hr="t" fillcolor="#a0a0a0" stroked="f"/>
-        </w:pict>
-      </w:r>
-    </w:p>
-    <w:p>
-      <w:pPr>
+        <w:t>6.2 Player Count &amp; Setup Options</w:t>
+      </w:r>
+    </w:p>
+    <w:p>
+      <w:pPr>
+        <w:ind w:left="360"/>
+      </w:pPr>
+      <w:r>
+        <w:t>• 3–12 players</w:t>
+      </w:r>
+    </w:p>
+    <w:p>
+      <w:pPr>
+        <w:ind w:left="360"/>
+      </w:pPr>
+      <w:r>
+        <w:t>• Round count: 3, 5 (default), or 7 rounds</w:t>
+      </w:r>
+    </w:p>
+    <w:p>
+      <w:pPr>
+        <w:ind w:left="360"/>
+      </w:pPr>
+      <w:r>
+        <w:t>• Pitch timer: 60s (Fast &amp; chaotic), 90s (Sweet spot — Recommended), 120s (Full filmi drama)</w:t>
+      </w:r>
+    </w:p>
+    <w:p>
+      <w:r>
         <w:rPr>
           <w:b/>
-          <w:bCs/>
+          <w:sz w:val="24"/>
         </w:rPr>
-      </w:pPr>
+        <w:t>6.3 The Combo</w:t>
+      </w:r>
+    </w:p>
+    <w:p>
+      <w:r>
+        <w:t>Each round the pitcher draws a 4-card combo:</w:t>
+      </w:r>
+    </w:p>
+    <w:p>
+      <w:pPr>
+        <w:ind w:left="360"/>
+      </w:pPr>
+      <w:r>
+        <w:t>• ACTOR 🎬 — a Bollywood actor name (40-entry pool, no repeats until exhausted)</w:t>
+      </w:r>
+    </w:p>
+    <w:p>
+      <w:pPr>
+        <w:ind w:left="360"/>
+      </w:pPr>
+      <w:r>
+        <w:t>• LOCATION 📍 — a setting or place (40-entry pool)</w:t>
+      </w:r>
+    </w:p>
+    <w:p>
+      <w:pPr>
+        <w:ind w:left="360"/>
+      </w:pPr>
+      <w:r>
+        <w:t>• GENRE 🎭 — a film genre (20-entry pool)</w:t>
+      </w:r>
+    </w:p>
+    <w:p>
+      <w:pPr>
+        <w:ind w:left="360"/>
+      </w:pPr>
+      <w:r>
+        <w:t>• WILDCARD ⚡ — a twist, dialogue, decade, or co-star constraint (40-entry pool)</w:t>
+      </w:r>
+    </w:p>
+    <w:p>
+      <w:r>
+        <w:t>Cards are drawn without replacement; when a pool is exhausted it resets and reshuffles.</w:t>
+      </w:r>
+    </w:p>
+    <w:p>
       <w:r>
         <w:rPr>
           <w:b/>
-          <w:bCs/>
+          <w:sz w:val="24"/>
         </w:rPr>
-        <w:t>4.2 Guess the Word (MVP Lite)</w:t>
-      </w:r>
-    </w:p>
-    <w:p>
-      <w:pPr>
-        <w:numPr>
-          <w:ilvl w:val="0"/>
-          <w:numId w:val="9"/>
-        </w:numPr>
-      </w:pPr>
-      <w:r>
-        <w:t>One-word clue gameplay</w:t>
-      </w:r>
-    </w:p>
-    <w:p>
-      <w:pPr>
-        <w:numPr>
-          <w:ilvl w:val="0"/>
-          <w:numId w:val="9"/>
-        </w:numPr>
-      </w:pPr>
-      <w:r>
-        <w:t>Turn-based</w:t>
-      </w:r>
-    </w:p>
-    <w:p>
-      <w:pPr>
-        <w:numPr>
-          <w:ilvl w:val="0"/>
-          <w:numId w:val="9"/>
-        </w:numPr>
-      </w:pPr>
-      <w:r>
-        <w:t>Optional team scoring (basic)</w:t>
+        <w:t>6.4 Game Flow — Step by Step</w:t>
+      </w:r>
+    </w:p>
+    <w:p>
+      <w:pPr>
+        <w:ind w:left="360"/>
+      </w:pPr>
+      <w:r>
+        <w:t>1. SETUP — Enter player names, choose rounds and timer. Tap "Start Game".</w:t>
+      </w:r>
+    </w:p>
+    <w:p>
+      <w:pPr>
+        <w:ind w:left="360"/>
+      </w:pPr>
+      <w:r>
+        <w:t>2. COMBO SCREEN — The current pitcher's name is shown. Four cards flip in one by one with a stagger animation, revealing the combo. The Wildcard card has a special glowing border to mark it. The pitcher studies the combo. Tap "Start Pitching →" when ready.</w:t>
+      </w:r>
+    </w:p>
+    <w:p>
+      <w:pPr>
+        <w:ind w:left="360"/>
+      </w:pPr>
+      <w:r>
+        <w:t>3. TIMER SCREEN — A circular countdown ring starts. The compact combo is shown at the top for reference. The ring turns orange below 50% time and red + pulsing below 20%. The pitcher improvises their Bollywood movie pitch out loud — character, story, drama, songs, all of it. When time runs out the app auto-advances to the vote screen. Pitcher can also tap "Time's Up" to end early.</w:t>
+      </w:r>
+    </w:p>
+    <w:p>
+      <w:pPr>
+        <w:ind w:left="360"/>
+      </w:pPr>
+      <w:r>
+        <w:t>4. VOTE SCREEN — Each non-pitcher player taps their vote for the best pitch. Vote category rotates each round (Best Overall Pitch, Most Absurd Premise, Would Actually Watch, Funniest Pitch, Biggest Blockbuster, Crowd Favourite). When all eligible voters have voted, the app auto-advances.</w:t>
+      </w:r>
+    </w:p>
+    <w:p>
+      <w:pPr>
+        <w:ind w:left="360"/>
+      </w:pPr>
+      <w:r>
+        <w:t>5. ROUND RESULT — The round winner is announced with confetti. Standings update immediately. Tap "Next Round →" to continue.</w:t>
+      </w:r>
+    </w:p>
+    <w:p>
+      <w:pPr>
+        <w:ind w:left="360"/>
+      </w:pPr>
+      <w:r>
+        <w:t>6. FINAL SCREEN — After all rounds, the champion is declared with a random Bollywood subtitle. Full scoreboard is shown. Tap "Play Again" to restart with the same players, or "Back to Hungama" to return to the home hub.</w:t>
       </w:r>
     </w:p>
     <w:p>
       <w:r>
         <w:rPr>
           <w:b/>
-          <w:bCs/>
+          <w:sz w:val="24"/>
         </w:rPr>
-        <w:t>Deferred:</w:t>
-      </w:r>
-    </w:p>
-    <w:p>
-      <w:pPr>
-        <w:numPr>
-          <w:ilvl w:val="0"/>
-          <w:numId w:val="10"/>
-        </w:numPr>
-      </w:pPr>
-      <w:r>
-        <w:t>Secret roles</w:t>
-      </w:r>
-    </w:p>
-    <w:p>
-      <w:pPr>
-        <w:numPr>
-          <w:ilvl w:val="0"/>
-          <w:numId w:val="10"/>
-        </w:numPr>
-      </w:pPr>
-      <w:r>
-        <w:t>Bluffing mechanics</w:t>
-      </w:r>
-    </w:p>
-    <w:p>
-      <w:r>
-        <w:pict w14:anchorId="708B0916">
-          <v:rect id="_x0000_i1297" style="width:0;height:1.5pt" o:hralign="center" o:hrstd="t" o:hr="t" fillcolor="#a0a0a0" stroked="f"/>
-        </w:pict>
-      </w:r>
-    </w:p>
-    <w:p>
-      <w:pPr>
+        <w:t>6.5 Scoring</w:t>
+      </w:r>
+    </w:p>
+    <w:p>
+      <w:pPr>
+        <w:ind w:left="360"/>
+      </w:pPr>
+      <w:r>
+        <w:t>• Round winner gets points equal to votes received (e.g. 3 votes = +3 points)</w:t>
+      </w:r>
+    </w:p>
+    <w:p>
+      <w:pPr>
+        <w:ind w:left="360"/>
+      </w:pPr>
+      <w:r>
+        <w:t>• In a tie: all tied players get +1 point each</w:t>
+      </w:r>
+    </w:p>
+    <w:p>
+      <w:pPr>
+        <w:ind w:left="360"/>
+      </w:pPr>
+      <w:r>
+        <w:t>• If nobody voted: no points awarded that round</w:t>
+      </w:r>
+    </w:p>
+    <w:p>
+      <w:pPr>
+        <w:ind w:left="360"/>
+      </w:pPr>
+      <w:r>
+        <w:t>• Scores are stored in sessionStorage — they reset when the browser session ends</w:t>
+      </w:r>
+    </w:p>
+    <w:p>
+      <w:r>
         <w:rPr>
           <w:b/>
-          <w:bCs/>
+          <w:sz w:val="24"/>
         </w:rPr>
-      </w:pPr>
+        <w:t>6.6 Pitcher Order</w:t>
+      </w:r>
+    </w:p>
+    <w:p>
+      <w:r>
+        <w:t>Players are assigned as pitcher in a shuffled random order at game start. The order cycles through all players; once everyone has pitched, the order reshuffles for a new cycle.</w:t>
+      </w:r>
+    </w:p>
+    <w:p/>
+    <w:p>
       <w:r>
         <w:rPr>
           <w:b/>
-          <w:bCs/>
+          <w:sz w:val="28"/>
         </w:rPr>
-        <w:t>5. Core Features</w:t>
-      </w:r>
-    </w:p>
-    <w:p>
-      <w:pPr>
+        <w:t>7. Technical Design</w:t>
+      </w:r>
+    </w:p>
+    <w:p>
+      <w:r>
         <w:rPr>
           <w:b/>
-          <w:bCs/>
+          <w:sz w:val="24"/>
         </w:rPr>
-      </w:pPr>
+        <w:t>7.1 Architecture</w:t>
+      </w:r>
+    </w:p>
+    <w:p>
+      <w:pPr>
+        <w:ind w:left="360"/>
+      </w:pPr>
+      <w:r>
+        <w:t>• Static PWA: single index.html, styles.css, app.js, pabh.js, pabh.css</w:t>
+      </w:r>
+    </w:p>
+    <w:p>
+      <w:pPr>
+        <w:ind w:left="360"/>
+      </w:pPr>
+      <w:r>
+        <w:t>• No framework, no bundler, no build step</w:t>
+      </w:r>
+    </w:p>
+    <w:p>
+      <w:pPr>
+        <w:ind w:left="360"/>
+      </w:pPr>
+      <w:r>
+        <w:t>• Service Worker (sw.js) caches all assets for offline use</w:t>
+      </w:r>
+    </w:p>
+    <w:p>
+      <w:pPr>
+        <w:ind w:left="360"/>
+      </w:pPr>
+      <w:r>
+        <w:t>• Hosted on GitHub Pages — zero infrastructure</w:t>
+      </w:r>
+    </w:p>
+    <w:p>
       <w:r>
         <w:rPr>
           <w:b/>
-          <w:bCs/>
+          <w:sz w:val="24"/>
         </w:rPr>
-        <w:t>5.1 Navigation / Screens</w:t>
-      </w:r>
-    </w:p>
-    <w:p>
-      <w:pPr>
-        <w:numPr>
-          <w:ilvl w:val="0"/>
-          <w:numId w:val="11"/>
-        </w:numPr>
-      </w:pPr>
-      <w:r>
-        <w:t>Start Screen</w:t>
-      </w:r>
-    </w:p>
-    <w:p>
-      <w:pPr>
-        <w:numPr>
-          <w:ilvl w:val="0"/>
-          <w:numId w:val="11"/>
-        </w:numPr>
-      </w:pPr>
-      <w:r>
-        <w:t>Game Selection</w:t>
-      </w:r>
-    </w:p>
-    <w:p>
-      <w:pPr>
-        <w:numPr>
-          <w:ilvl w:val="0"/>
-          <w:numId w:val="11"/>
-        </w:numPr>
-      </w:pPr>
-      <w:r>
-        <w:t>Rules Overlay</w:t>
-      </w:r>
-    </w:p>
-    <w:p>
-      <w:pPr>
-        <w:numPr>
-          <w:ilvl w:val="0"/>
-          <w:numId w:val="11"/>
-        </w:numPr>
-      </w:pPr>
-      <w:r>
-        <w:t>Gameplay Screen</w:t>
-      </w:r>
-    </w:p>
-    <w:p>
-      <w:pPr>
-        <w:numPr>
-          <w:ilvl w:val="0"/>
-          <w:numId w:val="11"/>
-        </w:numPr>
-      </w:pPr>
-      <w:r>
-        <w:t>Turn Handoff Screen (critical)</w:t>
-      </w:r>
-    </w:p>
-    <w:p>
-      <w:pPr>
-        <w:numPr>
-          <w:ilvl w:val="0"/>
-          <w:numId w:val="11"/>
-        </w:numPr>
-      </w:pPr>
-      <w:r>
-        <w:t>End Game Screen</w:t>
-      </w:r>
-    </w:p>
-    <w:p>
-      <w:r>
-        <w:pict w14:anchorId="20E88F06">
-          <v:rect id="_x0000_i1298" style="width:0;height:1.5pt" o:hralign="center" o:hrstd="t" o:hr="t" fillcolor="#a0a0a0" stroked="f"/>
-        </w:pict>
-      </w:r>
-    </w:p>
-    <w:p>
-      <w:pPr>
+        <w:t>7.2 Data Files</w:t>
+      </w:r>
+    </w:p>
+    <w:p>
+      <w:pPr>
+        <w:ind w:left="360"/>
+      </w:pPr>
+      <w:r>
+        <w:t>• data/words.json — KHG word bank (Film Titles, Dialogues, Celebrities, Songs, Characters)</w:t>
+      </w:r>
+    </w:p>
+    <w:p>
+      <w:pPr>
+        <w:ind w:left="360"/>
+      </w:pPr>
+      <w:r>
+        <w:t>• data/pabh-data.json — PABH pools: 40 actors, 40 locations, 20 genres, 40 wildcards</w:t>
+      </w:r>
+    </w:p>
+    <w:p>
+      <w:r>
         <w:rPr>
           <w:b/>
-          <w:bCs/>
+          <w:sz w:val="24"/>
         </w:rPr>
-      </w:pPr>
+        <w:t>7.3 State Management</w:t>
+      </w:r>
+    </w:p>
+    <w:p>
+      <w:pPr>
+        <w:ind w:left="360"/>
+      </w:pPr>
+      <w:r>
+        <w:t>• KHG: localStorage (persists across sessions) for scores; in-memory for game state</w:t>
+      </w:r>
+    </w:p>
+    <w:p>
+      <w:pPr>
+        <w:ind w:left="360"/>
+      </w:pPr>
+      <w:r>
+        <w:t>• PABH: sessionStorage (resets on browser close) for game state and scores</w:t>
+      </w:r>
+    </w:p>
+    <w:p>
       <w:r>
         <w:rPr>
           <w:b/>
-          <w:bCs/>
+          <w:sz w:val="24"/>
         </w:rPr>
-        <w:t>5.2 Gameplay System</w:t>
-      </w:r>
-    </w:p>
-    <w:p>
-      <w:pPr>
-        <w:numPr>
-          <w:ilvl w:val="0"/>
-          <w:numId w:val="12"/>
-        </w:numPr>
-      </w:pPr>
-      <w:r>
-        <w:t>Tap to select/draw cards</w:t>
-      </w:r>
-    </w:p>
-    <w:p>
-      <w:pPr>
-        <w:numPr>
-          <w:ilvl w:val="0"/>
-          <w:numId w:val="12"/>
-        </w:numPr>
-      </w:pPr>
-      <w:r>
-        <w:t>Automatic validation of sets</w:t>
-      </w:r>
-    </w:p>
-    <w:p>
-      <w:pPr>
-        <w:numPr>
-          <w:ilvl w:val="0"/>
-          <w:numId w:val="12"/>
-        </w:numPr>
-      </w:pPr>
-      <w:r>
-        <w:lastRenderedPageBreak/>
-        <w:t>Turn-based progression</w:t>
-      </w:r>
-    </w:p>
-    <w:p>
-      <w:pPr>
-        <w:numPr>
-          <w:ilvl w:val="0"/>
-          <w:numId w:val="12"/>
-        </w:numPr>
-      </w:pPr>
-      <w:r>
-        <w:t>Score auto-update</w:t>
-      </w:r>
-    </w:p>
-    <w:p>
-      <w:r>
-        <w:pict w14:anchorId="14C3A0BD">
-          <v:rect id="_x0000_i1299" style="width:0;height:1.5pt" o:hralign="center" o:hrstd="t" o:hr="t" fillcolor="#a0a0a0" stroked="f"/>
-        </w:pict>
-      </w:r>
-    </w:p>
-    <w:p>
-      <w:pPr>
+        <w:t>7.4 Privacy System</w:t>
+      </w:r>
+    </w:p>
+    <w:p>
+      <w:r>
+        <w:t>KHG uses a mandatory hot-seat privacy gate: each player sees a screen showing only their name with a "Reveal My Role" button. The role card is only shown after the player explicitly taps, ensuring no other player sees their secret assignment.</w:t>
+      </w:r>
+    </w:p>
+    <w:p>
+      <w:r>
         <w:rPr>
           <w:b/>
-          <w:bCs/>
+          <w:sz w:val="24"/>
         </w:rPr>
-      </w:pPr>
+        <w:t>7.5 Testing</w:t>
+      </w:r>
+    </w:p>
+    <w:p>
+      <w:pPr>
+        <w:ind w:left="360"/>
+      </w:pPr>
+      <w:r>
+        <w:t>• E2E test suite: 28 Playwright tests covering both games end-to-end</w:t>
+      </w:r>
+    </w:p>
+    <w:p>
+      <w:pPr>
+        <w:ind w:left="360"/>
+      </w:pPr>
+      <w:r>
+        <w:t>• Test runner: npx playwright test</w:t>
+      </w:r>
+    </w:p>
+    <w:p>
+      <w:pPr>
+        <w:ind w:left="360"/>
+      </w:pPr>
+      <w:r>
+        <w:t>• Static analysis: ESLint (eslint.config.mjs) — 0 errors, 0 warnings</w:t>
+      </w:r>
+    </w:p>
+    <w:p>
+      <w:pPr>
+        <w:ind w:left="360"/>
+      </w:pPr>
+      <w:r>
+        <w:t>• Dependency audit: npm audit — 0 known CVEs</w:t>
+      </w:r>
+    </w:p>
+    <w:p/>
+    <w:p>
       <w:r>
         <w:rPr>
           <w:b/>
-          <w:bCs/>
+          <w:sz w:val="28"/>
         </w:rPr>
-        <w:t>5.3 State Management</w:t>
-      </w:r>
-    </w:p>
-    <w:p>
-      <w:r>
-        <w:t xml:space="preserve">Stored in memory + persisted via </w:t>
-      </w:r>
-      <w:proofErr w:type="spellStart"/>
-      <w:r>
-        <w:t>localStorage</w:t>
-      </w:r>
-      <w:proofErr w:type="spellEnd"/>
-      <w:r>
-        <w:t>:</w:t>
-      </w:r>
-    </w:p>
-    <w:p>
-      <w:pPr>
-        <w:numPr>
-          <w:ilvl w:val="0"/>
-          <w:numId w:val="13"/>
-        </w:numPr>
-      </w:pPr>
-      <w:r>
-        <w:t>Players list</w:t>
-      </w:r>
-    </w:p>
-    <w:p>
-      <w:pPr>
-        <w:numPr>
-          <w:ilvl w:val="0"/>
-          <w:numId w:val="13"/>
-        </w:numPr>
-      </w:pPr>
-      <w:r>
-        <w:t>Turn order</w:t>
-      </w:r>
-    </w:p>
-    <w:p>
-      <w:pPr>
-        <w:numPr>
-          <w:ilvl w:val="0"/>
-          <w:numId w:val="13"/>
-        </w:numPr>
-      </w:pPr>
-      <w:r>
-        <w:t>Scores</w:t>
-      </w:r>
-    </w:p>
-    <w:p>
-      <w:pPr>
-        <w:numPr>
-          <w:ilvl w:val="0"/>
-          <w:numId w:val="13"/>
-        </w:numPr>
-      </w:pPr>
-      <w:r>
-        <w:t>Completed sets</w:t>
-      </w:r>
-    </w:p>
-    <w:p>
-      <w:pPr>
-        <w:numPr>
-          <w:ilvl w:val="0"/>
-          <w:numId w:val="13"/>
-        </w:numPr>
-      </w:pPr>
-      <w:r>
-        <w:t>Current round</w:t>
-      </w:r>
-    </w:p>
-    <w:p>
-      <w:r>
-        <w:pict w14:anchorId="2FFA380C">
-          <v:rect id="_x0000_i1300" style="width:0;height:1.5pt" o:hralign="center" o:hrstd="t" o:hr="t" fillcolor="#a0a0a0" stroked="f"/>
-        </w:pict>
-      </w:r>
-    </w:p>
-    <w:p>
-      <w:pPr>
+        <w:t>8. Non-Functional Requirements</w:t>
+      </w:r>
+    </w:p>
+    <w:p>
+      <w:pPr>
+        <w:ind w:left="360"/>
+      </w:pPr>
+      <w:r>
+        <w:t>• Works on Chrome, Safari (mobile), Edge</w:t>
+      </w:r>
+    </w:p>
+    <w:p>
+      <w:pPr>
+        <w:ind w:left="360"/>
+      </w:pPr>
+      <w:r>
+        <w:t>• No console errors in production</w:t>
+      </w:r>
+    </w:p>
+    <w:p>
+      <w:pPr>
+        <w:ind w:left="360"/>
+      </w:pPr>
+      <w:r>
+        <w:t>• Responsive across common phone sizes (portrait mode)</w:t>
+      </w:r>
+    </w:p>
+    <w:p>
+      <w:pPr>
+        <w:ind w:left="360"/>
+      </w:pPr>
+      <w:r>
+        <w:t>• Buttons ≥ 44px tap target height</w:t>
+      </w:r>
+    </w:p>
+    <w:p>
+      <w:pPr>
+        <w:ind w:left="360"/>
+      </w:pPr>
+      <w:r>
+        <w:t>• Accessible font sizes and contrast ratios</w:t>
+      </w:r>
+    </w:p>
+    <w:p>
+      <w:pPr>
+        <w:ind w:left="360"/>
+      </w:pPr>
+      <w:r>
+        <w:t>• App loads in &lt; 2 seconds on standard mobile network</w:t>
+      </w:r>
+    </w:p>
+    <w:p>
+      <w:pPr>
+        <w:ind w:left="360"/>
+      </w:pPr>
+      <w:r>
+        <w:t>• Works offline after first load (Service Worker)</w:t>
+      </w:r>
+    </w:p>
+    <w:p/>
+    <w:p>
+      <w:r>
         <w:rPr>
           <w:b/>
-          <w:bCs/>
+          <w:sz w:val="28"/>
         </w:rPr>
-      </w:pPr>
+        <w:t>9. Future Enhancements</w:t>
+      </w:r>
+    </w:p>
+    <w:p>
+      <w:pPr>
+        <w:ind w:left="360"/>
+      </w:pPr>
+      <w:r>
+        <w:t>• KHG: How to Play screen inside PABH (currently only KHG has rules screen)</w:t>
+      </w:r>
+    </w:p>
+    <w:p>
+      <w:pPr>
+        <w:ind w:left="360"/>
+      </w:pPr>
+      <w:r>
+        <w:t>• PABH: Vote privacy gate — each voter votes secretly without seeing prior votes</w:t>
+      </w:r>
+    </w:p>
+    <w:p>
+      <w:pPr>
+        <w:ind w:left="360"/>
+      </w:pPr>
+      <w:r>
+        <w:t>• PABH: Abandon game confirmation modal</w:t>
+      </w:r>
+    </w:p>
+    <w:p>
+      <w:pPr>
+        <w:ind w:left="360"/>
+      </w:pPr>
+      <w:r>
+        <w:t>• Sound effects and haptic feedback</w:t>
+      </w:r>
+    </w:p>
+    <w:p>
+      <w:pPr>
+        <w:ind w:left="360"/>
+      </w:pPr>
+      <w:r>
+        <w:t>• Shareable round results</w:t>
+      </w:r>
+    </w:p>
+    <w:p>
+      <w:pPr>
+        <w:ind w:left="360"/>
+      </w:pPr>
+      <w:r>
+        <w:t>• Daily challenge mode (seed-based combos/words)</w:t>
+      </w:r>
+    </w:p>
+    <w:p>
+      <w:pPr>
+        <w:ind w:left="360"/>
+      </w:pPr>
+      <w:r>
+        <w:t>• TMDB integration for movie posters in KHG word cards</w:t>
+      </w:r>
+    </w:p>
+    <w:p>
+      <w:pPr>
+        <w:ind w:left="360"/>
+      </w:pPr>
+      <w:r>
+        <w:t>• Third game: Antakshari / SongLink mode</w:t>
+      </w:r>
+    </w:p>
+    <w:p/>
+    <w:p>
       <w:r>
         <w:rPr>
           <w:b/>
-          <w:bCs/>
+          <w:sz w:val="28"/>
         </w:rPr>
-        <w:t>5.4 Privacy System (Shared Device)</w:t>
-      </w:r>
-    </w:p>
-    <w:p>
-      <w:r>
-        <w:t>Mandatory turn handoff mechanism:</w:t>
-      </w:r>
-    </w:p>
-    <w:p>
-      <w:pPr>
-        <w:numPr>
-          <w:ilvl w:val="0"/>
-          <w:numId w:val="14"/>
-        </w:numPr>
-      </w:pPr>
-      <w:r>
-        <w:t>Hide sensitive state between turns</w:t>
-      </w:r>
-    </w:p>
-    <w:p>
-      <w:pPr>
-        <w:numPr>
-          <w:ilvl w:val="0"/>
-          <w:numId w:val="14"/>
-        </w:numPr>
-      </w:pPr>
-      <w:r>
-        <w:t>Require explicit “Next Player Ready” action</w:t>
-      </w:r>
-    </w:p>
-    <w:p>
-      <w:r>
-        <w:pict w14:anchorId="2D44DF7B">
-          <v:rect id="_x0000_i1301" style="width:0;height:1.5pt" o:hralign="center" o:hrstd="t" o:hr="t" fillcolor="#a0a0a0" stroked="f"/>
-        </w:pict>
-      </w:r>
-    </w:p>
-    <w:p>
-      <w:pPr>
-        <w:rPr>
-          <w:b/>
-          <w:bCs/>
-        </w:rPr>
-      </w:pPr>
-      <w:r>
-        <w:rPr>
-          <w:b/>
-          <w:bCs/>
-        </w:rPr>
-        <w:t>6. Functional Requirements &amp; Acceptance Criteria</w:t>
-      </w:r>
-    </w:p>
-    <w:p>
-      <w:r>
-        <w:pict w14:anchorId="463E3139">
-          <v:rect id="_x0000_i1302" style="width:0;height:1.5pt" o:hralign="center" o:hrstd="t" o:hr="t" fillcolor="#a0a0a0" stroked="f"/>
-        </w:pict>
-      </w:r>
-    </w:p>
-    <w:p>
-      <w:pPr>
-        <w:rPr>
-          <w:b/>
-          <w:bCs/>
-        </w:rPr>
-      </w:pPr>
-      <w:r>
-        <w:rPr>
-          <w:b/>
-          <w:bCs/>
-        </w:rPr>
-        <w:t>6.1 App Load &amp; Performance</w:t>
-      </w:r>
-    </w:p>
-    <w:p>
-      <w:r>
-        <w:rPr>
-          <w:b/>
-          <w:bCs/>
-        </w:rPr>
-        <w:t>Requirement:</w:t>
-      </w:r>
-      <w:r>
-        <w:br/>
-        <w:t>App must load instantly and be usable offline after first load.</w:t>
-      </w:r>
-    </w:p>
-    <w:p>
-      <w:r>
-        <w:rPr>
-          <w:b/>
-          <w:bCs/>
-        </w:rPr>
-        <w:t>Acceptance Criteria:</w:t>
-      </w:r>
-    </w:p>
-    <w:p>
-      <w:pPr>
-        <w:numPr>
-          <w:ilvl w:val="0"/>
-          <w:numId w:val="15"/>
-        </w:numPr>
-      </w:pPr>
-      <w:r>
-        <w:t xml:space="preserve">Loads in </w:t>
-      </w:r>
-      <w:r>
-        <w:rPr>
-          <w:b/>
-          <w:bCs/>
-        </w:rPr>
-        <w:t>&lt; 2 seconds</w:t>
-      </w:r>
-      <w:r>
-        <w:t xml:space="preserve"> on standard mobile network</w:t>
-      </w:r>
-    </w:p>
-    <w:p>
-      <w:pPr>
-        <w:numPr>
-          <w:ilvl w:val="0"/>
-          <w:numId w:val="15"/>
-        </w:numPr>
-      </w:pPr>
-      <w:r>
-        <w:t>No blocking API calls at startup</w:t>
-      </w:r>
-    </w:p>
-    <w:p>
-      <w:pPr>
-        <w:numPr>
-          <w:ilvl w:val="0"/>
-          <w:numId w:val="15"/>
-        </w:numPr>
-      </w:pPr>
-      <w:r>
-        <w:t xml:space="preserve">App works with </w:t>
-      </w:r>
-      <w:r>
-        <w:rPr>
-          <w:b/>
-          <w:bCs/>
-        </w:rPr>
-        <w:t>no internet after first load</w:t>
-      </w:r>
-    </w:p>
-    <w:p>
-      <w:pPr>
-        <w:numPr>
-          <w:ilvl w:val="0"/>
-          <w:numId w:val="15"/>
-        </w:numPr>
-      </w:pPr>
-      <w:r>
-        <w:t>Lighthouse Performance Score ≥ 90</w:t>
-      </w:r>
-    </w:p>
-    <w:p>
-      <w:r>
-        <w:lastRenderedPageBreak/>
-        <w:pict w14:anchorId="5AF332BE">
-          <v:rect id="_x0000_i1303" style="width:0;height:1.5pt" o:hralign="center" o:hrstd="t" o:hr="t" fillcolor="#a0a0a0" stroked="f"/>
-        </w:pict>
-      </w:r>
-    </w:p>
-    <w:p>
-      <w:pPr>
-        <w:rPr>
-          <w:b/>
-          <w:bCs/>
-        </w:rPr>
-      </w:pPr>
-      <w:r>
-        <w:rPr>
-          <w:b/>
-          <w:bCs/>
-        </w:rPr>
-        <w:t>6.2 Start Flow</w:t>
-      </w:r>
-    </w:p>
-    <w:p>
-      <w:r>
-        <w:rPr>
-          <w:b/>
-          <w:bCs/>
-        </w:rPr>
-        <w:t>Requirement:</w:t>
-      </w:r>
-      <w:r>
-        <w:br/>
-        <w:t>User can begin gameplay within 1 minute.</w:t>
-      </w:r>
-    </w:p>
-    <w:p>
-      <w:r>
-        <w:rPr>
-          <w:b/>
-          <w:bCs/>
-        </w:rPr>
-        <w:t>Acceptance Criteria:</w:t>
-      </w:r>
-    </w:p>
-    <w:p>
-      <w:pPr>
-        <w:numPr>
-          <w:ilvl w:val="0"/>
-          <w:numId w:val="16"/>
-        </w:numPr>
-      </w:pPr>
-      <w:r>
-        <w:t>Start screen visible on load</w:t>
-      </w:r>
-    </w:p>
-    <w:p>
-      <w:pPr>
-        <w:numPr>
-          <w:ilvl w:val="0"/>
-          <w:numId w:val="16"/>
-        </w:numPr>
-      </w:pPr>
-      <w:r>
-        <w:t>“Start Game” CTA clearly visible</w:t>
-      </w:r>
-    </w:p>
-    <w:p>
-      <w:pPr>
-        <w:numPr>
-          <w:ilvl w:val="0"/>
-          <w:numId w:val="16"/>
-        </w:numPr>
-      </w:pPr>
-      <w:r>
-        <w:t>Game selection completed in ≤ 3 taps</w:t>
-      </w:r>
-    </w:p>
-    <w:p>
-      <w:pPr>
-        <w:numPr>
-          <w:ilvl w:val="0"/>
-          <w:numId w:val="16"/>
-        </w:numPr>
-      </w:pPr>
-      <w:r>
-        <w:t>Rules overlay dismissible in 1 tap</w:t>
-      </w:r>
-    </w:p>
-    <w:p>
-      <w:r>
-        <w:pict w14:anchorId="3EEE9776">
-          <v:rect id="_x0000_i1304" style="width:0;height:1.5pt" o:hralign="center" o:hrstd="t" o:hr="t" fillcolor="#a0a0a0" stroked="f"/>
-        </w:pict>
-      </w:r>
-    </w:p>
-    <w:p>
-      <w:pPr>
-        <w:rPr>
-          <w:b/>
-          <w:bCs/>
-        </w:rPr>
-      </w:pPr>
-      <w:r>
-        <w:rPr>
-          <w:b/>
-          <w:bCs/>
-        </w:rPr>
-        <w:t>6.3 Player Setup</w:t>
-      </w:r>
-    </w:p>
-    <w:p>
-      <w:r>
-        <w:rPr>
-          <w:b/>
-          <w:bCs/>
-        </w:rPr>
-        <w:t>Requirement:</w:t>
-      </w:r>
-      <w:r>
-        <w:br/>
-        <w:t>Support 2–8 players.</w:t>
-      </w:r>
-    </w:p>
-    <w:p>
-      <w:r>
-        <w:rPr>
-          <w:b/>
-          <w:bCs/>
-        </w:rPr>
-        <w:t>Acceptance Criteria:</w:t>
-      </w:r>
-    </w:p>
-    <w:p>
-      <w:pPr>
-        <w:numPr>
-          <w:ilvl w:val="0"/>
-          <w:numId w:val="17"/>
-        </w:numPr>
-      </w:pPr>
-      <w:r>
-        <w:t>User can add/remove players</w:t>
-      </w:r>
-    </w:p>
-    <w:p>
-      <w:pPr>
-        <w:numPr>
-          <w:ilvl w:val="0"/>
-          <w:numId w:val="17"/>
-        </w:numPr>
-      </w:pPr>
-      <w:r>
-        <w:t>Player names optional (default: Player 1, Player 2…)</w:t>
-      </w:r>
-    </w:p>
-    <w:p>
-      <w:pPr>
-        <w:numPr>
-          <w:ilvl w:val="0"/>
-          <w:numId w:val="17"/>
-        </w:numPr>
-      </w:pPr>
-      <w:r>
-        <w:t>Turn order automatically generated</w:t>
-      </w:r>
-    </w:p>
-    <w:p>
-      <w:pPr>
-        <w:numPr>
-          <w:ilvl w:val="0"/>
-          <w:numId w:val="17"/>
-        </w:numPr>
-      </w:pPr>
-      <w:r>
-        <w:t>Max players capped at 8</w:t>
-      </w:r>
-    </w:p>
-    <w:p>
-      <w:r>
-        <w:pict w14:anchorId="62356E0B">
-          <v:rect id="_x0000_i1305" style="width:0;height:1.5pt" o:hralign="center" o:hrstd="t" o:hr="t" fillcolor="#a0a0a0" stroked="f"/>
-        </w:pict>
-      </w:r>
-    </w:p>
-    <w:p>
-      <w:pPr>
-        <w:rPr>
-          <w:b/>
-          <w:bCs/>
-        </w:rPr>
-      </w:pPr>
-      <w:r>
-        <w:rPr>
-          <w:b/>
-          <w:bCs/>
-        </w:rPr>
-        <w:t>6.4 Movie Set Builder Gameplay</w:t>
-      </w:r>
-    </w:p>
-    <w:p>
-      <w:r>
-        <w:rPr>
-          <w:b/>
-          <w:bCs/>
-        </w:rPr>
-        <w:t>Requirement:</w:t>
-      </w:r>
-      <w:r>
-        <w:br/>
-        <w:t>Enable full gameplay loop.</w:t>
-      </w:r>
-    </w:p>
-    <w:p>
-      <w:r>
-        <w:rPr>
-          <w:b/>
-          <w:bCs/>
-        </w:rPr>
-        <w:t>Acceptance Criteria:</w:t>
-      </w:r>
-    </w:p>
-    <w:p>
-      <w:pPr>
-        <w:numPr>
-          <w:ilvl w:val="0"/>
-          <w:numId w:val="18"/>
-        </w:numPr>
-      </w:pPr>
-      <w:r>
-        <w:t>Deck initializes and shuffles on game start</w:t>
-      </w:r>
-    </w:p>
-    <w:p>
-      <w:pPr>
-        <w:numPr>
-          <w:ilvl w:val="0"/>
-          <w:numId w:val="18"/>
-        </w:numPr>
-      </w:pPr>
-      <w:r>
-        <w:t>Player can draw/select cards via tap</w:t>
-      </w:r>
-    </w:p>
-    <w:p>
-      <w:pPr>
-        <w:numPr>
-          <w:ilvl w:val="0"/>
-          <w:numId w:val="18"/>
-        </w:numPr>
-      </w:pPr>
-      <w:r>
-        <w:t>System validates:</w:t>
-      </w:r>
-    </w:p>
-    <w:p>
-      <w:pPr>
-        <w:numPr>
-          <w:ilvl w:val="1"/>
-          <w:numId w:val="18"/>
-        </w:numPr>
-      </w:pPr>
-      <w:r>
-        <w:t>1 Location + 1 Plot + 1 Celeb</w:t>
-      </w:r>
-    </w:p>
-    <w:p>
-      <w:pPr>
-        <w:numPr>
-          <w:ilvl w:val="0"/>
-          <w:numId w:val="18"/>
-        </w:numPr>
-      </w:pPr>
-      <w:r>
-        <w:lastRenderedPageBreak/>
-        <w:t>Invalid sets are rejected with visual feedback</w:t>
-      </w:r>
-    </w:p>
-    <w:p>
-      <w:pPr>
-        <w:numPr>
-          <w:ilvl w:val="0"/>
-          <w:numId w:val="18"/>
-        </w:numPr>
-      </w:pPr>
-      <w:r>
-        <w:t>Valid sets:</w:t>
-      </w:r>
-    </w:p>
-    <w:p>
-      <w:pPr>
-        <w:numPr>
-          <w:ilvl w:val="1"/>
-          <w:numId w:val="18"/>
-        </w:numPr>
-      </w:pPr>
-      <w:r>
-        <w:t>Added to player score</w:t>
-      </w:r>
-    </w:p>
-    <w:p>
-      <w:pPr>
-        <w:numPr>
-          <w:ilvl w:val="1"/>
-          <w:numId w:val="18"/>
-        </w:numPr>
-      </w:pPr>
-      <w:r>
-        <w:t>Removed from active selection</w:t>
-      </w:r>
-    </w:p>
-    <w:p>
-      <w:pPr>
-        <w:numPr>
-          <w:ilvl w:val="0"/>
-          <w:numId w:val="18"/>
-        </w:numPr>
-      </w:pPr>
-      <w:r>
-        <w:t>Scene Change:</w:t>
-      </w:r>
-    </w:p>
-    <w:p>
-      <w:pPr>
-        <w:numPr>
-          <w:ilvl w:val="1"/>
-          <w:numId w:val="18"/>
-        </w:numPr>
-      </w:pPr>
-      <w:r>
-        <w:t>Refreshes center cards immediately</w:t>
-      </w:r>
-    </w:p>
-    <w:p>
-      <w:pPr>
-        <w:numPr>
-          <w:ilvl w:val="0"/>
-          <w:numId w:val="18"/>
-        </w:numPr>
-      </w:pPr>
-      <w:r>
-        <w:t>Round ends when a player reaches 4 sets</w:t>
-      </w:r>
-    </w:p>
-    <w:p>
-      <w:pPr>
-        <w:numPr>
-          <w:ilvl w:val="0"/>
-          <w:numId w:val="18"/>
-        </w:numPr>
-      </w:pPr>
-      <w:r>
-        <w:t>Winner correctly calculated based on total stars</w:t>
-      </w:r>
-    </w:p>
-    <w:p>
-      <w:r>
-        <w:pict w14:anchorId="36CB9694">
-          <v:rect id="_x0000_i1306" style="width:0;height:1.5pt" o:hralign="center" o:hrstd="t" o:hr="t" fillcolor="#a0a0a0" stroked="f"/>
-        </w:pict>
-      </w:r>
-    </w:p>
-    <w:p>
-      <w:pPr>
-        <w:rPr>
-          <w:b/>
-          <w:bCs/>
-        </w:rPr>
-      </w:pPr>
-      <w:r>
-        <w:rPr>
-          <w:b/>
-          <w:bCs/>
-        </w:rPr>
-        <w:t>6.5 Guess the Word Gameplay (MVP)</w:t>
-      </w:r>
-    </w:p>
-    <w:p>
-      <w:r>
-        <w:rPr>
-          <w:b/>
-          <w:bCs/>
-        </w:rPr>
-        <w:t>Requirement:</w:t>
-      </w:r>
-      <w:r>
-        <w:br/>
-        <w:t>Basic playable version.</w:t>
-      </w:r>
-    </w:p>
-    <w:p>
-      <w:r>
-        <w:rPr>
-          <w:b/>
-          <w:bCs/>
-        </w:rPr>
-        <w:t>Acceptance Criteria:</w:t>
-      </w:r>
-    </w:p>
-    <w:p>
-      <w:pPr>
-        <w:numPr>
-          <w:ilvl w:val="0"/>
-          <w:numId w:val="19"/>
-        </w:numPr>
-      </w:pPr>
-      <w:r>
-        <w:t>Word displayed only to active player</w:t>
-      </w:r>
-    </w:p>
-    <w:p>
-      <w:pPr>
-        <w:numPr>
-          <w:ilvl w:val="0"/>
-          <w:numId w:val="19"/>
-        </w:numPr>
-      </w:pPr>
-      <w:r>
-        <w:t>Player can give clue manually (offline play)</w:t>
-      </w:r>
-    </w:p>
-    <w:p>
-      <w:pPr>
-        <w:numPr>
-          <w:ilvl w:val="0"/>
-          <w:numId w:val="19"/>
-        </w:numPr>
-      </w:pPr>
-      <w:r>
-        <w:t>Turn progresses via “Next” button</w:t>
-      </w:r>
-    </w:p>
-    <w:p>
-      <w:pPr>
-        <w:numPr>
-          <w:ilvl w:val="0"/>
-          <w:numId w:val="19"/>
-        </w:numPr>
-      </w:pPr>
-      <w:r>
-        <w:t>Score increments manually or via simple toggle</w:t>
-      </w:r>
-    </w:p>
-    <w:p>
-      <w:pPr>
-        <w:numPr>
-          <w:ilvl w:val="0"/>
-          <w:numId w:val="19"/>
-        </w:numPr>
-      </w:pPr>
-      <w:r>
-        <w:t>Round tracking visible</w:t>
-      </w:r>
-    </w:p>
-    <w:p>
-      <w:r>
-        <w:pict w14:anchorId="3B5C8BE6">
-          <v:rect id="_x0000_i1307" style="width:0;height:1.5pt" o:hralign="center" o:hrstd="t" o:hr="t" fillcolor="#a0a0a0" stroked="f"/>
-        </w:pict>
-      </w:r>
-    </w:p>
-    <w:p>
-      <w:pPr>
-        <w:rPr>
-          <w:b/>
-          <w:bCs/>
-        </w:rPr>
-      </w:pPr>
-      <w:r>
-        <w:rPr>
-          <w:b/>
-          <w:bCs/>
-        </w:rPr>
-        <w:t>6.6 Turn Handoff (Critical Feature)</w:t>
-      </w:r>
-    </w:p>
-    <w:p>
-      <w:r>
-        <w:rPr>
-          <w:b/>
-          <w:bCs/>
-        </w:rPr>
-        <w:t>Requirement:</w:t>
-      </w:r>
-      <w:r>
-        <w:br/>
-        <w:t>Prevent information leakage on shared devices.</w:t>
-      </w:r>
-    </w:p>
-    <w:p>
-      <w:r>
-        <w:rPr>
-          <w:b/>
-          <w:bCs/>
-        </w:rPr>
-        <w:t>Acceptance Criteria:</w:t>
-      </w:r>
-    </w:p>
-    <w:p>
-      <w:pPr>
-        <w:numPr>
-          <w:ilvl w:val="0"/>
-          <w:numId w:val="20"/>
-        </w:numPr>
-      </w:pPr>
-      <w:r>
-        <w:t>At end of each turn:</w:t>
-      </w:r>
-    </w:p>
-    <w:p>
-      <w:pPr>
-        <w:numPr>
-          <w:ilvl w:val="1"/>
-          <w:numId w:val="20"/>
-        </w:numPr>
-      </w:pPr>
-      <w:r>
-        <w:t>Screen fully hides game state</w:t>
-      </w:r>
-    </w:p>
-    <w:p>
-      <w:pPr>
-        <w:numPr>
-          <w:ilvl w:val="1"/>
-          <w:numId w:val="20"/>
-        </w:numPr>
-      </w:pPr>
-      <w:r>
-        <w:t>Displays “Pass to next player”</w:t>
-      </w:r>
-    </w:p>
-    <w:p>
-      <w:pPr>
-        <w:numPr>
-          <w:ilvl w:val="0"/>
-          <w:numId w:val="20"/>
-        </w:numPr>
-      </w:pPr>
-      <w:r>
-        <w:t>Next player must tap “Ready” to continue</w:t>
-      </w:r>
-    </w:p>
-    <w:p>
-      <w:pPr>
-        <w:numPr>
-          <w:ilvl w:val="0"/>
-          <w:numId w:val="20"/>
-        </w:numPr>
-      </w:pPr>
-      <w:r>
-        <w:lastRenderedPageBreak/>
-        <w:t>Previous player’s cards/selections are not visible</w:t>
-      </w:r>
-    </w:p>
-    <w:p>
-      <w:pPr>
-        <w:numPr>
-          <w:ilvl w:val="0"/>
-          <w:numId w:val="20"/>
-        </w:numPr>
-      </w:pPr>
-      <w:r>
-        <w:t>No sensitive data visible during transition</w:t>
-      </w:r>
-    </w:p>
-    <w:p>
-      <w:r>
-        <w:pict w14:anchorId="686FD21D">
-          <v:rect id="_x0000_i1308" style="width:0;height:1.5pt" o:hralign="center" o:hrstd="t" o:hr="t" fillcolor="#a0a0a0" stroked="f"/>
-        </w:pict>
-      </w:r>
-    </w:p>
-    <w:p>
-      <w:pPr>
-        <w:rPr>
-          <w:b/>
-          <w:bCs/>
-        </w:rPr>
-      </w:pPr>
-      <w:r>
-        <w:rPr>
-          <w:b/>
-          <w:bCs/>
-        </w:rPr>
-        <w:t xml:space="preserve">6.7 </w:t>
-      </w:r>
-      <w:proofErr w:type="gramStart"/>
-      <w:r>
-        <w:rPr>
-          <w:b/>
-          <w:bCs/>
-        </w:rPr>
-        <w:t>Score</w:t>
-      </w:r>
-      <w:proofErr w:type="gramEnd"/>
-      <w:r>
-        <w:rPr>
-          <w:b/>
-          <w:bCs/>
-        </w:rPr>
-        <w:t xml:space="preserve"> Tracking</w:t>
-      </w:r>
-    </w:p>
-    <w:p>
-      <w:r>
-        <w:rPr>
-          <w:b/>
-          <w:bCs/>
-        </w:rPr>
-        <w:t>Requirement:</w:t>
-      </w:r>
-      <w:r>
-        <w:br/>
-        <w:t>Track and persist scores locally.</w:t>
-      </w:r>
-    </w:p>
-    <w:p>
-      <w:r>
-        <w:rPr>
-          <w:b/>
-          <w:bCs/>
-        </w:rPr>
-        <w:t>Acceptance Criteria:</w:t>
-      </w:r>
-    </w:p>
-    <w:p>
-      <w:pPr>
-        <w:numPr>
-          <w:ilvl w:val="0"/>
-          <w:numId w:val="21"/>
-        </w:numPr>
-      </w:pPr>
-      <w:r>
-        <w:t>Scores update immediately after each valid action</w:t>
-      </w:r>
-    </w:p>
-    <w:p>
-      <w:pPr>
-        <w:numPr>
-          <w:ilvl w:val="0"/>
-          <w:numId w:val="21"/>
-        </w:numPr>
-      </w:pPr>
-      <w:r>
-        <w:t>Scores visible in sticky header</w:t>
-      </w:r>
-    </w:p>
-    <w:p>
-      <w:pPr>
-        <w:numPr>
-          <w:ilvl w:val="0"/>
-          <w:numId w:val="21"/>
-        </w:numPr>
-      </w:pPr>
-      <w:r>
-        <w:t xml:space="preserve">Data persists on refresh via </w:t>
-      </w:r>
-      <w:proofErr w:type="spellStart"/>
-      <w:r>
-        <w:t>localStorage</w:t>
-      </w:r>
-      <w:proofErr w:type="spellEnd"/>
-    </w:p>
-    <w:p>
-      <w:pPr>
-        <w:numPr>
-          <w:ilvl w:val="0"/>
-          <w:numId w:val="21"/>
-        </w:numPr>
-      </w:pPr>
-      <w:r>
-        <w:t>Reset option clears all scores</w:t>
-      </w:r>
-    </w:p>
-    <w:p>
-      <w:r>
-        <w:pict w14:anchorId="24DCA164">
-          <v:rect id="_x0000_i1309" style="width:0;height:1.5pt" o:hralign="center" o:hrstd="t" o:hr="t" fillcolor="#a0a0a0" stroked="f"/>
-        </w:pict>
-      </w:r>
-    </w:p>
-    <w:p>
-      <w:pPr>
-        <w:rPr>
-          <w:b/>
-          <w:bCs/>
-        </w:rPr>
-      </w:pPr>
-      <w:r>
-        <w:rPr>
-          <w:b/>
-          <w:bCs/>
-        </w:rPr>
-        <w:t>6.8 UI/UX (Mobile First)</w:t>
-      </w:r>
-    </w:p>
-    <w:p>
-      <w:r>
-        <w:rPr>
-          <w:b/>
-          <w:bCs/>
-        </w:rPr>
-        <w:t>Requirement:</w:t>
-      </w:r>
-      <w:r>
-        <w:br/>
-        <w:t>Optimize for handheld usage.</w:t>
-      </w:r>
-    </w:p>
-    <w:p>
-      <w:r>
-        <w:rPr>
-          <w:b/>
-          <w:bCs/>
-        </w:rPr>
-        <w:t>Acceptance Criteria:</w:t>
-      </w:r>
-    </w:p>
-    <w:p>
-      <w:pPr>
-        <w:numPr>
-          <w:ilvl w:val="0"/>
-          <w:numId w:val="22"/>
-        </w:numPr>
-      </w:pPr>
-      <w:r>
-        <w:t>Single-column layout</w:t>
-      </w:r>
-    </w:p>
-    <w:p>
-      <w:pPr>
-        <w:numPr>
-          <w:ilvl w:val="0"/>
-          <w:numId w:val="22"/>
-        </w:numPr>
-      </w:pPr>
-      <w:r>
-        <w:t>Buttons ≥ 44px height</w:t>
-      </w:r>
-    </w:p>
-    <w:p>
-      <w:pPr>
-        <w:numPr>
-          <w:ilvl w:val="0"/>
-          <w:numId w:val="22"/>
-        </w:numPr>
-      </w:pPr>
-      <w:r>
-        <w:t>Primary actions reachable via thumb (bottom area)</w:t>
-      </w:r>
-    </w:p>
-    <w:p>
-      <w:pPr>
-        <w:numPr>
-          <w:ilvl w:val="0"/>
-          <w:numId w:val="22"/>
-        </w:numPr>
-      </w:pPr>
-      <w:r>
-        <w:t>Only one main action per screen</w:t>
-      </w:r>
-    </w:p>
-    <w:p>
-      <w:pPr>
-        <w:numPr>
-          <w:ilvl w:val="0"/>
-          <w:numId w:val="22"/>
-        </w:numPr>
-      </w:pPr>
-      <w:r>
-        <w:t>No horizontal scrolling</w:t>
-      </w:r>
-    </w:p>
-    <w:p>
-      <w:pPr>
-        <w:numPr>
-          <w:ilvl w:val="0"/>
-          <w:numId w:val="22"/>
-        </w:numPr>
-      </w:pPr>
-      <w:r>
-        <w:t>Works in portrait mode only</w:t>
-      </w:r>
-    </w:p>
-    <w:p>
-      <w:r>
-        <w:pict w14:anchorId="3F2840A9">
-          <v:rect id="_x0000_i1310" style="width:0;height:1.5pt" o:hralign="center" o:hrstd="t" o:hr="t" fillcolor="#a0a0a0" stroked="f"/>
-        </w:pict>
-      </w:r>
-    </w:p>
-    <w:p>
-      <w:pPr>
-        <w:rPr>
-          <w:b/>
-          <w:bCs/>
-        </w:rPr>
-      </w:pPr>
-      <w:r>
-        <w:rPr>
-          <w:b/>
-          <w:bCs/>
-        </w:rPr>
-        <w:t>6.9 Data Handling</w:t>
-      </w:r>
-    </w:p>
-    <w:p>
-      <w:r>
-        <w:rPr>
-          <w:b/>
-          <w:bCs/>
-        </w:rPr>
-        <w:t>Requirement:</w:t>
-      </w:r>
-      <w:r>
-        <w:br/>
-        <w:t>Use static JSON decks.</w:t>
-      </w:r>
-    </w:p>
-    <w:p>
-      <w:r>
-        <w:rPr>
-          <w:b/>
-          <w:bCs/>
-        </w:rPr>
-        <w:t>Acceptance Criteria:</w:t>
-      </w:r>
-    </w:p>
-    <w:p>
-      <w:pPr>
-        <w:numPr>
-          <w:ilvl w:val="0"/>
-          <w:numId w:val="23"/>
-        </w:numPr>
-      </w:pPr>
-      <w:r>
-        <w:lastRenderedPageBreak/>
-        <w:t>Decks loaded from local JSON files</w:t>
-      </w:r>
-    </w:p>
-    <w:p>
-      <w:pPr>
-        <w:numPr>
-          <w:ilvl w:val="0"/>
-          <w:numId w:val="23"/>
-        </w:numPr>
-      </w:pPr>
-      <w:r>
-        <w:t>No runtime dependency on external APIs</w:t>
-      </w:r>
-    </w:p>
-    <w:p>
-      <w:pPr>
-        <w:numPr>
-          <w:ilvl w:val="0"/>
-          <w:numId w:val="23"/>
-        </w:numPr>
-      </w:pPr>
-      <w:r>
-        <w:t>Shuffle randomness verified (basic uniformity)</w:t>
-      </w:r>
-    </w:p>
-    <w:p>
-      <w:r>
-        <w:pict w14:anchorId="06456A3E">
-          <v:rect id="_x0000_i1311" style="width:0;height:1.5pt" o:hralign="center" o:hrstd="t" o:hr="t" fillcolor="#a0a0a0" stroked="f"/>
-        </w:pict>
-      </w:r>
-    </w:p>
-    <w:p>
-      <w:pPr>
-        <w:rPr>
-          <w:b/>
-          <w:bCs/>
-        </w:rPr>
-      </w:pPr>
-      <w:r>
-        <w:rPr>
-          <w:b/>
-          <w:bCs/>
-        </w:rPr>
-        <w:t>6.10 Deployment</w:t>
-      </w:r>
-    </w:p>
-    <w:p>
-      <w:r>
-        <w:rPr>
-          <w:b/>
-          <w:bCs/>
-        </w:rPr>
-        <w:t>Requirement:</w:t>
-      </w:r>
-      <w:r>
-        <w:br/>
-        <w:t>Host on GitHub Pages.</w:t>
-      </w:r>
-    </w:p>
-    <w:p>
-      <w:r>
-        <w:rPr>
-          <w:b/>
-          <w:bCs/>
-        </w:rPr>
-        <w:t>Acceptance Criteria:</w:t>
-      </w:r>
-    </w:p>
-    <w:p>
-      <w:pPr>
-        <w:numPr>
-          <w:ilvl w:val="0"/>
-          <w:numId w:val="24"/>
-        </w:numPr>
-      </w:pPr>
-      <w:r>
-        <w:t>App accessible via public URL</w:t>
-      </w:r>
-    </w:p>
-    <w:p>
-      <w:pPr>
-        <w:numPr>
-          <w:ilvl w:val="0"/>
-          <w:numId w:val="24"/>
-        </w:numPr>
-      </w:pPr>
-      <w:r>
-        <w:t>No build step required (or optional lightweight build)</w:t>
-      </w:r>
-    </w:p>
-    <w:p>
-      <w:pPr>
-        <w:numPr>
-          <w:ilvl w:val="0"/>
-          <w:numId w:val="24"/>
-        </w:numPr>
-      </w:pPr>
-      <w:r>
-        <w:t>All assets load correctly from static hosting</w:t>
-      </w:r>
-    </w:p>
-    <w:p>
-      <w:r>
-        <w:pict w14:anchorId="30096DA5">
-          <v:rect id="_x0000_i1312" style="width:0;height:1.5pt" o:hralign="center" o:hrstd="t" o:hr="t" fillcolor="#a0a0a0" stroked="f"/>
-        </w:pict>
-      </w:r>
-    </w:p>
-    <w:p>
-      <w:pPr>
-        <w:rPr>
-          <w:b/>
-          <w:bCs/>
-        </w:rPr>
-      </w:pPr>
-      <w:r>
-        <w:rPr>
-          <w:b/>
-          <w:bCs/>
-        </w:rPr>
-        <w:t>7. Non-Functional Requirements</w:t>
-      </w:r>
-    </w:p>
-    <w:p>
-      <w:pPr>
-        <w:numPr>
-          <w:ilvl w:val="0"/>
-          <w:numId w:val="25"/>
-        </w:numPr>
-      </w:pPr>
-      <w:r>
-        <w:t>Works on Chrome, Safari (mobile), Edge</w:t>
-      </w:r>
-    </w:p>
-    <w:p>
-      <w:pPr>
-        <w:numPr>
-          <w:ilvl w:val="0"/>
-          <w:numId w:val="25"/>
-        </w:numPr>
-      </w:pPr>
-      <w:r>
-        <w:t>No console errors in production</w:t>
-      </w:r>
-    </w:p>
-    <w:p>
-      <w:pPr>
-        <w:numPr>
-          <w:ilvl w:val="0"/>
-          <w:numId w:val="25"/>
-        </w:numPr>
-      </w:pPr>
-      <w:r>
-        <w:t>Responsive across common phone sizes</w:t>
-      </w:r>
-    </w:p>
-    <w:p>
-      <w:pPr>
-        <w:numPr>
-          <w:ilvl w:val="0"/>
-          <w:numId w:val="25"/>
-        </w:numPr>
-      </w:pPr>
-      <w:r>
-        <w:t>Accessibility basics:</w:t>
-      </w:r>
-    </w:p>
-    <w:p>
-      <w:pPr>
-        <w:numPr>
-          <w:ilvl w:val="1"/>
-          <w:numId w:val="25"/>
-        </w:numPr>
-      </w:pPr>
-      <w:r>
-        <w:t>Readable font sizes</w:t>
-      </w:r>
-    </w:p>
-    <w:p>
-      <w:pPr>
-        <w:numPr>
-          <w:ilvl w:val="1"/>
-          <w:numId w:val="25"/>
-        </w:numPr>
-      </w:pPr>
-      <w:r>
-        <w:t>Contrast ratio acceptable</w:t>
-      </w:r>
-    </w:p>
-    <w:p>
-      <w:r>
-        <w:pict w14:anchorId="74C0115B">
-          <v:rect id="_x0000_i1313" style="width:0;height:1.5pt" o:hralign="center" o:hrstd="t" o:hr="t" fillcolor="#a0a0a0" stroked="f"/>
-        </w:pict>
-      </w:r>
-    </w:p>
-    <w:p>
-      <w:pPr>
-        <w:rPr>
-          <w:b/>
-          <w:bCs/>
-        </w:rPr>
-      </w:pPr>
-      <w:r>
-        <w:rPr>
-          <w:b/>
-          <w:bCs/>
-        </w:rPr>
-        <w:t>8. Technical Design</w:t>
-      </w:r>
-    </w:p>
-    <w:p>
-      <w:pPr>
-        <w:rPr>
-          <w:b/>
-          <w:bCs/>
-        </w:rPr>
-      </w:pPr>
-      <w:r>
-        <w:rPr>
-          <w:b/>
-          <w:bCs/>
-        </w:rPr>
-        <w:t>8.1 Architecture</w:t>
-      </w:r>
-    </w:p>
-    <w:p>
-      <w:pPr>
-        <w:numPr>
-          <w:ilvl w:val="0"/>
-          <w:numId w:val="26"/>
-        </w:numPr>
-      </w:pPr>
-      <w:r>
-        <w:t>SPA (Single HTML entry)</w:t>
-      </w:r>
-    </w:p>
-    <w:p>
-      <w:pPr>
-        <w:numPr>
-          <w:ilvl w:val="0"/>
-          <w:numId w:val="26"/>
-        </w:numPr>
-      </w:pPr>
-      <w:r>
-        <w:t>Modular JS (no framework required)</w:t>
-      </w:r>
-    </w:p>
-    <w:p>
-      <w:r>
-        <w:pict w14:anchorId="0766B5AA">
-          <v:rect id="_x0000_i1314" style="width:0;height:1.5pt" o:hralign="center" o:hrstd="t" o:hr="t" fillcolor="#a0a0a0" stroked="f"/>
-        </w:pict>
-      </w:r>
-    </w:p>
-    <w:p>
-      <w:pPr>
-        <w:rPr>
-          <w:b/>
-          <w:bCs/>
-        </w:rPr>
-      </w:pPr>
-      <w:r>
-        <w:rPr>
-          <w:b/>
-          <w:bCs/>
-        </w:rPr>
-        <w:t>8.3 State Model (Example)</w:t>
-      </w:r>
-    </w:p>
-    <w:p>
-      <w:r>
-        <w:lastRenderedPageBreak/>
-        <w:t>{</w:t>
-      </w:r>
-    </w:p>
-    <w:p>
-      <w:r>
-        <w:t xml:space="preserve">  players: [],</w:t>
-      </w:r>
-    </w:p>
-    <w:p>
-      <w:r>
-        <w:t xml:space="preserve">  </w:t>
-      </w:r>
-      <w:proofErr w:type="spellStart"/>
-      <w:r>
-        <w:t>currentPlayerIndex</w:t>
-      </w:r>
-      <w:proofErr w:type="spellEnd"/>
-      <w:r>
-        <w:t>: 0,</w:t>
-      </w:r>
-    </w:p>
-    <w:p>
-      <w:r>
-        <w:t xml:space="preserve">  </w:t>
-      </w:r>
-      <w:proofErr w:type="spellStart"/>
-      <w:r>
-        <w:t>turnOrder</w:t>
-      </w:r>
-      <w:proofErr w:type="spellEnd"/>
-      <w:r>
-        <w:t>: [],</w:t>
-      </w:r>
-    </w:p>
-    <w:p>
-      <w:r>
-        <w:t xml:space="preserve">  scores: {},</w:t>
-      </w:r>
-    </w:p>
-    <w:p>
-      <w:r>
-        <w:t xml:space="preserve">  </w:t>
-      </w:r>
-      <w:proofErr w:type="spellStart"/>
-      <w:r>
-        <w:t>selectedCards</w:t>
-      </w:r>
-      <w:proofErr w:type="spellEnd"/>
-      <w:r>
-        <w:t>: [],</w:t>
-      </w:r>
-    </w:p>
-    <w:p>
-      <w:r>
-        <w:t xml:space="preserve">  </w:t>
-      </w:r>
-      <w:proofErr w:type="spellStart"/>
-      <w:r>
-        <w:t>completedSets</w:t>
-      </w:r>
-      <w:proofErr w:type="spellEnd"/>
-      <w:r>
-        <w:t>: {},</w:t>
-      </w:r>
-    </w:p>
-    <w:p>
-      <w:r>
-        <w:t xml:space="preserve">  round: 1,</w:t>
-      </w:r>
-    </w:p>
-    <w:p>
-      <w:r>
-        <w:t xml:space="preserve">  deck: []</w:t>
-      </w:r>
-    </w:p>
-    <w:p>
-      <w:r>
-        <w:t>}</w:t>
-      </w:r>
-    </w:p>
-    <w:p>
-      <w:r>
-        <w:pict w14:anchorId="0A53F9ED">
-          <v:rect id="_x0000_i1315" style="width:0;height:1.5pt" o:hralign="center" o:hrstd="t" o:hr="t" fillcolor="#a0a0a0" stroked="f"/>
-        </w:pict>
-      </w:r>
-    </w:p>
-    <w:p>
-      <w:pPr>
-        <w:rPr>
-          <w:b/>
-          <w:bCs/>
-        </w:rPr>
-      </w:pPr>
-      <w:r>
-        <w:rPr>
-          <w:b/>
-          <w:bCs/>
-        </w:rPr>
-        <w:t>8.4 Core Functions</w:t>
-      </w:r>
-    </w:p>
-    <w:p>
-      <w:pPr>
-        <w:numPr>
-          <w:ilvl w:val="0"/>
-          <w:numId w:val="27"/>
-        </w:numPr>
-      </w:pPr>
-      <w:proofErr w:type="spellStart"/>
-      <w:proofErr w:type="gramStart"/>
-      <w:r>
-        <w:t>initGame</w:t>
-      </w:r>
-      <w:proofErr w:type="spellEnd"/>
-      <w:r>
-        <w:t>(</w:t>
-      </w:r>
-      <w:proofErr w:type="gramEnd"/>
-      <w:r>
-        <w:t>)</w:t>
-      </w:r>
-    </w:p>
-    <w:p>
-      <w:pPr>
-        <w:numPr>
-          <w:ilvl w:val="0"/>
-          <w:numId w:val="27"/>
-        </w:numPr>
-      </w:pPr>
-      <w:proofErr w:type="spellStart"/>
-      <w:proofErr w:type="gramStart"/>
-      <w:r>
-        <w:t>shuffleDeck</w:t>
-      </w:r>
-      <w:proofErr w:type="spellEnd"/>
-      <w:r>
-        <w:t>(</w:t>
-      </w:r>
-      <w:proofErr w:type="gramEnd"/>
-      <w:r>
-        <w:t>)</w:t>
-      </w:r>
-    </w:p>
-    <w:p>
-      <w:pPr>
-        <w:numPr>
-          <w:ilvl w:val="0"/>
-          <w:numId w:val="27"/>
-        </w:numPr>
-      </w:pPr>
-      <w:proofErr w:type="spellStart"/>
-      <w:proofErr w:type="gramStart"/>
-      <w:r>
-        <w:t>drawCard</w:t>
-      </w:r>
-      <w:proofErr w:type="spellEnd"/>
-      <w:r>
-        <w:t>(</w:t>
-      </w:r>
-      <w:proofErr w:type="gramEnd"/>
-      <w:r>
-        <w:t>)</w:t>
-      </w:r>
-    </w:p>
-    <w:p>
-      <w:pPr>
-        <w:numPr>
-          <w:ilvl w:val="0"/>
-          <w:numId w:val="27"/>
-        </w:numPr>
-      </w:pPr>
-      <w:proofErr w:type="spellStart"/>
-      <w:proofErr w:type="gramStart"/>
-      <w:r>
-        <w:t>validateSet</w:t>
-      </w:r>
-      <w:proofErr w:type="spellEnd"/>
-      <w:r>
-        <w:t>(</w:t>
-      </w:r>
-      <w:proofErr w:type="gramEnd"/>
-      <w:r>
-        <w:t>)</w:t>
-      </w:r>
-    </w:p>
-    <w:p>
-      <w:pPr>
-        <w:numPr>
-          <w:ilvl w:val="0"/>
-          <w:numId w:val="27"/>
-        </w:numPr>
-      </w:pPr>
-      <w:proofErr w:type="spellStart"/>
-      <w:proofErr w:type="gramStart"/>
-      <w:r>
-        <w:t>endTurn</w:t>
-      </w:r>
-      <w:proofErr w:type="spellEnd"/>
-      <w:r>
-        <w:t>(</w:t>
-      </w:r>
-      <w:proofErr w:type="gramEnd"/>
-      <w:r>
-        <w:t>)</w:t>
-      </w:r>
-    </w:p>
-    <w:p>
-      <w:pPr>
-        <w:numPr>
-          <w:ilvl w:val="0"/>
-          <w:numId w:val="27"/>
-        </w:numPr>
-      </w:pPr>
-      <w:proofErr w:type="spellStart"/>
-      <w:proofErr w:type="gramStart"/>
-      <w:r>
-        <w:t>nextPlayer</w:t>
-      </w:r>
-      <w:proofErr w:type="spellEnd"/>
-      <w:r>
-        <w:t>(</w:t>
-      </w:r>
-      <w:proofErr w:type="gramEnd"/>
-      <w:r>
-        <w:t>)</w:t>
-      </w:r>
-    </w:p>
-    <w:p>
-      <w:pPr>
-        <w:numPr>
-          <w:ilvl w:val="0"/>
-          <w:numId w:val="27"/>
-        </w:numPr>
-      </w:pPr>
-      <w:proofErr w:type="spellStart"/>
-      <w:proofErr w:type="gramStart"/>
-      <w:r>
-        <w:t>calculateWinner</w:t>
-      </w:r>
-      <w:proofErr w:type="spellEnd"/>
-      <w:r>
-        <w:t>(</w:t>
-      </w:r>
-      <w:proofErr w:type="gramEnd"/>
-      <w:r>
-        <w:t>)</w:t>
-      </w:r>
-    </w:p>
-    <w:p>
-      <w:r>
-        <w:pict w14:anchorId="52A7B14B">
-          <v:rect id="_x0000_i1316" style="width:0;height:1.5pt" o:hralign="center" o:hrstd="t" o:hr="t" fillcolor="#a0a0a0" stroked="f"/>
-        </w:pict>
-      </w:r>
-    </w:p>
-    <w:p>
-      <w:pPr>
-        <w:rPr>
-          <w:b/>
-          <w:bCs/>
-        </w:rPr>
-      </w:pPr>
-      <w:r>
-        <w:rPr>
-          <w:b/>
-          <w:bCs/>
-        </w:rPr>
-        <w:t>9. Future Enhancements (Post-MVP)</w:t>
-      </w:r>
-    </w:p>
-    <w:p>
-      <w:pPr>
-        <w:numPr>
-          <w:ilvl w:val="0"/>
-          <w:numId w:val="28"/>
-        </w:numPr>
-      </w:pPr>
-      <w:r>
-        <w:t>TMDB integration (posters, metadata)</w:t>
-      </w:r>
-    </w:p>
-    <w:p>
-      <w:pPr>
-        <w:numPr>
-          <w:ilvl w:val="0"/>
-          <w:numId w:val="28"/>
-        </w:numPr>
-      </w:pPr>
-      <w:r>
-        <w:t>Sound + haptics</w:t>
-      </w:r>
-    </w:p>
-    <w:p>
-      <w:pPr>
-        <w:numPr>
-          <w:ilvl w:val="0"/>
-          <w:numId w:val="28"/>
-        </w:numPr>
-      </w:pPr>
-      <w:r>
-        <w:t>Shareable results</w:t>
-      </w:r>
-    </w:p>
-    <w:p>
-      <w:pPr>
-        <w:numPr>
-          <w:ilvl w:val="0"/>
-          <w:numId w:val="28"/>
-        </w:numPr>
-      </w:pPr>
-      <w:r>
-        <w:t>Daily challenge (seed-based)</w:t>
-      </w:r>
-    </w:p>
-    <w:p>
-      <w:pPr>
-        <w:numPr>
-          <w:ilvl w:val="0"/>
-          <w:numId w:val="28"/>
-        </w:numPr>
-      </w:pPr>
-      <w:r>
-        <w:t>Secret roles (Guess game)</w:t>
-      </w:r>
-    </w:p>
-    <w:p>
-      <w:pPr>
-        <w:numPr>
-          <w:ilvl w:val="0"/>
-          <w:numId w:val="28"/>
-        </w:numPr>
-      </w:pPr>
-      <w:r>
-        <w:lastRenderedPageBreak/>
-        <w:t>PWA install support</w:t>
-      </w:r>
-    </w:p>
-    <w:p>
-      <w:r>
-        <w:pict w14:anchorId="06496CEE">
-          <v:rect id="_x0000_i1317" style="width:0;height:1.5pt" o:hralign="center" o:hrstd="t" o:hr="t" fillcolor="#a0a0a0" stroked="f"/>
-        </w:pict>
-      </w:r>
-    </w:p>
-    <w:p>
-      <w:pPr>
-        <w:rPr>
-          <w:b/>
-          <w:bCs/>
-        </w:rPr>
-      </w:pPr>
-      <w:r>
-        <w:rPr>
-          <w:b/>
-          <w:bCs/>
-        </w:rPr>
-        <w:t>10. Risks &amp; Mitigations</w:t>
-      </w:r>
-    </w:p>
-    <w:tbl>
-      <w:tblPr>
-        <w:tblW w:w="0" w:type="auto"/>
-        <w:tblCellSpacing w:w="15" w:type="dxa"/>
-        <w:tblCellMar>
-          <w:top w:w="15" w:type="dxa"/>
-          <w:left w:w="15" w:type="dxa"/>
-          <w:bottom w:w="15" w:type="dxa"/>
-          <w:right w:w="15" w:type="dxa"/>
-        </w:tblCellMar>
-        <w:tblLook w:val="04A0" w:firstRow="1" w:lastRow="0" w:firstColumn="1" w:lastColumn="0" w:noHBand="0" w:noVBand="1"/>
-      </w:tblPr>
-      <w:tblGrid>
-        <w:gridCol w:w="2747"/>
-        <w:gridCol w:w="2916"/>
-      </w:tblGrid>
-      <w:tr>
-        <w:trPr>
-          <w:tblHeader/>
-          <w:tblCellSpacing w:w="15" w:type="dxa"/>
-        </w:trPr>
-        <w:tc>
-          <w:tcPr>
-            <w:tcW w:w="0" w:type="auto"/>
-            <w:vAlign w:val="center"/>
-            <w:hideMark/>
-          </w:tcPr>
-          <w:p>
-            <w:pPr>
-              <w:rPr>
-                <w:b/>
-                <w:bCs/>
-              </w:rPr>
-            </w:pPr>
-            <w:r>
-              <w:rPr>
-                <w:b/>
-                <w:bCs/>
-              </w:rPr>
-              <w:t>Risk</w:t>
-            </w:r>
-          </w:p>
-        </w:tc>
-        <w:tc>
-          <w:tcPr>
-            <w:tcW w:w="0" w:type="auto"/>
-            <w:vAlign w:val="center"/>
-            <w:hideMark/>
-          </w:tcPr>
-          <w:p>
-            <w:pPr>
-              <w:rPr>
-                <w:b/>
-                <w:bCs/>
-              </w:rPr>
-            </w:pPr>
-            <w:r>
-              <w:rPr>
-                <w:b/>
-                <w:bCs/>
-              </w:rPr>
-              <w:t>Mitigation</w:t>
-            </w:r>
-          </w:p>
-        </w:tc>
-      </w:tr>
-      <w:tr>
-        <w:trPr>
-          <w:tblCellSpacing w:w="15" w:type="dxa"/>
-        </w:trPr>
-        <w:tc>
-          <w:tcPr>
-            <w:tcW w:w="0" w:type="auto"/>
-            <w:vAlign w:val="center"/>
-            <w:hideMark/>
-          </w:tcPr>
-          <w:p>
-            <w:r>
-              <w:t>UI confusion in group play</w:t>
-            </w:r>
-          </w:p>
-        </w:tc>
-        <w:tc>
-          <w:tcPr>
-            <w:tcW w:w="0" w:type="auto"/>
-            <w:vAlign w:val="center"/>
-            <w:hideMark/>
-          </w:tcPr>
-          <w:p>
-            <w:r>
-              <w:t>Enforce one-action screens</w:t>
-            </w:r>
-          </w:p>
-        </w:tc>
-      </w:tr>
-      <w:tr>
-        <w:trPr>
-          <w:tblCellSpacing w:w="15" w:type="dxa"/>
-        </w:trPr>
-        <w:tc>
-          <w:tcPr>
-            <w:tcW w:w="0" w:type="auto"/>
-            <w:vAlign w:val="center"/>
-            <w:hideMark/>
-          </w:tcPr>
-          <w:p>
-            <w:r>
-              <w:t>Privacy leaks</w:t>
-            </w:r>
-          </w:p>
-        </w:tc>
-        <w:tc>
-          <w:tcPr>
-            <w:tcW w:w="0" w:type="auto"/>
-            <w:vAlign w:val="center"/>
-            <w:hideMark/>
-          </w:tcPr>
-          <w:p>
-            <w:r>
-              <w:t>Mandatory handoff screen</w:t>
-            </w:r>
-          </w:p>
-        </w:tc>
-      </w:tr>
-      <w:tr>
-        <w:trPr>
-          <w:tblCellSpacing w:w="15" w:type="dxa"/>
-        </w:trPr>
-        <w:tc>
-          <w:tcPr>
-            <w:tcW w:w="0" w:type="auto"/>
-            <w:vAlign w:val="center"/>
-            <w:hideMark/>
-          </w:tcPr>
-          <w:p>
-            <w:r>
-              <w:t>Over-engineering</w:t>
-            </w:r>
-          </w:p>
-        </w:tc>
-        <w:tc>
-          <w:tcPr>
-            <w:tcW w:w="0" w:type="auto"/>
-            <w:vAlign w:val="center"/>
-            <w:hideMark/>
-          </w:tcPr>
-          <w:p>
-            <w:r>
-              <w:t>Keep logic minimal</w:t>
-            </w:r>
-          </w:p>
-        </w:tc>
-      </w:tr>
-      <w:tr>
-        <w:trPr>
-          <w:tblCellSpacing w:w="15" w:type="dxa"/>
-        </w:trPr>
-        <w:tc>
-          <w:tcPr>
-            <w:tcW w:w="0" w:type="auto"/>
-            <w:vAlign w:val="center"/>
-            <w:hideMark/>
-          </w:tcPr>
-          <w:p>
-            <w:r>
-              <w:t>API failure (TMDB)</w:t>
-            </w:r>
-          </w:p>
-        </w:tc>
-        <w:tc>
-          <w:tcPr>
-            <w:tcW w:w="0" w:type="auto"/>
-            <w:vAlign w:val="center"/>
-            <w:hideMark/>
-          </w:tcPr>
-          <w:p>
-            <w:r>
-              <w:t>Make fully optional</w:t>
-            </w:r>
-          </w:p>
-        </w:tc>
-      </w:tr>
-    </w:tbl>
-    <w:p>
-      <w:r>
-        <w:pict w14:anchorId="49E4A267">
-          <v:rect id="_x0000_i1318" style="width:0;height:1.5pt" o:hralign="center" o:hrstd="t" o:hr="t" fillcolor="#a0a0a0" stroked="f"/>
-        </w:pict>
-      </w:r>
-    </w:p>
-    <w:p>
-      <w:pPr>
-        <w:rPr>
-          <w:b/>
-          <w:bCs/>
-        </w:rPr>
-      </w:pPr>
-      <w:r>
-        <w:rPr>
-          <w:b/>
-          <w:bCs/>
-        </w:rPr>
-        <w:t>11. Definition of Done</w:t>
-      </w:r>
-    </w:p>
-    <w:p>
-      <w:pPr>
-        <w:numPr>
-          <w:ilvl w:val="0"/>
-          <w:numId w:val="29"/>
-        </w:numPr>
-      </w:pPr>
-      <w:r>
-        <w:t>All acceptance criteria met</w:t>
-      </w:r>
-    </w:p>
-    <w:p>
-      <w:pPr>
-        <w:numPr>
-          <w:ilvl w:val="0"/>
-          <w:numId w:val="29"/>
-        </w:numPr>
-      </w:pPr>
-      <w:r>
-        <w:t xml:space="preserve">Tested with </w:t>
-      </w:r>
-      <w:r>
-        <w:rPr>
-          <w:b/>
-          <w:bCs/>
-        </w:rPr>
-        <w:t>real 3–5 player group scenario</w:t>
-      </w:r>
-    </w:p>
-    <w:p>
-      <w:pPr>
-        <w:numPr>
-          <w:ilvl w:val="0"/>
-          <w:numId w:val="29"/>
-        </w:numPr>
-      </w:pPr>
-      <w:r>
-        <w:t>No critical UX confusion during gameplay</w:t>
-      </w:r>
-    </w:p>
-    <w:p>
-      <w:pPr>
-        <w:numPr>
-          <w:ilvl w:val="0"/>
-          <w:numId w:val="29"/>
-        </w:numPr>
-      </w:pPr>
-      <w:r>
-        <w:t>Deployed and playable via GitHub Pages</w:t>
-      </w:r>
-    </w:p>
-    <w:p/>
+        <w:t>10. Definition of Done</w:t>
+      </w:r>
+    </w:p>
+    <w:p>
+      <w:pPr>
+        <w:ind w:left="360"/>
+      </w:pPr>
+      <w:r>
+        <w:t>• All E2E acceptance criteria covered by Playwright tests (28 passing)</w:t>
+      </w:r>
+    </w:p>
+    <w:p>
+      <w:pPr>
+        <w:ind w:left="360"/>
+      </w:pPr>
+      <w:r>
+        <w:t>• Tested with a real 3–5 player group scenario</w:t>
+      </w:r>
+    </w:p>
+    <w:p>
+      <w:pPr>
+        <w:ind w:left="360"/>
+      </w:pPr>
+      <w:r>
+        <w:t>• No critical UX confusion during gameplay</w:t>
+      </w:r>
+    </w:p>
+    <w:p>
+      <w:pPr>
+        <w:ind w:left="360"/>
+      </w:pPr>
+      <w:r>
+        <w:t>• Deployed and playable via GitHub Pages</w:t>
+      </w:r>
+    </w:p>
+    <w:p>
+      <w:pPr>
+        <w:ind w:left="360"/>
+      </w:pPr>
+      <w:r>
+        <w:t>• Service Worker confirmed caching all assets in DevTools → Application → Cache Storage</w:t>
+      </w:r>
+    </w:p>
+    <w:p>
+      <w:pPr>
+        <w:ind w:left="360"/>
+      </w:pPr>
+      <w:r>
+        <w:t>• ESLint: 0 errors; npm audit: 0 CVEs</w:t>
+      </w:r>
+    </w:p>
     <w:sectPr>
       <w:pgSz w:w="12240" w:h="15840"/>
       <w:pgMar w:top="1440" w:right="1440" w:bottom="1440" w:left="1440" w:header="720" w:footer="720" w:gutter="0"/>

</xml_diff>